<commit_message>
Checked MS word version control
</commit_message>
<xml_diff>
--- a/Thesis Report Rafi.docx
+++ b/Thesis Report Rafi.docx
@@ -260,11 +260,47 @@
       </w:r>
     </w:p>
     <w:p>
-      <w:pPr>
-        <w:widowControl/>
-        <w:spacing w:line="240" w:lineRule="auto"/>
-        <w:jc w:val="left"/>
-      </w:pPr>
+      <w:r>
+        <w:t>I want to ddedicate this thesis for abladlkafjldkjfal flkad ladshflasdhf lasdkhfasd hflksadhflak hflkadhflkas dhflkasdh flkadshflkasdhflhadlsf hsadlf hadslfh lsadkh flskadhf lkasdhf ldkshf lksdahf lkdashf ds</w:t>
+      </w:r>
+      <w:r>
+        <w:t>s fsd fsdf sdf sdf sdfs df sdfaf asf asf asdf asdf as</w:t>
+      </w:r>
+    </w:p>
+    <w:p>
+      <w:r>
+        <w:t xml:space="preserve">Sd fasd fsadf </w:t>
+      </w:r>
+    </w:p>
+    <w:p>
+      <w:r>
+        <w:t xml:space="preserve"> Fasdf asdf asf asd</w:t>
+      </w:r>
+    </w:p>
+    <w:p>
+      <w:r>
+        <w:t>Ds afda fsad f</w:t>
+      </w:r>
+    </w:p>
+    <w:p>
+      <w:r>
+        <w:t xml:space="preserve">D fas fasdf asdf </w:t>
+      </w:r>
+    </w:p>
+    <w:p>
+      <w:r>
+        <w:t xml:space="preserve">Dsf asdf adsf asdf </w:t>
+      </w:r>
+    </w:p>
+    <w:p>
+      <w:r>
+        <w:t xml:space="preserve"> Df asdf asf</w:t>
+      </w:r>
+    </w:p>
+    <w:p>
+      <w:r>
+        <w:t>A dfasdf as</w:t>
+      </w:r>
       <w:r>
         <w:br w:type="page"/>
       </w:r>
@@ -12841,6 +12877,7 @@
     <w:rsid w:val="008973D5"/>
     <w:rsid w:val="008C5FFD"/>
     <w:rsid w:val="00925352"/>
+    <w:rsid w:val="00972ECE"/>
     <w:rsid w:val="00990BD7"/>
     <w:rsid w:val="00994A7B"/>
     <w:rsid w:val="009C0C40"/>
@@ -12857,6 +12894,7 @@
     <w:rsid w:val="00CD72E4"/>
     <w:rsid w:val="00D74283"/>
     <w:rsid w:val="00DA1BDA"/>
+    <w:rsid w:val="00DE6C01"/>
     <w:rsid w:val="00DF3A7C"/>
     <w:rsid w:val="00DF7D90"/>
     <w:rsid w:val="00E24E9F"/>
@@ -13652,32 +13690,18 @@
 </file>
 
 <file path=customXml/item1.xml><?xml version="1.0" encoding="utf-8"?>
-<b:Sources xmlns:b="http://schemas.openxmlformats.org/officeDocument/2006/bibliography" xmlns="http://schemas.openxmlformats.org/officeDocument/2006/bibliography" SelectedStyle="/IEEE2006OfficeOnline.xsl" StyleName="IEEE" Version="2006">
-  <b:Source>
-    <b:Tag>Placeholder1</b:Tag>
-    <b:SourceType>Book</b:SourceType>
-    <b:Guid>{61C2BEB0-04B1-424E-AEC0-322EDBD1A18A}</b:Guid>
-    <b:RefOrder>2</b:RefOrder>
-  </b:Source>
-  <b:Source>
-    <b:Tag>Placeholder2</b:Tag>
-    <b:SourceType>Book</b:SourceType>
-    <b:Guid>{26E93F14-F601-D04A-A10D-E3BC3760B577}</b:Guid>
-    <b:RefOrder>1</b:RefOrder>
-  </b:Source>
-</b:Sources>
+<p:properties xmlns:p="http://schemas.microsoft.com/office/2006/metadata/properties" xmlns:xsi="http://www.w3.org/2001/XMLSchema-instance" xmlns:pc="http://schemas.microsoft.com/office/infopath/2007/PartnerControls">
+  <documentManagement>
+    <TaxCatchAll xmlns="4de74af2-d2a7-4bc3-a319-420167317553" xsi:nil="true"/>
+    <ArchiverLinkFileType xmlns="c0991f74-233a-4c46-9c55-a176f0e8ba44" xsi:nil="true"/>
+    <lcf76f155ced4ddcb4097134ff3c332f xmlns="c0991f74-233a-4c46-9c55-a176f0e8ba44">
+      <Terms xmlns="http://schemas.microsoft.com/office/infopath/2007/PartnerControls"/>
+    </lcf76f155ced4ddcb4097134ff3c332f>
+  </documentManagement>
+</p:properties>
 </file>
 
 <file path=customXml/item2.xml><?xml version="1.0" encoding="utf-8"?>
-<?mso-contentType ?>
-<FormTemplates xmlns="http://schemas.microsoft.com/sharepoint/v3/contenttype/forms">
-  <Display>DocumentLibraryForm</Display>
-  <Edit>DocumentLibraryForm</Edit>
-  <New>DocumentLibraryForm</New>
-</FormTemplates>
-</file>
-
-<file path=customXml/item3.xml><?xml version="1.0" encoding="utf-8"?>
 <ct:contentTypeSchema xmlns:ct="http://schemas.microsoft.com/office/2006/metadata/contentType" xmlns:ma="http://schemas.microsoft.com/office/2006/metadata/properties/metaAttributes" ct:_="" ma:_="" ma:contentTypeName="Dokument" ma:contentTypeID="0x0101003A15E957932D6F4AB4FD28F85AF4FFD8" ma:contentTypeVersion="14" ma:contentTypeDescription="Ein neues Dokument erstellen." ma:contentTypeScope="" ma:versionID="e040dc8dbf4a4132031beaaf90e02bdd">
   <xsd:schema xmlns:xsd="http://www.w3.org/2001/XMLSchema" xmlns:xs="http://www.w3.org/2001/XMLSchema" xmlns:p="http://schemas.microsoft.com/office/2006/metadata/properties" xmlns:ns2="c0991f74-233a-4c46-9c55-a176f0e8ba44" xmlns:ns3="4de74af2-d2a7-4bc3-a319-420167317553" targetNamespace="http://schemas.microsoft.com/office/2006/metadata/properties" ma:root="true" ma:fieldsID="63fe477e893c7cf9e00d7d25e31408c1" ns2:_="" ns3:_="">
     <xsd:import namespace="c0991f74-233a-4c46-9c55-a176f0e8ba44"/>
@@ -13906,35 +13930,44 @@
 </ct:contentTypeSchema>
 </file>
 
+<file path=customXml/item3.xml><?xml version="1.0" encoding="utf-8"?>
+<?mso-contentType ?>
+<FormTemplates xmlns="http://schemas.microsoft.com/sharepoint/v3/contenttype/forms">
+  <Display>DocumentLibraryForm</Display>
+  <Edit>DocumentLibraryForm</Edit>
+  <New>DocumentLibraryForm</New>
+</FormTemplates>
+</file>
+
 <file path=customXml/item4.xml><?xml version="1.0" encoding="utf-8"?>
-<p:properties xmlns:p="http://schemas.microsoft.com/office/2006/metadata/properties" xmlns:xsi="http://www.w3.org/2001/XMLSchema-instance" xmlns:pc="http://schemas.microsoft.com/office/infopath/2007/PartnerControls">
-  <documentManagement>
-    <TaxCatchAll xmlns="4de74af2-d2a7-4bc3-a319-420167317553" xsi:nil="true"/>
-    <ArchiverLinkFileType xmlns="c0991f74-233a-4c46-9c55-a176f0e8ba44" xsi:nil="true"/>
-    <lcf76f155ced4ddcb4097134ff3c332f xmlns="c0991f74-233a-4c46-9c55-a176f0e8ba44">
-      <Terms xmlns="http://schemas.microsoft.com/office/infopath/2007/PartnerControls"/>
-    </lcf76f155ced4ddcb4097134ff3c332f>
-  </documentManagement>
-</p:properties>
+<b:Sources xmlns:b="http://schemas.openxmlformats.org/officeDocument/2006/bibliography" xmlns="http://schemas.openxmlformats.org/officeDocument/2006/bibliography" SelectedStyle="/IEEE2006OfficeOnline.xsl" StyleName="IEEE" Version="2006">
+  <b:Source>
+    <b:Tag>Placeholder1</b:Tag>
+    <b:SourceType>Book</b:SourceType>
+    <b:Guid>{61C2BEB0-04B1-424E-AEC0-322EDBD1A18A}</b:Guid>
+    <b:RefOrder>2</b:RefOrder>
+  </b:Source>
+  <b:Source>
+    <b:Tag>Placeholder2</b:Tag>
+    <b:SourceType>Book</b:SourceType>
+    <b:Guid>{26E93F14-F601-D04A-A10D-E3BC3760B577}</b:Guid>
+    <b:RefOrder>1</b:RefOrder>
+  </b:Source>
+</b:Sources>
 </file>
 
 <file path=customXml/itemProps1.xml><?xml version="1.0" encoding="utf-8"?>
-<ds:datastoreItem xmlns:ds="http://schemas.openxmlformats.org/officeDocument/2006/customXml" ds:itemID="{8ED87741-333E-524C-B42D-A34782CE569A}">
+<ds:datastoreItem xmlns:ds="http://schemas.openxmlformats.org/officeDocument/2006/customXml" ds:itemID="{5DB99EA3-5A91-4DE8-9C2E-5E2756FB8116}">
   <ds:schemaRefs>
-    <ds:schemaRef ds:uri="http://schemas.openxmlformats.org/officeDocument/2006/bibliography"/>
+    <ds:schemaRef ds:uri="http://schemas.microsoft.com/office/2006/metadata/properties"/>
+    <ds:schemaRef ds:uri="http://schemas.microsoft.com/office/infopath/2007/PartnerControls"/>
+    <ds:schemaRef ds:uri="4de74af2-d2a7-4bc3-a319-420167317553"/>
+    <ds:schemaRef ds:uri="c0991f74-233a-4c46-9c55-a176f0e8ba44"/>
   </ds:schemaRefs>
 </ds:datastoreItem>
 </file>
 
 <file path=customXml/itemProps2.xml><?xml version="1.0" encoding="utf-8"?>
-<ds:datastoreItem xmlns:ds="http://schemas.openxmlformats.org/officeDocument/2006/customXml" ds:itemID="{123745DA-69E4-464B-8AAF-512AB146EAEF}">
-  <ds:schemaRefs>
-    <ds:schemaRef ds:uri="http://schemas.microsoft.com/sharepoint/v3/contenttype/forms"/>
-  </ds:schemaRefs>
-</ds:datastoreItem>
-</file>
-
-<file path=customXml/itemProps3.xml><?xml version="1.0" encoding="utf-8"?>
 <ds:datastoreItem xmlns:ds="http://schemas.openxmlformats.org/officeDocument/2006/customXml" ds:itemID="{DB59158D-15C5-4DFF-AEB5-CA02C610712D}">
   <ds:schemaRefs>
     <ds:schemaRef ds:uri="http://schemas.microsoft.com/office/2006/metadata/contentType"/>
@@ -13953,13 +13986,18 @@
 </ds:datastoreItem>
 </file>
 
+<file path=customXml/itemProps3.xml><?xml version="1.0" encoding="utf-8"?>
+<ds:datastoreItem xmlns:ds="http://schemas.openxmlformats.org/officeDocument/2006/customXml" ds:itemID="{123745DA-69E4-464B-8AAF-512AB146EAEF}">
+  <ds:schemaRefs>
+    <ds:schemaRef ds:uri="http://schemas.microsoft.com/sharepoint/v3/contenttype/forms"/>
+  </ds:schemaRefs>
+</ds:datastoreItem>
+</file>
+
 <file path=customXml/itemProps4.xml><?xml version="1.0" encoding="utf-8"?>
-<ds:datastoreItem xmlns:ds="http://schemas.openxmlformats.org/officeDocument/2006/customXml" ds:itemID="{5DB99EA3-5A91-4DE8-9C2E-5E2756FB8116}">
+<ds:datastoreItem xmlns:ds="http://schemas.openxmlformats.org/officeDocument/2006/customXml" ds:itemID="{8ED87741-333E-524C-B42D-A34782CE569A}">
   <ds:schemaRefs>
-    <ds:schemaRef ds:uri="http://schemas.microsoft.com/office/2006/metadata/properties"/>
-    <ds:schemaRef ds:uri="http://schemas.microsoft.com/office/infopath/2007/PartnerControls"/>
-    <ds:schemaRef ds:uri="4de74af2-d2a7-4bc3-a319-420167317553"/>
-    <ds:schemaRef ds:uri="c0991f74-233a-4c46-9c55-a176f0e8ba44"/>
+    <ds:schemaRef ds:uri="http://schemas.openxmlformats.org/officeDocument/2006/bibliography"/>
   </ds:schemaRefs>
 </ds:datastoreItem>
 </file>
</xml_diff>

<commit_message>
updated introduction background section
</commit_message>
<xml_diff>
--- a/Thesis Report Rafi.docx
+++ b/Thesis Report Rafi.docx
@@ -300,6 +300,61 @@
     <w:p>
       <w:r>
         <w:t>A dfasdf as</w:t>
+      </w:r>
+    </w:p>
+    <w:p>
+      <w:r>
+        <w:t>Sfsdfsdfadfasdfasdfadsfasdfasf</w:t>
+      </w:r>
+    </w:p>
+    <w:p>
+      <w:r>
+        <w:t>Dsfadsdfasd</w:t>
+      </w:r>
+    </w:p>
+    <w:p>
+      <w:r>
+        <w:t>Sdafdasf</w:t>
+      </w:r>
+    </w:p>
+    <w:p>
+      <w:r>
+        <w:t>Sdafasdf</w:t>
+      </w:r>
+    </w:p>
+    <w:p>
+      <w:r>
+        <w:t>Fsgsfgdsgsdfg</w:t>
+      </w:r>
+    </w:p>
+    <w:p>
+      <w:r>
+        <w:t>Dsfgfsgfsd</w:t>
+      </w:r>
+    </w:p>
+    <w:p>
+      <w:r>
+        <w:t>Gsdfgsdfgfsdgf</w:t>
+      </w:r>
+    </w:p>
+    <w:p>
+      <w:r>
+        <w:t>Sdfgsfdgsdfg</w:t>
+      </w:r>
+    </w:p>
+    <w:p>
+      <w:r>
+        <w:t>Sdfgsdfgsdf</w:t>
+      </w:r>
+    </w:p>
+    <w:p>
+      <w:r>
+        <w:t>Gsdfgsdfgsdf</w:t>
+      </w:r>
+    </w:p>
+    <w:p>
+      <w:r>
+        <w:t>gsdfgsdfgsdfgdsgdsfg</w:t>
       </w:r>
       <w:r>
         <w:br w:type="page"/>
@@ -1646,11 +1701,57 @@
         <w:t xml:space="preserve">standard framework. </w:t>
       </w:r>
     </w:p>
+    <w:p/>
+    <w:p>
+      <w:r>
+        <w:t>The large-scale transition of industrial energy systems is increasingly recognized as a key requirement for achieving decarbonization targets, particularly in so-called hard-to-abate sectors [NEED REFERENCE: definition and importance of hard-to-abate industries]. One promising pathway to address this challenge is the implementation of Power-to-X (PtX) technologies, which enable the conversion of renewable electricity into chemical energy carriers and fuels suitable for industrial applications [NEED REFERENCE: overview of PtX technologies and their industrial relevance].</w:t>
+      </w:r>
+    </w:p>
+    <w:p/>
+    <w:p>
+      <w:r>
+        <w:t>However, such systems constitute complex, capital-intensive processes, especially when their operation is coupled with the inherent variability of renewable energy sources [NEED REFERENCE: cost structure and variability challenges of renewable-based industrial systems]. Consequently, there is a strong need for robust optimization strategies that can minimize both capital expenditures (CAPEX) and operational expenditures (OPEX) through efficient system design and dispatch planning.</w:t>
+      </w:r>
+    </w:p>
+    <w:p/>
+    <w:p>
+      <w:r>
+        <w:t>Mixed-Integer Linear Programming (MILP) has become the prevailing industrial standard for addressing these optimization problems due to its robustness and well-established solution methods [NEED REFERENCE: MILP as industrial standard in energy system optimization]. Nevertheless, the increasing adoption of artificial intelligence (AI) across industries has stimulated interest in alternative approaches, particularly reinforcement learning (RL). In this context, RL can be interpreted as an agent-based control framework that learns optimal dispatch strategies through interaction with the system environment, effectively acting as an autonomous plant operator [NEED REFERENCE: applications of RL in energy system dispatch].</w:t>
+      </w:r>
+    </w:p>
+    <w:p/>
+    <w:p>
+      <w:r>
+        <w:t xml:space="preserve">Despite its widespread use, MILP inherently relies on linear approximations of system behavior, which may limit the fidelity of the results when modeling complex, nonlinear processes [NEED </w:t>
+      </w:r>
+      <w:r>
+        <w:lastRenderedPageBreak/>
+        <w:t>REFERENCE: limitations of MILP in nonlinear systems]. A representative example is the operation of hydrogen storage systems, where the relationship between tank level and process efficiency is nonlinear. Specifically, higher storage levels can lead to reduced efficiency due to increased compression energy requirements [NEED REFERENCE: nonlinear behavior of hydrogen storage efficiency]. Such nonlinearities are typically simplified or neglected in MILP formulations. Therefore, this thesis investigates the impact of explicitly incorporating this level of process detail on techno-economic outcomes when using an RL-based optimization framework. It is hypothesized that the ability to model such nonlinearities represents a critical advantage for optimizing complex polygeneration systems, where multiple interdependent components exhibit non-ideal and nonlinear behavior [NEED REFERENCE: importance of nonlinear modeling in polygeneration systems].</w:t>
+      </w:r>
+    </w:p>
+    <w:p/>
+    <w:p>
+      <w:r>
+        <w:t>Furthermore, existing literature primarily compares MILP and RL approaches within relatively simple energy systems, often characterized by fewer than four decision variables [NEED REFERENCE: prior comparative studies with limited system complexity]. In contrast, this study extends the comparison to a more complex system with a significantly larger decision space, thereby assessing the scalability and practical applicability of both methods under more realistic conditions [NEED REFERENCE: justification for higher-dimensional optimization problems].</w:t>
+      </w:r>
+    </w:p>
+    <w:p>
+      <w:r>
+        <w:t>Another limitation identified in prior studies is the tendency to combine system design and operational control within a single optimization framework. In contrast, this work adopts a structured two-level approach, consisting of an outer-loop (design optimization) and an inner-loop (operational dispatch optimization), to obtain integrated sizing and control strategies [NEED REFERENCE: outer-loop/inner-loop optimization frameworks in energy systems].</w:t>
+      </w:r>
+    </w:p>
+    <w:p/>
+    <w:p>
+      <w:r>
+        <w:t>Finally, this thesis aims to compare the techno-economic performance of a reinforcement learning agent with that of a conventional MILP-based approach applied to a hybrid biomass power-to-methanol plant located in South Africa. The analysis is conducted across multiple scenarios and case studies to evaluate system performance under varying conditions [NEED REFERENCE: case study details and system assumptions]. Through this comparison, the study seeks to clarify the current role and potential of RL in optimizing complex Power-to-X systems, while benchmarking its performance against an established industrial optimization framework.</w:t>
+      </w:r>
+    </w:p>
     <w:p>
       <w:pPr>
         <w:pStyle w:val="Heading2"/>
       </w:pPr>
       <w:r>
+        <w:lastRenderedPageBreak/>
         <w:t>Introduction t</w:t>
       </w:r>
       <w:r>
@@ -1847,7 +1948,6 @@
       </w:pPr>
       <w:bookmarkStart w:id="5" w:name="_Toc228796395"/>
       <w:r>
-        <w:lastRenderedPageBreak/>
         <w:t>Thesis Configuration</w:t>
       </w:r>
       <w:bookmarkEnd w:id="5"/>
@@ -1879,7 +1979,11 @@
         </w:numPr>
       </w:pPr>
       <w:r>
-        <w:t>Chapter 3 will discuss the steps taken to compare these two optimization frameworks. The comparison will be conducted in multiple stage and will be exp</w:t>
+        <w:t xml:space="preserve">Chapter 3 will discuss the steps taken to compare these two optimization frameworks. The </w:t>
+      </w:r>
+      <w:r>
+        <w:lastRenderedPageBreak/>
+        <w:t>comparison will be conducted in multiple stage and will be exp</w:t>
       </w:r>
       <w:r>
         <w:t>lained in detail in chapter 3.</w:t>
@@ -12870,6 +12974,7 @@
     <w:rsid w:val="0071244D"/>
     <w:rsid w:val="00737891"/>
     <w:rsid w:val="00770EC1"/>
+    <w:rsid w:val="007A1C6B"/>
     <w:rsid w:val="00806D95"/>
     <w:rsid w:val="00862D9B"/>
     <w:rsid w:val="00867ADA"/>
@@ -12894,7 +12999,6 @@
     <w:rsid w:val="00CD72E4"/>
     <w:rsid w:val="00D74283"/>
     <w:rsid w:val="00DA1BDA"/>
-    <w:rsid w:val="00DE6C01"/>
     <w:rsid w:val="00DF3A7C"/>
     <w:rsid w:val="00DF7D90"/>
     <w:rsid w:val="00E24E9F"/>

</xml_diff>

<commit_message>
Updated literature review, sources are coming from elicit
</commit_message>
<xml_diff>
--- a/Thesis Report Rafi.docx
+++ b/Thesis Report Rafi.docx
@@ -1489,16 +1489,17 @@
     <w:p/>
     <w:p>
       <w:r>
-        <w:t>In summary, this thesis evaluates the techno-economic performance of a reinforcement learning–based approach against a conventional MILP-based framework for a hybrid biomass power-to-methanol plant located in South Africa. The analysis is performed across multiple scenarios and case studies to capture a range of operating conditions and system configurations [NEED REFERENCE: case study description and assumptions]. Through this comparative assessment, the study seeks to clarify the role and current capabilities of RL in optimizing complex Power-to-X systems, while benchmarking its performance against an established industrial standard.</w:t>
+        <w:t>In summary, this thesis evaluates the techno-economic performance of a reinforcement learning–based approach against a conventional MILP-based framework for a hybrid biomass power-to-methanol plant located in South Africa. The analysis is performed across multiple scenarios and case studies to capture a range of operating conditions and system configurations</w:t>
+      </w:r>
+      <w:r>
+        <w:t xml:space="preserve">. </w:t>
+      </w:r>
+      <w:r>
+        <w:t>Through this comparative assessment, the study seeks to clarify the role and current capabilities of RL in optimizing complex Power-to-X systems, while benchmarking its performance against an established industrial standard.</w:t>
       </w:r>
     </w:p>
     <w:p/>
     <w:p>
-      <w:r>
-        <w:t>______________________________________________________________________________</w:t>
-      </w:r>
-    </w:p>
-    <w:p>
       <w:pPr>
         <w:pStyle w:val="Heading2"/>
       </w:pPr>
@@ -1507,6 +1508,136 @@
       </w:r>
       <w:r>
         <w:t>o Company</w:t>
+      </w:r>
+    </w:p>
+    <w:p>
+      <w:bookmarkStart w:id="3" w:name="_Toc228796394"/>
+      <w:r>
+        <w:t>This master’s thesis is conducted in cooperation with FEV Europe GmbH, specifically within its energy+resources department. In this industrial context, the research aligns with ongoing efforts to expand capabilities beyond traditional automotive engineering toward energy-related applications.</w:t>
+      </w:r>
+    </w:p>
+    <w:p/>
+    <w:p>
+      <w:r>
+        <w:t>FEV Europe GmbH is widely recognized as an established expert within the automotive industry, particularly for its benchmarking and consulting services [NEED REFERENCE: evidence of FEV’s expertise and services in the automotive sector]. Building on this foundation, the company is increasingly directing its efforts toward supporting innovation within the energy sector, reflecting broader industry trends and internal strategic priorities [NEED REFERENCE: documentation on FEV’s activities or strategy in energy sector innovation].</w:t>
+      </w:r>
+    </w:p>
+    <w:p/>
+    <w:p>
+      <w:r>
+        <w:t>Within this framework, the present thesis contributes to the identification and evaluation of an efficient optimization tool for innovative energy solutions, with a focus on complex polygeneration plants. The outcomes are intended to support future FEV Europe GmbH projects by enabling improved system design and operational decision-making [NEED REFERENCE: justification for optimization tool relevance and application to polygeneration systems].</w:t>
+      </w:r>
+    </w:p>
+    <w:p>
+      <w:pPr>
+        <w:pStyle w:val="Heading2"/>
+      </w:pPr>
+      <w:r>
+        <w:t>Objective</w:t>
+      </w:r>
+      <w:bookmarkEnd w:id="3"/>
+    </w:p>
+    <w:p>
+      <w:r>
+        <w:t>This thesis aims to systematically evaluate and compare two optimization frameworks across multiple operational scenarios. The analysis focuses on assessing their ability to represent and optimize complex hybrid energy systems, with particular attention to differences in system configuration and performance outcomes.</w:t>
+      </w:r>
+    </w:p>
+    <w:p/>
+    <w:p>
+      <w:r>
+        <w:t>A central objective is to investigate whether a non-linear physical model integrated with a reinforcement learning (RL) agent converges to substantially different component sizing and system layouts compared to a mixed-integer linear programming (MILP) approach. These differences are examined in terms of key techno-economic indicators, including capital expenditure (CAPEX), operational expenditure (OPEX),</w:t>
+      </w:r>
+      <w:r>
+        <w:t xml:space="preserve"> clipped energy, simulation time, amount of methanol produced</w:t>
+      </w:r>
+      <w:r>
+        <w:t xml:space="preserve"> and levelized cost of methanol (LCOM) [NEED REFERENCE: definition and relevance of selected techno-economic metrics].</w:t>
+      </w:r>
+    </w:p>
+    <w:p/>
+    <w:p>
+      <w:r>
+        <w:t xml:space="preserve">Based on the simulation results, the thesis further aims to identify and explain the underlying reasons for any observed discrepancies—or the lack thereof—between the two frameworks. This comparative analysis supports a final assessment of whether one framework demonstrates superior </w:t>
+      </w:r>
+      <w:r>
+        <w:lastRenderedPageBreak/>
+        <w:t>performance or whether its suitability is dependent on specific system configurations and operating conditions.</w:t>
+      </w:r>
+    </w:p>
+    <w:p/>
+    <w:p>
+      <w:r>
+        <w:t>The expected contribution of this work is to enable the selection of an appropriate optimization framework for hybrid methanol synthesis plants, while also providing a structured approach for framework selection in other industrial energy systems. Additionally, the findings aim to improve optimization accuracy and/or reduce computational effort, and to enhance understanding of where and how RL-based approaches can be effectively applied within polygeneration system design [NEED REFERENCE: applicability and benefits of RL in energy system optimization].</w:t>
+      </w:r>
+    </w:p>
+    <w:p>
+      <w:pPr>
+        <w:pStyle w:val="Heading2"/>
+      </w:pPr>
+      <w:bookmarkStart w:id="4" w:name="_Toc228796395"/>
+      <w:r>
+        <w:t>Thesis Configuration</w:t>
+      </w:r>
+      <w:bookmarkEnd w:id="4"/>
+    </w:p>
+    <w:p>
+      <w:r>
+        <w:t>This thesis is structured to provide a systematic and transparent comparison of the selected optimization frameworks. Chapter 2 reviews the state-of-the-art literature on the application of reinforcement learning (RL) in optimizing complex industrial processes and energy systems, including existing comparative studies between optimization approaches [NEED REFERENCE: relevant literature on RL applications and comparative analyses].</w:t>
+      </w:r>
+    </w:p>
+    <w:p/>
+    <w:p>
+      <w:r>
+        <w:t>Chapter 3 details the methodological framework adopted for the comparison. It outlines a multi-stage evaluation procedure, describing each step taken to ensure a consistent and rigorous assessment of the two optimization approaches.</w:t>
+      </w:r>
+    </w:p>
+    <w:p/>
+    <w:p>
+      <w:r>
+        <w:t>Chapter 4 presents and discusses the results of this multi-stage comparison. It analyzes the performance of each framework across different scenarios and case studies, and introduces a generalization scoring approach to assess their robustness and applicability across multiple evaluation dimensions [NEED REFERENCE: justification or methodology for generalization scoring].</w:t>
+      </w:r>
+    </w:p>
+    <w:p/>
+    <w:p>
+      <w:r>
+        <w:t>Finally, Chapter 5 summarizes the main findings of the thesis and reflects on key limitations, assumptions, and methodological considerations that underpin the analysis, providing context for the interpretation and transferability of the results.</w:t>
+      </w:r>
+      <w:r>
+        <w:br w:type="page"/>
+      </w:r>
+    </w:p>
+    <w:p>
+      <w:pPr>
+        <w:pStyle w:val="Heading1"/>
+      </w:pPr>
+      <w:bookmarkStart w:id="5" w:name="_Toc228796396"/>
+      <w:r>
+        <w:lastRenderedPageBreak/>
+        <w:t>Literature Review</w:t>
+      </w:r>
+      <w:bookmarkEnd w:id="5"/>
+    </w:p>
+    <w:p>
+      <w:pPr>
+        <w:pStyle w:val="Heading2"/>
+      </w:pPr>
+      <w:bookmarkStart w:id="6" w:name="_Toc228796397"/>
+      <w:bookmarkEnd w:id="6"/>
+      <w:commentRangeStart w:id="7"/>
+      <w:r>
+        <w:t xml:space="preserve">Power-to-X Integration for </w:t>
+      </w:r>
+      <w:r>
+        <w:t>Methanol Synthesis System</w:t>
+      </w:r>
+      <w:commentRangeEnd w:id="7"/>
+      <w:r>
+        <w:rPr>
+          <w:rStyle w:val="CommentReference"/>
+          <w:sz w:val="24"/>
+          <w:szCs w:val="28"/>
+        </w:rPr>
+        <w:commentReference w:id="7"/>
       </w:r>
     </w:p>
     <w:p>
@@ -1514,23 +1645,11 @@
         <w:pStyle w:val="ListParagraph"/>
         <w:numPr>
           <w:ilvl w:val="0"/>
-          <w:numId w:val="26"/>
+          <w:numId w:val="46"/>
         </w:numPr>
       </w:pPr>
       <w:r>
-        <w:t xml:space="preserve">This </w:t>
-      </w:r>
-      <w:r>
-        <w:t>master’s thesis research</w:t>
-      </w:r>
-      <w:r>
-        <w:t xml:space="preserve"> is </w:t>
-      </w:r>
-      <w:r>
-        <w:t>conducted at FEV Europe GmbH</w:t>
-      </w:r>
-      <w:r>
-        <w:t xml:space="preserve"> in their energy+resources department.</w:t>
+        <w:t>What the the hybrid biomass and power to methanol actually mean</w:t>
       </w:r>
     </w:p>
     <w:p>
@@ -1538,21 +1657,11 @@
         <w:pStyle w:val="ListParagraph"/>
         <w:numPr>
           <w:ilvl w:val="0"/>
-          <w:numId w:val="26"/>
+          <w:numId w:val="46"/>
         </w:numPr>
       </w:pPr>
       <w:r>
-        <w:t xml:space="preserve">FEV Europe GmbH is a leading </w:t>
-      </w:r>
-      <w:r>
-        <w:t xml:space="preserve">expert in automotive industries, known for its </w:t>
-      </w:r>
-      <w:r>
-        <w:lastRenderedPageBreak/>
-        <w:t xml:space="preserve">benchmarking and consulting services, now endeavours to </w:t>
-      </w:r>
-      <w:r>
-        <w:t xml:space="preserve">support the innovation in the energy sector. </w:t>
+        <w:t>The process that entails this system and the most commong technology choice of the biomass and hydrogen routes</w:t>
       </w:r>
     </w:p>
     <w:p>
@@ -1560,33 +1669,23 @@
         <w:pStyle w:val="ListParagraph"/>
         <w:numPr>
           <w:ilvl w:val="0"/>
-          <w:numId w:val="26"/>
+          <w:numId w:val="46"/>
         </w:numPr>
       </w:pPr>
-      <w:bookmarkStart w:id="3" w:name="_Toc228796394"/>
-      <w:r>
-        <w:t>This thesis supports the identification of an efficient optimization tool for innovative energy solution for complex polygeneration plants led for FEV Europe GmbH future projects</w:t>
-      </w:r>
-    </w:p>
-    <w:p>
-      <w:pPr>
-        <w:pStyle w:val="Heading2"/>
-      </w:pPr>
-      <w:r>
-        <w:t>Objective</w:t>
-      </w:r>
-      <w:bookmarkEnd w:id="3"/>
+      <w:r>
+        <w:t>Advantage of this hybridization</w:t>
+      </w:r>
     </w:p>
     <w:p>
       <w:pPr>
         <w:pStyle w:val="ListParagraph"/>
         <w:numPr>
           <w:ilvl w:val="0"/>
-          <w:numId w:val="23"/>
+          <w:numId w:val="46"/>
         </w:numPr>
       </w:pPr>
       <w:r>
-        <w:t xml:space="preserve">To run and analyze the two optimization frameworks on different scenarios </w:t>
+        <w:t>What is important for this hybridization and what are the blocking points</w:t>
       </w:r>
     </w:p>
     <w:p>
@@ -1594,23 +1693,11 @@
         <w:pStyle w:val="ListParagraph"/>
         <w:numPr>
           <w:ilvl w:val="0"/>
-          <w:numId w:val="23"/>
+          <w:numId w:val="46"/>
         </w:numPr>
       </w:pPr>
       <w:r>
-        <w:t xml:space="preserve">To find out whether a non-linear physical model with an RL agent converges into a significantly different component sizing/layout of the aforementioned hybrid system, which results in different </w:t>
-      </w:r>
-      <w:r>
-        <w:t>techno-economical</w:t>
-      </w:r>
-      <w:r>
-        <w:t xml:space="preserve"> performance </w:t>
-      </w:r>
-      <w:r>
-        <w:t xml:space="preserve">such as </w:t>
-      </w:r>
-      <w:r>
-        <w:t xml:space="preserve">CAPEX / OPEX / LCOM, compared to MILP approaches </w:t>
+        <w:t>What is important to address these blocking points</w:t>
       </w:r>
     </w:p>
     <w:p>
@@ -1618,11 +1705,32 @@
         <w:pStyle w:val="ListParagraph"/>
         <w:numPr>
           <w:ilvl w:val="0"/>
-          <w:numId w:val="23"/>
+          <w:numId w:val="46"/>
         </w:numPr>
       </w:pPr>
       <w:r>
-        <w:t xml:space="preserve">Identify the reasoning behind these discrepancies or in contrast, lack thereof, depending on the simulation result </w:t>
+        <w:t>and how optimization can support the technological feasibility and economical viability of the hybrid biomass power to methanol project</w:t>
+      </w:r>
+    </w:p>
+    <w:p/>
+    <w:p>
+      <w:r>
+        <w:t xml:space="preserve">The hybridization strategy to produce methanol in this thesis essentially mean that there are two upstream pathways that become the feedstock of the methanol synthesis. The first pathway is the biomass pathway and the second pathway is the hydrogen pathway through electrolysis. </w:t>
+      </w:r>
+    </w:p>
+    <w:p/>
+    <w:p>
+      <w:r>
+        <w:t xml:space="preserve">For </w:t>
+      </w:r>
+      <w:r>
+        <w:t>the biomass pathway, the process converts available biomass into biogas or syngas which then are transformed into methanol. In the literature, gasification processs is mostly utilized for such a plant to directly convert biomass into syngas, however, there is also another alternative of using anaerobic digester to initially produce biogas and this biogas will then be reformed to produce syngas for the methanol synthesis. The difference process steps are main drive for the tradeoff for each technology. The AD-based route is attractice because ist can sit on top of a waster treatment infrastructure but they need an extra conversion step before methanol, so the process is less direct and more dependent on reforming, CO2 handling, or electrolysis integration. Gasifier-based routes are more established for methanol synthesis because they give syngas directly and it is favored to be coupled with high temperature heat processes but comes with some penalties which are temperature solid handling, oxygen/ASU burden, and tighter cleanup requirement.</w:t>
+      </w:r>
+    </w:p>
+    <w:p/>
+    <w:p>
+      <w:r>
+        <w:t xml:space="preserve">For the hydrogen pathway, </w:t>
       </w:r>
     </w:p>
     <w:p>
@@ -1630,11 +1738,11 @@
         <w:pStyle w:val="ListParagraph"/>
         <w:numPr>
           <w:ilvl w:val="0"/>
-          <w:numId w:val="23"/>
+          <w:numId w:val="47"/>
         </w:numPr>
       </w:pPr>
       <w:r>
-        <w:t>To conclude which framework is better or if maybe it is dependent on different scenarios</w:t>
+        <w:t>SOEC is good for heat integaration and efficiency but not good for renewables coupling</w:t>
       </w:r>
     </w:p>
     <w:p>
@@ -1642,228 +1750,16 @@
         <w:pStyle w:val="ListParagraph"/>
         <w:numPr>
           <w:ilvl w:val="0"/>
-          <w:numId w:val="23"/>
+          <w:numId w:val="47"/>
         </w:numPr>
       </w:pPr>
-      <w:r>
-        <w:t>Expected impact:</w:t>
-      </w:r>
-    </w:p>
-    <w:p>
-      <w:pPr>
-        <w:pStyle w:val="ListParagraph"/>
-        <w:numPr>
-          <w:ilvl w:val="1"/>
-          <w:numId w:val="23"/>
-        </w:numPr>
-      </w:pPr>
-      <w:r>
-        <w:t xml:space="preserve">Ideal optimization framework choice for hybrid methanol synthesis plant </w:t>
-      </w:r>
-    </w:p>
-    <w:p>
-      <w:pPr>
-        <w:pStyle w:val="ListParagraph"/>
-        <w:numPr>
-          <w:ilvl w:val="1"/>
-          <w:numId w:val="23"/>
-        </w:numPr>
-      </w:pPr>
-      <w:r>
-        <w:t xml:space="preserve">Easier optimal framework identification process for other industrial systems </w:t>
-      </w:r>
-    </w:p>
-    <w:p>
-      <w:pPr>
-        <w:pStyle w:val="ListParagraph"/>
-        <w:numPr>
-          <w:ilvl w:val="1"/>
-          <w:numId w:val="23"/>
-        </w:numPr>
-      </w:pPr>
-      <w:r>
-        <w:t xml:space="preserve">Increased accuracy or reduced effort for similar optimization processes. </w:t>
-      </w:r>
-    </w:p>
-    <w:p>
-      <w:pPr>
-        <w:pStyle w:val="ListParagraph"/>
-        <w:numPr>
-          <w:ilvl w:val="1"/>
-          <w:numId w:val="23"/>
-        </w:numPr>
-      </w:pPr>
-      <w:r>
-        <w:t>Better understanding in where and how to implement RL agent for polygeneration systems</w:t>
-      </w:r>
     </w:p>
     <w:p>
       <w:pPr>
         <w:pStyle w:val="Heading2"/>
       </w:pPr>
-      <w:bookmarkStart w:id="4" w:name="_Toc228796395"/>
-      <w:r>
-        <w:t>Thesis Configuration</w:t>
-      </w:r>
-      <w:bookmarkEnd w:id="4"/>
-    </w:p>
-    <w:p>
-      <w:pPr>
-        <w:pStyle w:val="ListParagraph"/>
-        <w:numPr>
-          <w:ilvl w:val="0"/>
-          <w:numId w:val="25"/>
-        </w:numPr>
-      </w:pPr>
-      <w:r>
-        <w:t>Chapter 2 will discuss the state-of-the-art research on RL in optimizing a complex industrial process or power system</w:t>
-      </w:r>
-      <w:r>
-        <w:t xml:space="preserve">. It also introduces similar comparative analysis that has been conducted in the </w:t>
-      </w:r>
-      <w:r>
-        <w:t>literature</w:t>
-      </w:r>
-    </w:p>
-    <w:p>
-      <w:pPr>
-        <w:pStyle w:val="ListParagraph"/>
-        <w:numPr>
-          <w:ilvl w:val="0"/>
-          <w:numId w:val="25"/>
-        </w:numPr>
-      </w:pPr>
-      <w:r>
-        <w:t>Chapter 3 will discuss the steps taken to compare these two optimization frameworks. The comparison will be conducted in multiple stage and will be exp</w:t>
-      </w:r>
-      <w:r>
-        <w:t>lained in detail in chapter 3.</w:t>
-      </w:r>
-    </w:p>
-    <w:p>
-      <w:pPr>
-        <w:pStyle w:val="ListParagraph"/>
-        <w:numPr>
-          <w:ilvl w:val="0"/>
-          <w:numId w:val="25"/>
-        </w:numPr>
-      </w:pPr>
-      <w:r>
-        <w:t xml:space="preserve">Chapter 4 will talk about the results of the </w:t>
-      </w:r>
-      <w:r>
-        <w:t>multistage</w:t>
-      </w:r>
-      <w:r>
-        <w:t xml:space="preserve"> comparison in detail. It will cover the results of each </w:t>
-      </w:r>
-      <w:r>
-        <w:t xml:space="preserve">framework under different scenarios and case studies. At the end, the </w:t>
-      </w:r>
       <w:r>
         <w:lastRenderedPageBreak/>
-        <w:t xml:space="preserve">author will introduce a </w:t>
-      </w:r>
-      <w:r>
-        <w:t>generalization scoring for the two frameworks in an attempt to generalize their performances</w:t>
-      </w:r>
-      <w:r>
-        <w:t xml:space="preserve"> in different aspects.</w:t>
-      </w:r>
-    </w:p>
-    <w:p>
-      <w:pPr>
-        <w:pStyle w:val="ListParagraph"/>
-        <w:numPr>
-          <w:ilvl w:val="0"/>
-          <w:numId w:val="25"/>
-        </w:numPr>
-      </w:pPr>
-      <w:r>
-        <w:t xml:space="preserve">Chapter 5 will </w:t>
-      </w:r>
-      <w:r>
-        <w:t>wrap</w:t>
-      </w:r>
-      <w:r>
-        <w:t xml:space="preserve"> the </w:t>
-      </w:r>
-      <w:r>
-        <w:t>general findings of this master’s thesis</w:t>
-      </w:r>
-      <w:r>
-        <w:t xml:space="preserve"> while also acknowledging the limitations, assumptions, and considerations that are adopted in this thesis. </w:t>
-      </w:r>
-    </w:p>
-    <w:p>
-      <w:pPr>
-        <w:pStyle w:val="ListParagraph"/>
-        <w:numPr>
-          <w:ilvl w:val="0"/>
-          <w:numId w:val="24"/>
-        </w:numPr>
-      </w:pPr>
-      <w:r>
-        <w:br w:type="page"/>
-      </w:r>
-    </w:p>
-    <w:p>
-      <w:pPr>
-        <w:pStyle w:val="Heading1"/>
-      </w:pPr>
-      <w:bookmarkStart w:id="5" w:name="_Toc228796396"/>
-      <w:r>
-        <w:lastRenderedPageBreak/>
-        <w:t>Literature Review</w:t>
-      </w:r>
-      <w:bookmarkEnd w:id="5"/>
-    </w:p>
-    <w:p>
-      <w:pPr>
-        <w:pStyle w:val="Heading2"/>
-      </w:pPr>
-      <w:bookmarkStart w:id="6" w:name="_Toc228796397"/>
-      <w:bookmarkEnd w:id="6"/>
-      <w:commentRangeStart w:id="7"/>
-      <w:r>
-        <w:t xml:space="preserve">Power-to-X Integration for </w:t>
-      </w:r>
-      <w:r>
-        <w:t>Methanol Synthesis System</w:t>
-      </w:r>
-      <w:commentRangeEnd w:id="7"/>
-      <w:r>
-        <w:rPr>
-          <w:rStyle w:val="CommentReference"/>
-          <w:sz w:val="24"/>
-          <w:szCs w:val="28"/>
-        </w:rPr>
-        <w:commentReference w:id="7"/>
-      </w:r>
-    </w:p>
-    <w:p>
-      <w:pPr>
-        <w:pStyle w:val="ListParagraph"/>
-        <w:numPr>
-          <w:ilvl w:val="0"/>
-          <w:numId w:val="26"/>
-        </w:numPr>
-      </w:pPr>
-      <w:r>
-        <w:t xml:space="preserve">Different definition of </w:t>
-      </w:r>
-      <w:r>
-        <w:t>linearity and non-linearity for a methanol synthesis system</w:t>
-      </w:r>
-      <w:r>
-        <w:t xml:space="preserve"> in the literature</w:t>
-      </w:r>
-    </w:p>
-    <w:p>
-      <w:pPr>
-        <w:pStyle w:val="Heading2"/>
-      </w:pPr>
-      <w:r>
         <w:t>MILP for Complex Polygeneration System</w:t>
       </w:r>
     </w:p>
@@ -2432,7 +2328,6 @@
         </w:numPr>
       </w:pPr>
       <w:r>
-        <w:lastRenderedPageBreak/>
         <w:t>Equation of optimal Q-value of state-aciton pair</w:t>
       </w:r>
     </w:p>
@@ -2501,6 +2396,7 @@
     </w:p>
     <w:p>
       <w:r>
+        <w:lastRenderedPageBreak/>
         <w:t xml:space="preserve">Modelling an accurate </w:t>
       </w:r>
       <w:r>
@@ -2809,11 +2705,7 @@
         <w:t>Many studies have have shown the application of this algorithm method</w:t>
       </w:r>
       <w:r>
-        <w:t xml:space="preserve"> into different kinds of </w:t>
-      </w:r>
-      <w:r>
-        <w:lastRenderedPageBreak/>
-        <w:t>energy systems. To be continued…</w:t>
+        <w:t xml:space="preserve"> into different kinds of energy systems. To be continued…</w:t>
       </w:r>
       <w:r>
         <w:t xml:space="preserve"> </w:t>
@@ -2826,6 +2718,7 @@
         <w:pStyle w:val="Heading2"/>
       </w:pPr>
       <w:r>
+        <w:lastRenderedPageBreak/>
         <w:t>RL vs MILP for Different Applications</w:t>
       </w:r>
     </w:p>
@@ -3282,50 +3175,50 @@
         <w:rPr>
           <w:color w:val="000000"/>
         </w:rPr>
-        <w:t xml:space="preserve">at first managed to produce a better result </w:t>
+        <w:t xml:space="preserve">at first managed to produce a better result in terms of cost, however, the authors later found that this is due to the </w:t>
       </w:r>
       <w:r>
         <w:rPr>
           <w:color w:val="000000"/>
         </w:rPr>
+        <w:t xml:space="preserve">modelling limitations that the RL excludes </w:t>
+      </w:r>
+      <w:r>
+        <w:rPr>
+          <w:color w:val="000000"/>
+        </w:rPr>
+        <w:t xml:space="preserve">which is the battery SOC state at the end of the simulation that should be the same as the initial SOC state. </w:t>
+      </w:r>
+      <w:r>
+        <w:rPr>
+          <w:color w:val="000000"/>
+        </w:rPr>
+        <w:t xml:space="preserve">With this assumption being included in the calculation, the cost result of RL drops </w:t>
+      </w:r>
+      <w:r>
+        <w:rPr>
+          <w:color w:val="000000"/>
+        </w:rPr>
+        <w:t>and MILP prevails to become cheaper.</w:t>
+      </w:r>
+      <w:r>
+        <w:rPr>
+          <w:color w:val="000000"/>
+        </w:rPr>
+        <w:t xml:space="preserve"> This shows </w:t>
+      </w:r>
+      <w:r>
+        <w:rPr>
+          <w:color w:val="000000"/>
+        </w:rPr>
+        <w:t xml:space="preserve">how important the modelling phase </w:t>
+      </w:r>
+      <w:r>
+        <w:rPr>
+          <w:color w:val="000000"/>
+        </w:rPr>
         <w:lastRenderedPageBreak/>
-        <w:t xml:space="preserve">in terms of cost, however, the authors later found that this is due to the </w:t>
-      </w:r>
-      <w:r>
-        <w:rPr>
-          <w:color w:val="000000"/>
-        </w:rPr>
-        <w:t xml:space="preserve">modelling limitations that the RL excludes </w:t>
-      </w:r>
-      <w:r>
-        <w:rPr>
-          <w:color w:val="000000"/>
-        </w:rPr>
-        <w:t xml:space="preserve">which is the battery SOC state at the end of the simulation that should be the same as the initial SOC state. </w:t>
-      </w:r>
-      <w:r>
-        <w:rPr>
-          <w:color w:val="000000"/>
-        </w:rPr>
-        <w:t xml:space="preserve">With this assumption being included in the calculation, the cost result of RL drops </w:t>
-      </w:r>
-      <w:r>
-        <w:rPr>
-          <w:color w:val="000000"/>
-        </w:rPr>
-        <w:t>and MILP prevails to become cheaper.</w:t>
-      </w:r>
-      <w:r>
-        <w:rPr>
-          <w:color w:val="000000"/>
-        </w:rPr>
-        <w:t xml:space="preserve"> This shows </w:t>
-      </w:r>
-      <w:r>
-        <w:rPr>
-          <w:color w:val="000000"/>
-        </w:rPr>
-        <w:t>how important the modelling phase and identical assumption are for a fair comparison.</w:t>
+        <w:t>and identical assumption are for a fair comparison.</w:t>
       </w:r>
       <w:r>
         <w:rPr>
@@ -5786,6 +5679,119 @@
 <file path=word/numbering.xml><?xml version="1.0" encoding="utf-8"?>
 <w:numbering xmlns:wpc="http://schemas.microsoft.com/office/word/2010/wordprocessingCanvas" xmlns:cx="http://schemas.microsoft.com/office/drawing/2014/chartex" xmlns:cx1="http://schemas.microsoft.com/office/drawing/2015/9/8/chartex" xmlns:cx2="http://schemas.microsoft.com/office/drawing/2015/10/21/chartex" xmlns:cx3="http://schemas.microsoft.com/office/drawing/2016/5/9/chartex" xmlns:cx4="http://schemas.microsoft.com/office/drawing/2016/5/10/chartex" xmlns:cx5="http://schemas.microsoft.com/office/drawing/2016/5/11/chartex" xmlns:cx6="http://schemas.microsoft.com/office/drawing/2016/5/12/chartex" xmlns:cx7="http://schemas.microsoft.com/office/drawing/2016/5/13/chartex" xmlns:cx8="http://schemas.microsoft.com/office/drawing/2016/5/14/chartex" xmlns:mc="http://schemas.openxmlformats.org/markup-compatibility/2006" xmlns:aink="http://schemas.microsoft.com/office/drawing/2016/ink" xmlns:am3d="http://schemas.microsoft.com/office/drawing/2017/model3d" xmlns:o="urn:schemas-microsoft-com:office:office" xmlns:oel="http://schemas.microsoft.com/office/2019/extlst" xmlns:r="http://schemas.openxmlformats.org/officeDocument/2006/relationships" xmlns:m="http://schemas.openxmlformats.org/officeDocument/2006/math" xmlns:v="urn:schemas-microsoft-com:vml" xmlns:wp14="http://schemas.microsoft.com/office/word/2010/wordprocessingDrawing" xmlns:wp="http://schemas.openxmlformats.org/drawingml/2006/wordprocessingDrawing" xmlns:w10="urn:schemas-microsoft-com:office:word" xmlns:w="http://schemas.openxmlformats.org/wordprocessingml/2006/main" xmlns:w14="http://schemas.microsoft.com/office/word/2010/wordml" xmlns:w15="http://schemas.microsoft.com/office/word/2012/wordml" xmlns:w16cex="http://schemas.microsoft.com/office/word/2018/wordml/cex" xmlns:w16cid="http://schemas.microsoft.com/office/word/2016/wordml/cid" xmlns:w16="http://schemas.microsoft.com/office/word/2018/wordml" xmlns:w16du="http://schemas.microsoft.com/office/word/2023/wordml/word16du" xmlns:w16sdtdh="http://schemas.microsoft.com/office/word/2020/wordml/sdtdatahash" xmlns:w16sdtfl="http://schemas.microsoft.com/office/word/2024/wordml/sdtformatlock" xmlns:w16se="http://schemas.microsoft.com/office/word/2015/wordml/symex" xmlns:wpg="http://schemas.microsoft.com/office/word/2010/wordprocessingGroup" xmlns:wpi="http://schemas.microsoft.com/office/word/2010/wordprocessingInk" xmlns:wne="http://schemas.microsoft.com/office/word/2006/wordml" xmlns:wps="http://schemas.microsoft.com/office/word/2010/wordprocessingShape" mc:Ignorable="w14 w15 w16se w16cid w16 w16cex w16sdtdh w16sdtfl w16du wp14">
   <w:abstractNum w:abstractNumId="0" w15:restartNumberingAfterBreak="0">
+    <w:nsid w:val="023D1F26"/>
+    <w:multiLevelType w:val="hybridMultilevel"/>
+    <w:tmpl w:val="D7A0D85C"/>
+    <w:lvl w:ilvl="0" w:tplc="98464642">
+      <w:start w:val="4"/>
+      <w:numFmt w:val="bullet"/>
+      <w:lvlText w:val="-"/>
+      <w:lvlJc w:val="left"/>
+      <w:pPr>
+        <w:ind w:left="720" w:hanging="360"/>
+      </w:pPr>
+      <w:rPr>
+        <w:rFonts w:ascii="Times New Roman" w:eastAsia="MS Mincho" w:hAnsi="Times New Roman" w:cs="Times New Roman" w:hint="default"/>
+      </w:rPr>
+    </w:lvl>
+    <w:lvl w:ilvl="1" w:tplc="04090003" w:tentative="1">
+      <w:start w:val="1"/>
+      <w:numFmt w:val="bullet"/>
+      <w:lvlText w:val="o"/>
+      <w:lvlJc w:val="left"/>
+      <w:pPr>
+        <w:ind w:left="1440" w:hanging="360"/>
+      </w:pPr>
+      <w:rPr>
+        <w:rFonts w:ascii="Courier New" w:hAnsi="Courier New" w:cs="Courier New" w:hint="default"/>
+      </w:rPr>
+    </w:lvl>
+    <w:lvl w:ilvl="2" w:tplc="04090005" w:tentative="1">
+      <w:start w:val="1"/>
+      <w:numFmt w:val="bullet"/>
+      <w:lvlText w:val=""/>
+      <w:lvlJc w:val="left"/>
+      <w:pPr>
+        <w:ind w:left="2160" w:hanging="360"/>
+      </w:pPr>
+      <w:rPr>
+        <w:rFonts w:ascii="Wingdings" w:hAnsi="Wingdings" w:hint="default"/>
+      </w:rPr>
+    </w:lvl>
+    <w:lvl w:ilvl="3" w:tplc="04090001" w:tentative="1">
+      <w:start w:val="1"/>
+      <w:numFmt w:val="bullet"/>
+      <w:lvlText w:val=""/>
+      <w:lvlJc w:val="left"/>
+      <w:pPr>
+        <w:ind w:left="2880" w:hanging="360"/>
+      </w:pPr>
+      <w:rPr>
+        <w:rFonts w:ascii="Symbol" w:hAnsi="Symbol" w:hint="default"/>
+      </w:rPr>
+    </w:lvl>
+    <w:lvl w:ilvl="4" w:tplc="04090003" w:tentative="1">
+      <w:start w:val="1"/>
+      <w:numFmt w:val="bullet"/>
+      <w:lvlText w:val="o"/>
+      <w:lvlJc w:val="left"/>
+      <w:pPr>
+        <w:ind w:left="3600" w:hanging="360"/>
+      </w:pPr>
+      <w:rPr>
+        <w:rFonts w:ascii="Courier New" w:hAnsi="Courier New" w:cs="Courier New" w:hint="default"/>
+      </w:rPr>
+    </w:lvl>
+    <w:lvl w:ilvl="5" w:tplc="04090005" w:tentative="1">
+      <w:start w:val="1"/>
+      <w:numFmt w:val="bullet"/>
+      <w:lvlText w:val=""/>
+      <w:lvlJc w:val="left"/>
+      <w:pPr>
+        <w:ind w:left="4320" w:hanging="360"/>
+      </w:pPr>
+      <w:rPr>
+        <w:rFonts w:ascii="Wingdings" w:hAnsi="Wingdings" w:hint="default"/>
+      </w:rPr>
+    </w:lvl>
+    <w:lvl w:ilvl="6" w:tplc="04090001" w:tentative="1">
+      <w:start w:val="1"/>
+      <w:numFmt w:val="bullet"/>
+      <w:lvlText w:val=""/>
+      <w:lvlJc w:val="left"/>
+      <w:pPr>
+        <w:ind w:left="5040" w:hanging="360"/>
+      </w:pPr>
+      <w:rPr>
+        <w:rFonts w:ascii="Symbol" w:hAnsi="Symbol" w:hint="default"/>
+      </w:rPr>
+    </w:lvl>
+    <w:lvl w:ilvl="7" w:tplc="04090003" w:tentative="1">
+      <w:start w:val="1"/>
+      <w:numFmt w:val="bullet"/>
+      <w:lvlText w:val="o"/>
+      <w:lvlJc w:val="left"/>
+      <w:pPr>
+        <w:ind w:left="5760" w:hanging="360"/>
+      </w:pPr>
+      <w:rPr>
+        <w:rFonts w:ascii="Courier New" w:hAnsi="Courier New" w:cs="Courier New" w:hint="default"/>
+      </w:rPr>
+    </w:lvl>
+    <w:lvl w:ilvl="8" w:tplc="04090005" w:tentative="1">
+      <w:start w:val="1"/>
+      <w:numFmt w:val="bullet"/>
+      <w:lvlText w:val=""/>
+      <w:lvlJc w:val="left"/>
+      <w:pPr>
+        <w:ind w:left="6480" w:hanging="360"/>
+      </w:pPr>
+      <w:rPr>
+        <w:rFonts w:ascii="Wingdings" w:hAnsi="Wingdings" w:hint="default"/>
+      </w:rPr>
+    </w:lvl>
+  </w:abstractNum>
+  <w:abstractNum w:abstractNumId="1" w15:restartNumberingAfterBreak="0">
     <w:nsid w:val="07242672"/>
     <w:multiLevelType w:val="hybridMultilevel"/>
     <w:tmpl w:val="60A4FC18"/>
@@ -5898,7 +5904,7 @@
       </w:rPr>
     </w:lvl>
   </w:abstractNum>
-  <w:abstractNum w:abstractNumId="1" w15:restartNumberingAfterBreak="0">
+  <w:abstractNum w:abstractNumId="2" w15:restartNumberingAfterBreak="0">
     <w:nsid w:val="0FA843D6"/>
     <w:multiLevelType w:val="hybridMultilevel"/>
     <w:tmpl w:val="D4FC5FF6"/>
@@ -6011,7 +6017,7 @@
       </w:rPr>
     </w:lvl>
   </w:abstractNum>
-  <w:abstractNum w:abstractNumId="2" w15:restartNumberingAfterBreak="0">
+  <w:abstractNum w:abstractNumId="3" w15:restartNumberingAfterBreak="0">
     <w:nsid w:val="110A51D6"/>
     <w:multiLevelType w:val="hybridMultilevel"/>
     <w:tmpl w:val="FC12F718"/>
@@ -6123,7 +6129,7 @@
       </w:rPr>
     </w:lvl>
   </w:abstractNum>
-  <w:abstractNum w:abstractNumId="3" w15:restartNumberingAfterBreak="0">
+  <w:abstractNum w:abstractNumId="4" w15:restartNumberingAfterBreak="0">
     <w:nsid w:val="12725F2F"/>
     <w:multiLevelType w:val="hybridMultilevel"/>
     <w:tmpl w:val="29249714"/>
@@ -6236,7 +6242,7 @@
       </w:rPr>
     </w:lvl>
   </w:abstractNum>
-  <w:abstractNum w:abstractNumId="4" w15:restartNumberingAfterBreak="0">
+  <w:abstractNum w:abstractNumId="5" w15:restartNumberingAfterBreak="0">
     <w:nsid w:val="13A972C3"/>
     <w:multiLevelType w:val="hybridMultilevel"/>
     <w:tmpl w:val="EC5C4DD8"/>
@@ -6349,7 +6355,7 @@
       </w:rPr>
     </w:lvl>
   </w:abstractNum>
-  <w:abstractNum w:abstractNumId="5" w15:restartNumberingAfterBreak="0">
+  <w:abstractNum w:abstractNumId="6" w15:restartNumberingAfterBreak="0">
     <w:nsid w:val="17165D1B"/>
     <w:multiLevelType w:val="hybridMultilevel"/>
     <w:tmpl w:val="57942300"/>
@@ -6435,7 +6441,7 @@
       </w:pPr>
     </w:lvl>
   </w:abstractNum>
-  <w:abstractNum w:abstractNumId="6" w15:restartNumberingAfterBreak="0">
+  <w:abstractNum w:abstractNumId="7" w15:restartNumberingAfterBreak="0">
     <w:nsid w:val="17EA0ECE"/>
     <w:multiLevelType w:val="multilevel"/>
     <w:tmpl w:val="447226F6"/>
@@ -6584,7 +6590,7 @@
       </w:rPr>
     </w:lvl>
   </w:abstractNum>
-  <w:abstractNum w:abstractNumId="7" w15:restartNumberingAfterBreak="0">
+  <w:abstractNum w:abstractNumId="8" w15:restartNumberingAfterBreak="0">
     <w:nsid w:val="1817621D"/>
     <w:multiLevelType w:val="hybridMultilevel"/>
     <w:tmpl w:val="5C104348"/>
@@ -6697,7 +6703,7 @@
       </w:rPr>
     </w:lvl>
   </w:abstractNum>
-  <w:abstractNum w:abstractNumId="8" w15:restartNumberingAfterBreak="0">
+  <w:abstractNum w:abstractNumId="9" w15:restartNumberingAfterBreak="0">
     <w:nsid w:val="1BB825D5"/>
     <w:multiLevelType w:val="hybridMultilevel"/>
     <w:tmpl w:val="B888A8F8"/>
@@ -6809,7 +6815,7 @@
       </w:rPr>
     </w:lvl>
   </w:abstractNum>
-  <w:abstractNum w:abstractNumId="9" w15:restartNumberingAfterBreak="0">
+  <w:abstractNum w:abstractNumId="10" w15:restartNumberingAfterBreak="0">
     <w:nsid w:val="1D190277"/>
     <w:multiLevelType w:val="multilevel"/>
     <w:tmpl w:val="4796B74E"/>
@@ -6895,7 +6901,7 @@
       </w:pPr>
     </w:lvl>
   </w:abstractNum>
-  <w:abstractNum w:abstractNumId="10" w15:restartNumberingAfterBreak="0">
+  <w:abstractNum w:abstractNumId="11" w15:restartNumberingAfterBreak="0">
     <w:nsid w:val="1E0C6E87"/>
     <w:multiLevelType w:val="hybridMultilevel"/>
     <w:tmpl w:val="DDC4691A"/>
@@ -7008,7 +7014,7 @@
       </w:rPr>
     </w:lvl>
   </w:abstractNum>
-  <w:abstractNum w:abstractNumId="11" w15:restartNumberingAfterBreak="0">
+  <w:abstractNum w:abstractNumId="12" w15:restartNumberingAfterBreak="0">
     <w:nsid w:val="1FCB6643"/>
     <w:multiLevelType w:val="multilevel"/>
     <w:tmpl w:val="3E70E1E0"/>
@@ -7103,7 +7109,7 @@
       </w:pPr>
     </w:lvl>
   </w:abstractNum>
-  <w:abstractNum w:abstractNumId="12" w15:restartNumberingAfterBreak="0">
+  <w:abstractNum w:abstractNumId="13" w15:restartNumberingAfterBreak="0">
     <w:nsid w:val="22084036"/>
     <w:multiLevelType w:val="hybridMultilevel"/>
     <w:tmpl w:val="DBD28B6A"/>
@@ -7216,7 +7222,7 @@
       </w:rPr>
     </w:lvl>
   </w:abstractNum>
-  <w:abstractNum w:abstractNumId="13" w15:restartNumberingAfterBreak="0">
+  <w:abstractNum w:abstractNumId="14" w15:restartNumberingAfterBreak="0">
     <w:nsid w:val="228337A7"/>
     <w:multiLevelType w:val="hybridMultilevel"/>
     <w:tmpl w:val="8432D20C"/>
@@ -7329,7 +7335,7 @@
       </w:rPr>
     </w:lvl>
   </w:abstractNum>
-  <w:abstractNum w:abstractNumId="14" w15:restartNumberingAfterBreak="0">
+  <w:abstractNum w:abstractNumId="15" w15:restartNumberingAfterBreak="0">
     <w:nsid w:val="23327DE5"/>
     <w:multiLevelType w:val="hybridMultilevel"/>
     <w:tmpl w:val="1A4C4022"/>
@@ -7442,7 +7448,7 @@
       </w:rPr>
     </w:lvl>
   </w:abstractNum>
-  <w:abstractNum w:abstractNumId="15" w15:restartNumberingAfterBreak="0">
+  <w:abstractNum w:abstractNumId="16" w15:restartNumberingAfterBreak="0">
     <w:nsid w:val="256433CE"/>
     <w:multiLevelType w:val="hybridMultilevel"/>
     <w:tmpl w:val="495493D6"/>
@@ -7555,7 +7561,7 @@
       </w:rPr>
     </w:lvl>
   </w:abstractNum>
-  <w:abstractNum w:abstractNumId="16" w15:restartNumberingAfterBreak="0">
+  <w:abstractNum w:abstractNumId="17" w15:restartNumberingAfterBreak="0">
     <w:nsid w:val="29B24864"/>
     <w:multiLevelType w:val="hybridMultilevel"/>
     <w:tmpl w:val="06204748"/>
@@ -7644,7 +7650,232 @@
       </w:pPr>
     </w:lvl>
   </w:abstractNum>
-  <w:abstractNum w:abstractNumId="17" w15:restartNumberingAfterBreak="0">
+  <w:abstractNum w:abstractNumId="18" w15:restartNumberingAfterBreak="0">
+    <w:nsid w:val="2C2246C1"/>
+    <w:multiLevelType w:val="hybridMultilevel"/>
+    <w:tmpl w:val="48F2C360"/>
+    <w:lvl w:ilvl="0" w:tplc="49F0E92E">
+      <w:numFmt w:val="bullet"/>
+      <w:lvlText w:val="•"/>
+      <w:lvlJc w:val="left"/>
+      <w:pPr>
+        <w:ind w:left="720" w:hanging="360"/>
+      </w:pPr>
+      <w:rPr>
+        <w:rFonts w:ascii="Times New Roman" w:eastAsia="MS Mincho" w:hAnsi="Times New Roman" w:cs="Times New Roman" w:hint="default"/>
+      </w:rPr>
+    </w:lvl>
+    <w:lvl w:ilvl="1" w:tplc="04090003" w:tentative="1">
+      <w:start w:val="1"/>
+      <w:numFmt w:val="bullet"/>
+      <w:lvlText w:val="o"/>
+      <w:lvlJc w:val="left"/>
+      <w:pPr>
+        <w:ind w:left="1440" w:hanging="360"/>
+      </w:pPr>
+      <w:rPr>
+        <w:rFonts w:ascii="Courier New" w:hAnsi="Courier New" w:cs="Courier New" w:hint="default"/>
+      </w:rPr>
+    </w:lvl>
+    <w:lvl w:ilvl="2" w:tplc="04090005" w:tentative="1">
+      <w:start w:val="1"/>
+      <w:numFmt w:val="bullet"/>
+      <w:lvlText w:val=""/>
+      <w:lvlJc w:val="left"/>
+      <w:pPr>
+        <w:ind w:left="2160" w:hanging="360"/>
+      </w:pPr>
+      <w:rPr>
+        <w:rFonts w:ascii="Wingdings" w:hAnsi="Wingdings" w:hint="default"/>
+      </w:rPr>
+    </w:lvl>
+    <w:lvl w:ilvl="3" w:tplc="04090001" w:tentative="1">
+      <w:start w:val="1"/>
+      <w:numFmt w:val="bullet"/>
+      <w:lvlText w:val=""/>
+      <w:lvlJc w:val="left"/>
+      <w:pPr>
+        <w:ind w:left="2880" w:hanging="360"/>
+      </w:pPr>
+      <w:rPr>
+        <w:rFonts w:ascii="Symbol" w:hAnsi="Symbol" w:hint="default"/>
+      </w:rPr>
+    </w:lvl>
+    <w:lvl w:ilvl="4" w:tplc="04090003" w:tentative="1">
+      <w:start w:val="1"/>
+      <w:numFmt w:val="bullet"/>
+      <w:lvlText w:val="o"/>
+      <w:lvlJc w:val="left"/>
+      <w:pPr>
+        <w:ind w:left="3600" w:hanging="360"/>
+      </w:pPr>
+      <w:rPr>
+        <w:rFonts w:ascii="Courier New" w:hAnsi="Courier New" w:cs="Courier New" w:hint="default"/>
+      </w:rPr>
+    </w:lvl>
+    <w:lvl w:ilvl="5" w:tplc="04090005" w:tentative="1">
+      <w:start w:val="1"/>
+      <w:numFmt w:val="bullet"/>
+      <w:lvlText w:val=""/>
+      <w:lvlJc w:val="left"/>
+      <w:pPr>
+        <w:ind w:left="4320" w:hanging="360"/>
+      </w:pPr>
+      <w:rPr>
+        <w:rFonts w:ascii="Wingdings" w:hAnsi="Wingdings" w:hint="default"/>
+      </w:rPr>
+    </w:lvl>
+    <w:lvl w:ilvl="6" w:tplc="04090001" w:tentative="1">
+      <w:start w:val="1"/>
+      <w:numFmt w:val="bullet"/>
+      <w:lvlText w:val=""/>
+      <w:lvlJc w:val="left"/>
+      <w:pPr>
+        <w:ind w:left="5040" w:hanging="360"/>
+      </w:pPr>
+      <w:rPr>
+        <w:rFonts w:ascii="Symbol" w:hAnsi="Symbol" w:hint="default"/>
+      </w:rPr>
+    </w:lvl>
+    <w:lvl w:ilvl="7" w:tplc="04090003" w:tentative="1">
+      <w:start w:val="1"/>
+      <w:numFmt w:val="bullet"/>
+      <w:lvlText w:val="o"/>
+      <w:lvlJc w:val="left"/>
+      <w:pPr>
+        <w:ind w:left="5760" w:hanging="360"/>
+      </w:pPr>
+      <w:rPr>
+        <w:rFonts w:ascii="Courier New" w:hAnsi="Courier New" w:cs="Courier New" w:hint="default"/>
+      </w:rPr>
+    </w:lvl>
+    <w:lvl w:ilvl="8" w:tplc="04090005" w:tentative="1">
+      <w:start w:val="1"/>
+      <w:numFmt w:val="bullet"/>
+      <w:lvlText w:val=""/>
+      <w:lvlJc w:val="left"/>
+      <w:pPr>
+        <w:ind w:left="6480" w:hanging="360"/>
+      </w:pPr>
+      <w:rPr>
+        <w:rFonts w:ascii="Wingdings" w:hAnsi="Wingdings" w:hint="default"/>
+      </w:rPr>
+    </w:lvl>
+  </w:abstractNum>
+  <w:abstractNum w:abstractNumId="19" w15:restartNumberingAfterBreak="0">
+    <w:nsid w:val="2EEA75E5"/>
+    <w:multiLevelType w:val="hybridMultilevel"/>
+    <w:tmpl w:val="2926FC02"/>
+    <w:lvl w:ilvl="0" w:tplc="04090001">
+      <w:start w:val="1"/>
+      <w:numFmt w:val="bullet"/>
+      <w:lvlText w:val=""/>
+      <w:lvlJc w:val="left"/>
+      <w:pPr>
+        <w:ind w:left="720" w:hanging="360"/>
+      </w:pPr>
+      <w:rPr>
+        <w:rFonts w:ascii="Symbol" w:hAnsi="Symbol" w:hint="default"/>
+      </w:rPr>
+    </w:lvl>
+    <w:lvl w:ilvl="1" w:tplc="04090003" w:tentative="1">
+      <w:start w:val="1"/>
+      <w:numFmt w:val="bullet"/>
+      <w:lvlText w:val="o"/>
+      <w:lvlJc w:val="left"/>
+      <w:pPr>
+        <w:ind w:left="1440" w:hanging="360"/>
+      </w:pPr>
+      <w:rPr>
+        <w:rFonts w:ascii="Courier New" w:hAnsi="Courier New" w:cs="Courier New" w:hint="default"/>
+      </w:rPr>
+    </w:lvl>
+    <w:lvl w:ilvl="2" w:tplc="04090005" w:tentative="1">
+      <w:start w:val="1"/>
+      <w:numFmt w:val="bullet"/>
+      <w:lvlText w:val=""/>
+      <w:lvlJc w:val="left"/>
+      <w:pPr>
+        <w:ind w:left="2160" w:hanging="360"/>
+      </w:pPr>
+      <w:rPr>
+        <w:rFonts w:ascii="Wingdings" w:hAnsi="Wingdings" w:hint="default"/>
+      </w:rPr>
+    </w:lvl>
+    <w:lvl w:ilvl="3" w:tplc="04090001" w:tentative="1">
+      <w:start w:val="1"/>
+      <w:numFmt w:val="bullet"/>
+      <w:lvlText w:val=""/>
+      <w:lvlJc w:val="left"/>
+      <w:pPr>
+        <w:ind w:left="2880" w:hanging="360"/>
+      </w:pPr>
+      <w:rPr>
+        <w:rFonts w:ascii="Symbol" w:hAnsi="Symbol" w:hint="default"/>
+      </w:rPr>
+    </w:lvl>
+    <w:lvl w:ilvl="4" w:tplc="04090003" w:tentative="1">
+      <w:start w:val="1"/>
+      <w:numFmt w:val="bullet"/>
+      <w:lvlText w:val="o"/>
+      <w:lvlJc w:val="left"/>
+      <w:pPr>
+        <w:ind w:left="3600" w:hanging="360"/>
+      </w:pPr>
+      <w:rPr>
+        <w:rFonts w:ascii="Courier New" w:hAnsi="Courier New" w:cs="Courier New" w:hint="default"/>
+      </w:rPr>
+    </w:lvl>
+    <w:lvl w:ilvl="5" w:tplc="04090005" w:tentative="1">
+      <w:start w:val="1"/>
+      <w:numFmt w:val="bullet"/>
+      <w:lvlText w:val=""/>
+      <w:lvlJc w:val="left"/>
+      <w:pPr>
+        <w:ind w:left="4320" w:hanging="360"/>
+      </w:pPr>
+      <w:rPr>
+        <w:rFonts w:ascii="Wingdings" w:hAnsi="Wingdings" w:hint="default"/>
+      </w:rPr>
+    </w:lvl>
+    <w:lvl w:ilvl="6" w:tplc="04090001" w:tentative="1">
+      <w:start w:val="1"/>
+      <w:numFmt w:val="bullet"/>
+      <w:lvlText w:val=""/>
+      <w:lvlJc w:val="left"/>
+      <w:pPr>
+        <w:ind w:left="5040" w:hanging="360"/>
+      </w:pPr>
+      <w:rPr>
+        <w:rFonts w:ascii="Symbol" w:hAnsi="Symbol" w:hint="default"/>
+      </w:rPr>
+    </w:lvl>
+    <w:lvl w:ilvl="7" w:tplc="04090003" w:tentative="1">
+      <w:start w:val="1"/>
+      <w:numFmt w:val="bullet"/>
+      <w:lvlText w:val="o"/>
+      <w:lvlJc w:val="left"/>
+      <w:pPr>
+        <w:ind w:left="5760" w:hanging="360"/>
+      </w:pPr>
+      <w:rPr>
+        <w:rFonts w:ascii="Courier New" w:hAnsi="Courier New" w:cs="Courier New" w:hint="default"/>
+      </w:rPr>
+    </w:lvl>
+    <w:lvl w:ilvl="8" w:tplc="04090005" w:tentative="1">
+      <w:start w:val="1"/>
+      <w:numFmt w:val="bullet"/>
+      <w:lvlText w:val=""/>
+      <w:lvlJc w:val="left"/>
+      <w:pPr>
+        <w:ind w:left="6480" w:hanging="360"/>
+      </w:pPr>
+      <w:rPr>
+        <w:rFonts w:ascii="Wingdings" w:hAnsi="Wingdings" w:hint="default"/>
+      </w:rPr>
+    </w:lvl>
+  </w:abstractNum>
+  <w:abstractNum w:abstractNumId="20" w15:restartNumberingAfterBreak="0">
     <w:nsid w:val="300E4837"/>
     <w:multiLevelType w:val="hybridMultilevel"/>
     <w:tmpl w:val="21A88B6C"/>
@@ -7757,7 +7988,7 @@
       </w:rPr>
     </w:lvl>
   </w:abstractNum>
-  <w:abstractNum w:abstractNumId="18" w15:restartNumberingAfterBreak="0">
+  <w:abstractNum w:abstractNumId="21" w15:restartNumberingAfterBreak="0">
     <w:nsid w:val="325C3B4B"/>
     <w:multiLevelType w:val="hybridMultilevel"/>
     <w:tmpl w:val="C6E029BA"/>
@@ -7870,7 +8101,7 @@
       </w:rPr>
     </w:lvl>
   </w:abstractNum>
-  <w:abstractNum w:abstractNumId="19" w15:restartNumberingAfterBreak="0">
+  <w:abstractNum w:abstractNumId="22" w15:restartNumberingAfterBreak="0">
     <w:nsid w:val="36C30D85"/>
     <w:multiLevelType w:val="hybridMultilevel"/>
     <w:tmpl w:val="DE32E2F2"/>
@@ -7983,7 +8214,7 @@
       </w:rPr>
     </w:lvl>
   </w:abstractNum>
-  <w:abstractNum w:abstractNumId="20" w15:restartNumberingAfterBreak="0">
+  <w:abstractNum w:abstractNumId="23" w15:restartNumberingAfterBreak="0">
     <w:nsid w:val="3C2C271D"/>
     <w:multiLevelType w:val="hybridMultilevel"/>
     <w:tmpl w:val="978EAE6C"/>
@@ -8096,7 +8327,7 @@
       </w:rPr>
     </w:lvl>
   </w:abstractNum>
-  <w:abstractNum w:abstractNumId="21" w15:restartNumberingAfterBreak="0">
+  <w:abstractNum w:abstractNumId="24" w15:restartNumberingAfterBreak="0">
     <w:nsid w:val="3C9B4DAC"/>
     <w:multiLevelType w:val="hybridMultilevel"/>
     <w:tmpl w:val="E6F26226"/>
@@ -8182,7 +8413,7 @@
       </w:pPr>
     </w:lvl>
   </w:abstractNum>
-  <w:abstractNum w:abstractNumId="22" w15:restartNumberingAfterBreak="0">
+  <w:abstractNum w:abstractNumId="25" w15:restartNumberingAfterBreak="0">
     <w:nsid w:val="3D250691"/>
     <w:multiLevelType w:val="hybridMultilevel"/>
     <w:tmpl w:val="293652FA"/>
@@ -8295,7 +8526,7 @@
       </w:rPr>
     </w:lvl>
   </w:abstractNum>
-  <w:abstractNum w:abstractNumId="23" w15:restartNumberingAfterBreak="0">
+  <w:abstractNum w:abstractNumId="26" w15:restartNumberingAfterBreak="0">
     <w:nsid w:val="3E4219A4"/>
     <w:multiLevelType w:val="hybridMultilevel"/>
     <w:tmpl w:val="831E829E"/>
@@ -8407,7 +8638,7 @@
       </w:rPr>
     </w:lvl>
   </w:abstractNum>
-  <w:abstractNum w:abstractNumId="24" w15:restartNumberingAfterBreak="0">
+  <w:abstractNum w:abstractNumId="27" w15:restartNumberingAfterBreak="0">
     <w:nsid w:val="3F206DB5"/>
     <w:multiLevelType w:val="multilevel"/>
     <w:tmpl w:val="3544CBE4"/>
@@ -8556,7 +8787,7 @@
       </w:rPr>
     </w:lvl>
   </w:abstractNum>
-  <w:abstractNum w:abstractNumId="25" w15:restartNumberingAfterBreak="0">
+  <w:abstractNum w:abstractNumId="28" w15:restartNumberingAfterBreak="0">
     <w:nsid w:val="4056699C"/>
     <w:multiLevelType w:val="hybridMultilevel"/>
     <w:tmpl w:val="F6CED83E"/>
@@ -8669,7 +8900,7 @@
       </w:rPr>
     </w:lvl>
   </w:abstractNum>
-  <w:abstractNum w:abstractNumId="26" w15:restartNumberingAfterBreak="0">
+  <w:abstractNum w:abstractNumId="29" w15:restartNumberingAfterBreak="0">
     <w:nsid w:val="43804A33"/>
     <w:multiLevelType w:val="hybridMultilevel"/>
     <w:tmpl w:val="BF2A2F88"/>
@@ -8781,7 +9012,7 @@
       </w:rPr>
     </w:lvl>
   </w:abstractNum>
-  <w:abstractNum w:abstractNumId="27" w15:restartNumberingAfterBreak="0">
+  <w:abstractNum w:abstractNumId="30" w15:restartNumberingAfterBreak="0">
     <w:nsid w:val="44924F22"/>
     <w:multiLevelType w:val="hybridMultilevel"/>
     <w:tmpl w:val="F3AA4096"/>
@@ -8894,7 +9125,7 @@
       </w:rPr>
     </w:lvl>
   </w:abstractNum>
-  <w:abstractNum w:abstractNumId="28" w15:restartNumberingAfterBreak="0">
+  <w:abstractNum w:abstractNumId="31" w15:restartNumberingAfterBreak="0">
     <w:nsid w:val="4CAE6E69"/>
     <w:multiLevelType w:val="hybridMultilevel"/>
     <w:tmpl w:val="0E4A8148"/>
@@ -9006,7 +9237,7 @@
       </w:rPr>
     </w:lvl>
   </w:abstractNum>
-  <w:abstractNum w:abstractNumId="29" w15:restartNumberingAfterBreak="0">
+  <w:abstractNum w:abstractNumId="32" w15:restartNumberingAfterBreak="0">
     <w:nsid w:val="52D0448A"/>
     <w:multiLevelType w:val="hybridMultilevel"/>
     <w:tmpl w:val="17D823EE"/>
@@ -9119,7 +9350,7 @@
       </w:rPr>
     </w:lvl>
   </w:abstractNum>
-  <w:abstractNum w:abstractNumId="30" w15:restartNumberingAfterBreak="0">
+  <w:abstractNum w:abstractNumId="33" w15:restartNumberingAfterBreak="0">
     <w:nsid w:val="55975563"/>
     <w:multiLevelType w:val="hybridMultilevel"/>
     <w:tmpl w:val="F5EE2CAE"/>
@@ -9232,7 +9463,7 @@
       </w:rPr>
     </w:lvl>
   </w:abstractNum>
-  <w:abstractNum w:abstractNumId="31" w15:restartNumberingAfterBreak="0">
+  <w:abstractNum w:abstractNumId="34" w15:restartNumberingAfterBreak="0">
     <w:nsid w:val="5BD54EFD"/>
     <w:multiLevelType w:val="hybridMultilevel"/>
     <w:tmpl w:val="0F1030CA"/>
@@ -9345,7 +9576,7 @@
       </w:rPr>
     </w:lvl>
   </w:abstractNum>
-  <w:abstractNum w:abstractNumId="32" w15:restartNumberingAfterBreak="0">
+  <w:abstractNum w:abstractNumId="35" w15:restartNumberingAfterBreak="0">
     <w:nsid w:val="5C340F92"/>
     <w:multiLevelType w:val="hybridMultilevel"/>
     <w:tmpl w:val="AA529710"/>
@@ -9457,7 +9688,7 @@
       </w:rPr>
     </w:lvl>
   </w:abstractNum>
-  <w:abstractNum w:abstractNumId="33" w15:restartNumberingAfterBreak="0">
+  <w:abstractNum w:abstractNumId="36" w15:restartNumberingAfterBreak="0">
     <w:nsid w:val="5EC56EDC"/>
     <w:multiLevelType w:val="hybridMultilevel"/>
     <w:tmpl w:val="10C21EE0"/>
@@ -9569,7 +9800,7 @@
       </w:rPr>
     </w:lvl>
   </w:abstractNum>
-  <w:abstractNum w:abstractNumId="34" w15:restartNumberingAfterBreak="0">
+  <w:abstractNum w:abstractNumId="37" w15:restartNumberingAfterBreak="0">
     <w:nsid w:val="62175FB6"/>
     <w:multiLevelType w:val="hybridMultilevel"/>
     <w:tmpl w:val="1772F19E"/>
@@ -9681,7 +9912,7 @@
       </w:rPr>
     </w:lvl>
   </w:abstractNum>
-  <w:abstractNum w:abstractNumId="35" w15:restartNumberingAfterBreak="0">
+  <w:abstractNum w:abstractNumId="38" w15:restartNumberingAfterBreak="0">
     <w:nsid w:val="6329582B"/>
     <w:multiLevelType w:val="hybridMultilevel"/>
     <w:tmpl w:val="5BC61120"/>
@@ -9794,7 +10025,7 @@
       </w:rPr>
     </w:lvl>
   </w:abstractNum>
-  <w:abstractNum w:abstractNumId="36" w15:restartNumberingAfterBreak="0">
+  <w:abstractNum w:abstractNumId="39" w15:restartNumberingAfterBreak="0">
     <w:nsid w:val="677657B3"/>
     <w:multiLevelType w:val="hybridMultilevel"/>
     <w:tmpl w:val="5524D014"/>
@@ -9907,7 +10138,7 @@
       </w:rPr>
     </w:lvl>
   </w:abstractNum>
-  <w:abstractNum w:abstractNumId="37" w15:restartNumberingAfterBreak="0">
+  <w:abstractNum w:abstractNumId="40" w15:restartNumberingAfterBreak="0">
     <w:nsid w:val="67F61E84"/>
     <w:multiLevelType w:val="hybridMultilevel"/>
     <w:tmpl w:val="430EF71E"/>
@@ -10020,7 +10251,7 @@
       </w:rPr>
     </w:lvl>
   </w:abstractNum>
-  <w:abstractNum w:abstractNumId="38" w15:restartNumberingAfterBreak="0">
+  <w:abstractNum w:abstractNumId="41" w15:restartNumberingAfterBreak="0">
     <w:nsid w:val="6B8D481B"/>
     <w:multiLevelType w:val="hybridMultilevel"/>
     <w:tmpl w:val="01149C52"/>
@@ -10133,7 +10364,7 @@
       </w:rPr>
     </w:lvl>
   </w:abstractNum>
-  <w:abstractNum w:abstractNumId="39" w15:restartNumberingAfterBreak="0">
+  <w:abstractNum w:abstractNumId="42" w15:restartNumberingAfterBreak="0">
     <w:nsid w:val="6E7267F1"/>
     <w:multiLevelType w:val="hybridMultilevel"/>
     <w:tmpl w:val="3432C5BC"/>
@@ -10245,7 +10476,7 @@
       </w:rPr>
     </w:lvl>
   </w:abstractNum>
-  <w:abstractNum w:abstractNumId="40" w15:restartNumberingAfterBreak="0">
+  <w:abstractNum w:abstractNumId="43" w15:restartNumberingAfterBreak="0">
     <w:nsid w:val="6FE57B32"/>
     <w:multiLevelType w:val="hybridMultilevel"/>
     <w:tmpl w:val="8F24FF80"/>
@@ -10357,7 +10588,7 @@
       </w:rPr>
     </w:lvl>
   </w:abstractNum>
-  <w:abstractNum w:abstractNumId="41" w15:restartNumberingAfterBreak="0">
+  <w:abstractNum w:abstractNumId="44" w15:restartNumberingAfterBreak="0">
     <w:nsid w:val="71F17535"/>
     <w:multiLevelType w:val="hybridMultilevel"/>
     <w:tmpl w:val="CDCED060"/>
@@ -10470,7 +10701,7 @@
       </w:rPr>
     </w:lvl>
   </w:abstractNum>
-  <w:abstractNum w:abstractNumId="42" w15:restartNumberingAfterBreak="0">
+  <w:abstractNum w:abstractNumId="45" w15:restartNumberingAfterBreak="0">
     <w:nsid w:val="75050389"/>
     <w:multiLevelType w:val="hybridMultilevel"/>
     <w:tmpl w:val="5D4490F8"/>
@@ -10584,135 +10815,144 @@
     </w:lvl>
   </w:abstractNum>
   <w:num w:numId="1" w16cid:durableId="2095737834">
+    <w:abstractNumId w:val="10"/>
+  </w:num>
+  <w:num w:numId="2" w16cid:durableId="1355763415">
+    <w:abstractNumId w:val="10"/>
+  </w:num>
+  <w:num w:numId="3" w16cid:durableId="627468108">
+    <w:abstractNumId w:val="35"/>
+  </w:num>
+  <w:num w:numId="4" w16cid:durableId="2147312317">
+    <w:abstractNumId w:val="26"/>
+  </w:num>
+  <w:num w:numId="5" w16cid:durableId="1468888951">
+    <w:abstractNumId w:val="41"/>
+  </w:num>
+  <w:num w:numId="6" w16cid:durableId="1505826805">
+    <w:abstractNumId w:val="32"/>
+  </w:num>
+  <w:num w:numId="7" w16cid:durableId="410201841">
+    <w:abstractNumId w:val="12"/>
+  </w:num>
+  <w:num w:numId="8" w16cid:durableId="177933021">
+    <w:abstractNumId w:val="38"/>
+  </w:num>
+  <w:num w:numId="9" w16cid:durableId="453066233">
+    <w:abstractNumId w:val="23"/>
+  </w:num>
+  <w:num w:numId="10" w16cid:durableId="308437867">
+    <w:abstractNumId w:val="25"/>
+  </w:num>
+  <w:num w:numId="11" w16cid:durableId="2044015130">
+    <w:abstractNumId w:val="37"/>
+  </w:num>
+  <w:num w:numId="12" w16cid:durableId="1894543432">
+    <w:abstractNumId w:val="3"/>
+  </w:num>
+  <w:num w:numId="13" w16cid:durableId="1145977386">
+    <w:abstractNumId w:val="11"/>
+  </w:num>
+  <w:num w:numId="14" w16cid:durableId="1105805891">
+    <w:abstractNumId w:val="24"/>
+  </w:num>
+  <w:num w:numId="15" w16cid:durableId="1910379217">
+    <w:abstractNumId w:val="17"/>
+  </w:num>
+  <w:num w:numId="16" w16cid:durableId="532619251">
+    <w:abstractNumId w:val="33"/>
+  </w:num>
+  <w:num w:numId="17" w16cid:durableId="483934593">
+    <w:abstractNumId w:val="14"/>
+  </w:num>
+  <w:num w:numId="18" w16cid:durableId="114177715">
+    <w:abstractNumId w:val="28"/>
+  </w:num>
+  <w:num w:numId="19" w16cid:durableId="1754081084">
+    <w:abstractNumId w:val="34"/>
+  </w:num>
+  <w:num w:numId="20" w16cid:durableId="1659842329">
+    <w:abstractNumId w:val="44"/>
+  </w:num>
+  <w:num w:numId="21" w16cid:durableId="163865201">
+    <w:abstractNumId w:val="8"/>
+  </w:num>
+  <w:num w:numId="22" w16cid:durableId="1701786197">
+    <w:abstractNumId w:val="22"/>
+  </w:num>
+  <w:num w:numId="23" w16cid:durableId="1258517052">
+    <w:abstractNumId w:val="16"/>
+  </w:num>
+  <w:num w:numId="24" w16cid:durableId="961375172">
+    <w:abstractNumId w:val="5"/>
+  </w:num>
+  <w:num w:numId="25" w16cid:durableId="1663504458">
+    <w:abstractNumId w:val="15"/>
+  </w:num>
+  <w:num w:numId="26" w16cid:durableId="307058015">
+    <w:abstractNumId w:val="39"/>
+  </w:num>
+  <w:num w:numId="27" w16cid:durableId="82074765">
+    <w:abstractNumId w:val="29"/>
+  </w:num>
+  <w:num w:numId="28" w16cid:durableId="231620995">
+    <w:abstractNumId w:val="42"/>
+  </w:num>
+  <w:num w:numId="29" w16cid:durableId="941106550">
+    <w:abstractNumId w:val="31"/>
+  </w:num>
+  <w:num w:numId="30" w16cid:durableId="1248537759">
+    <w:abstractNumId w:val="4"/>
+  </w:num>
+  <w:num w:numId="31" w16cid:durableId="113404857">
+    <w:abstractNumId w:val="30"/>
+  </w:num>
+  <w:num w:numId="32" w16cid:durableId="405617677">
     <w:abstractNumId w:val="9"/>
   </w:num>
-  <w:num w:numId="2" w16cid:durableId="1355763415">
-    <w:abstractNumId w:val="9"/>
-  </w:num>
-  <w:num w:numId="3" w16cid:durableId="627468108">
-    <w:abstractNumId w:val="32"/>
-  </w:num>
-  <w:num w:numId="4" w16cid:durableId="2147312317">
-    <w:abstractNumId w:val="23"/>
-  </w:num>
-  <w:num w:numId="5" w16cid:durableId="1468888951">
-    <w:abstractNumId w:val="38"/>
-  </w:num>
-  <w:num w:numId="6" w16cid:durableId="1505826805">
-    <w:abstractNumId w:val="29"/>
-  </w:num>
-  <w:num w:numId="7" w16cid:durableId="410201841">
-    <w:abstractNumId w:val="11"/>
-  </w:num>
-  <w:num w:numId="8" w16cid:durableId="177933021">
-    <w:abstractNumId w:val="35"/>
-  </w:num>
-  <w:num w:numId="9" w16cid:durableId="453066233">
+  <w:num w:numId="33" w16cid:durableId="667246042">
     <w:abstractNumId w:val="20"/>
   </w:num>
-  <w:num w:numId="10" w16cid:durableId="308437867">
-    <w:abstractNumId w:val="22"/>
+  <w:num w:numId="34" w16cid:durableId="763064616">
+    <w:abstractNumId w:val="36"/>
   </w:num>
-  <w:num w:numId="11" w16cid:durableId="2044015130">
-    <w:abstractNumId w:val="34"/>
+  <w:num w:numId="35" w16cid:durableId="481195516">
+    <w:abstractNumId w:val="13"/>
   </w:num>
-  <w:num w:numId="12" w16cid:durableId="1894543432">
+  <w:num w:numId="36" w16cid:durableId="1067534202">
+    <w:abstractNumId w:val="43"/>
+  </w:num>
+  <w:num w:numId="37" w16cid:durableId="1271402247">
+    <w:abstractNumId w:val="45"/>
+  </w:num>
+  <w:num w:numId="38" w16cid:durableId="1723824251">
+    <w:abstractNumId w:val="21"/>
+  </w:num>
+  <w:num w:numId="39" w16cid:durableId="545145559">
     <w:abstractNumId w:val="2"/>
   </w:num>
-  <w:num w:numId="13" w16cid:durableId="1145977386">
-    <w:abstractNumId w:val="10"/>
+  <w:num w:numId="40" w16cid:durableId="1538007799">
+    <w:abstractNumId w:val="40"/>
   </w:num>
-  <w:num w:numId="14" w16cid:durableId="1105805891">
-    <w:abstractNumId w:val="21"/>
+  <w:num w:numId="41" w16cid:durableId="151679100">
+    <w:abstractNumId w:val="6"/>
   </w:num>
-  <w:num w:numId="15" w16cid:durableId="1910379217">
-    <w:abstractNumId w:val="16"/>
-  </w:num>
-  <w:num w:numId="16" w16cid:durableId="532619251">
-    <w:abstractNumId w:val="30"/>
-  </w:num>
-  <w:num w:numId="17" w16cid:durableId="483934593">
-    <w:abstractNumId w:val="13"/>
-  </w:num>
-  <w:num w:numId="18" w16cid:durableId="114177715">
-    <w:abstractNumId w:val="25"/>
-  </w:num>
-  <w:num w:numId="19" w16cid:durableId="1754081084">
-    <w:abstractNumId w:val="31"/>
-  </w:num>
-  <w:num w:numId="20" w16cid:durableId="1659842329">
-    <w:abstractNumId w:val="41"/>
-  </w:num>
-  <w:num w:numId="21" w16cid:durableId="163865201">
+  <w:num w:numId="42" w16cid:durableId="3556738">
     <w:abstractNumId w:val="7"/>
   </w:num>
-  <w:num w:numId="22" w16cid:durableId="1701786197">
+  <w:num w:numId="43" w16cid:durableId="785393384">
+    <w:abstractNumId w:val="27"/>
+  </w:num>
+  <w:num w:numId="44" w16cid:durableId="993264226">
+    <w:abstractNumId w:val="1"/>
+  </w:num>
+  <w:num w:numId="45" w16cid:durableId="273287179">
     <w:abstractNumId w:val="19"/>
   </w:num>
-  <w:num w:numId="23" w16cid:durableId="1258517052">
-    <w:abstractNumId w:val="15"/>
-  </w:num>
-  <w:num w:numId="24" w16cid:durableId="961375172">
-    <w:abstractNumId w:val="4"/>
-  </w:num>
-  <w:num w:numId="25" w16cid:durableId="1663504458">
-    <w:abstractNumId w:val="14"/>
-  </w:num>
-  <w:num w:numId="26" w16cid:durableId="307058015">
-    <w:abstractNumId w:val="36"/>
-  </w:num>
-  <w:num w:numId="27" w16cid:durableId="82074765">
-    <w:abstractNumId w:val="26"/>
-  </w:num>
-  <w:num w:numId="28" w16cid:durableId="231620995">
-    <w:abstractNumId w:val="39"/>
-  </w:num>
-  <w:num w:numId="29" w16cid:durableId="941106550">
-    <w:abstractNumId w:val="28"/>
-  </w:num>
-  <w:num w:numId="30" w16cid:durableId="1248537759">
-    <w:abstractNumId w:val="3"/>
-  </w:num>
-  <w:num w:numId="31" w16cid:durableId="113404857">
-    <w:abstractNumId w:val="27"/>
-  </w:num>
-  <w:num w:numId="32" w16cid:durableId="405617677">
-    <w:abstractNumId w:val="8"/>
-  </w:num>
-  <w:num w:numId="33" w16cid:durableId="667246042">
-    <w:abstractNumId w:val="17"/>
-  </w:num>
-  <w:num w:numId="34" w16cid:durableId="763064616">
-    <w:abstractNumId w:val="33"/>
-  </w:num>
-  <w:num w:numId="35" w16cid:durableId="481195516">
-    <w:abstractNumId w:val="12"/>
-  </w:num>
-  <w:num w:numId="36" w16cid:durableId="1067534202">
-    <w:abstractNumId w:val="40"/>
-  </w:num>
-  <w:num w:numId="37" w16cid:durableId="1271402247">
-    <w:abstractNumId w:val="42"/>
-  </w:num>
-  <w:num w:numId="38" w16cid:durableId="1723824251">
+  <w:num w:numId="46" w16cid:durableId="213275907">
     <w:abstractNumId w:val="18"/>
   </w:num>
-  <w:num w:numId="39" w16cid:durableId="545145559">
-    <w:abstractNumId w:val="1"/>
-  </w:num>
-  <w:num w:numId="40" w16cid:durableId="1538007799">
-    <w:abstractNumId w:val="37"/>
-  </w:num>
-  <w:num w:numId="41" w16cid:durableId="151679100">
-    <w:abstractNumId w:val="5"/>
-  </w:num>
-  <w:num w:numId="42" w16cid:durableId="3556738">
-    <w:abstractNumId w:val="6"/>
-  </w:num>
-  <w:num w:numId="43" w16cid:durableId="785393384">
-    <w:abstractNumId w:val="24"/>
-  </w:num>
-  <w:num w:numId="44" w16cid:durableId="993264226">
+  <w:num w:numId="47" w16cid:durableId="1590310353">
     <w:abstractNumId w:val="0"/>
   </w:num>
 </w:numbering>
@@ -11377,7 +11617,6 @@
   <w:style w:type="character" w:default="1" w:styleId="DefaultParagraphFont">
     <w:name w:val="Default Paragraph Font"/>
     <w:uiPriority w:val="1"/>
-    <w:semiHidden/>
     <w:unhideWhenUsed/>
   </w:style>
   <w:style w:type="table" w:default="1" w:styleId="TableNormal">
@@ -12568,19 +12807,20 @@
 
 <file path=word/glossary/fontTable.xml><?xml version="1.0" encoding="utf-8"?>
 <w:fonts xmlns:mc="http://schemas.openxmlformats.org/markup-compatibility/2006" xmlns:r="http://schemas.openxmlformats.org/officeDocument/2006/relationships" xmlns:w="http://schemas.openxmlformats.org/wordprocessingml/2006/main" xmlns:w14="http://schemas.microsoft.com/office/word/2010/wordml" xmlns:w15="http://schemas.microsoft.com/office/word/2012/wordml" xmlns:w16cex="http://schemas.microsoft.com/office/word/2018/wordml/cex" xmlns:w16cid="http://schemas.microsoft.com/office/word/2016/wordml/cid" xmlns:w16="http://schemas.microsoft.com/office/word/2018/wordml" xmlns:w16du="http://schemas.microsoft.com/office/word/2023/wordml/word16du" xmlns:w16sdtdh="http://schemas.microsoft.com/office/word/2020/wordml/sdtdatahash" xmlns:w16sdtfl="http://schemas.microsoft.com/office/word/2024/wordml/sdtformatlock" xmlns:w16se="http://schemas.microsoft.com/office/word/2015/wordml/symex" mc:Ignorable="w14 w15 w16se w16cid w16 w16cex w16sdtdh w16sdtfl w16du">
-  <w:font w:name="Symbol">
-    <w:panose1 w:val="05050102010706020507"/>
-    <w:charset w:val="02"/>
-    <w:family w:val="roman"/>
-    <w:pitch w:val="variable"/>
-    <w:sig w:usb0="00000000" w:usb1="10000000" w:usb2="00000000" w:usb3="00000000" w:csb0="80000000" w:csb1="00000000"/>
-  </w:font>
   <w:font w:name="Times New Roman">
     <w:panose1 w:val="02020603050405020304"/>
     <w:charset w:val="00"/>
     <w:family w:val="roman"/>
     <w:pitch w:val="variable"/>
     <w:sig w:usb0="E0002EFF" w:usb1="C000785B" w:usb2="00000009" w:usb3="00000000" w:csb0="000001FF" w:csb1="00000000"/>
+  </w:font>
+  <w:font w:name="MS Mincho">
+    <w:altName w:val="ＭＳ 明朝"/>
+    <w:panose1 w:val="02020609040205080304"/>
+    <w:charset w:val="80"/>
+    <w:family w:val="modern"/>
+    <w:pitch w:val="fixed"/>
+    <w:sig w:usb0="E00002FF" w:usb1="6AC7FDFB" w:usb2="08000012" w:usb3="00000000" w:csb0="0002009F" w:csb1="00000000"/>
   </w:font>
   <w:font w:name="Courier New">
     <w:panose1 w:val="02070309020205020404"/>
@@ -12596,13 +12836,12 @@
     <w:pitch w:val="variable"/>
     <w:sig w:usb0="00000000" w:usb1="10000000" w:usb2="00000000" w:usb3="00000000" w:csb0="80000000" w:csb1="00000000"/>
   </w:font>
-  <w:font w:name="MS Mincho">
-    <w:altName w:val="ＭＳ 明朝"/>
-    <w:panose1 w:val="02020609040205080304"/>
-    <w:charset w:val="80"/>
-    <w:family w:val="modern"/>
-    <w:pitch w:val="fixed"/>
-    <w:sig w:usb0="E00002FF" w:usb1="6AC7FDFB" w:usb2="08000012" w:usb3="00000000" w:csb0="0002009F" w:csb1="00000000"/>
+  <w:font w:name="Symbol">
+    <w:panose1 w:val="05050102010706020507"/>
+    <w:charset w:val="02"/>
+    <w:family w:val="roman"/>
+    <w:pitch w:val="variable"/>
+    <w:sig w:usb0="00000000" w:usb1="10000000" w:usb2="00000000" w:usb3="00000000" w:csb0="80000000" w:csb1="00000000"/>
   </w:font>
   <w:font w:name="Calibri">
     <w:panose1 w:val="020F0502020204030204"/>
@@ -12713,6 +12952,7 @@
     <w:rsid w:val="008973D5"/>
     <w:rsid w:val="008C5FFD"/>
     <w:rsid w:val="00925352"/>
+    <w:rsid w:val="009540A5"/>
     <w:rsid w:val="00972ECE"/>
     <w:rsid w:val="00990BD7"/>
     <w:rsid w:val="00994A7B"/>
@@ -12722,6 +12962,7 @@
     <w:rsid w:val="00A16840"/>
     <w:rsid w:val="00A9316A"/>
     <w:rsid w:val="00AA3301"/>
+    <w:rsid w:val="00AE3127"/>
     <w:rsid w:val="00AF507F"/>
     <w:rsid w:val="00B06229"/>
     <w:rsid w:val="00B279BC"/>
@@ -13526,18 +13767,32 @@
 </file>
 
 <file path=customXml/item1.xml><?xml version="1.0" encoding="utf-8"?>
-<p:properties xmlns:p="http://schemas.microsoft.com/office/2006/metadata/properties" xmlns:xsi="http://www.w3.org/2001/XMLSchema-instance" xmlns:pc="http://schemas.microsoft.com/office/infopath/2007/PartnerControls">
-  <documentManagement>
-    <TaxCatchAll xmlns="4de74af2-d2a7-4bc3-a319-420167317553" xsi:nil="true"/>
-    <ArchiverLinkFileType xmlns="c0991f74-233a-4c46-9c55-a176f0e8ba44" xsi:nil="true"/>
-    <lcf76f155ced4ddcb4097134ff3c332f xmlns="c0991f74-233a-4c46-9c55-a176f0e8ba44">
-      <Terms xmlns="http://schemas.microsoft.com/office/infopath/2007/PartnerControls"/>
-    </lcf76f155ced4ddcb4097134ff3c332f>
-  </documentManagement>
-</p:properties>
+<b:Sources xmlns:b="http://schemas.openxmlformats.org/officeDocument/2006/bibliography" xmlns="http://schemas.openxmlformats.org/officeDocument/2006/bibliography" SelectedStyle="/IEEE2006OfficeOnline.xsl" StyleName="IEEE" Version="2006">
+  <b:Source>
+    <b:Tag>Placeholder1</b:Tag>
+    <b:SourceType>Book</b:SourceType>
+    <b:Guid>{61C2BEB0-04B1-424E-AEC0-322EDBD1A18A}</b:Guid>
+    <b:RefOrder>2</b:RefOrder>
+  </b:Source>
+  <b:Source>
+    <b:Tag>Placeholder2</b:Tag>
+    <b:SourceType>Book</b:SourceType>
+    <b:Guid>{26E93F14-F601-D04A-A10D-E3BC3760B577}</b:Guid>
+    <b:RefOrder>1</b:RefOrder>
+  </b:Source>
+</b:Sources>
 </file>
 
 <file path=customXml/item2.xml><?xml version="1.0" encoding="utf-8"?>
+<?mso-contentType ?>
+<FormTemplates xmlns="http://schemas.microsoft.com/sharepoint/v3/contenttype/forms">
+  <Display>DocumentLibraryForm</Display>
+  <Edit>DocumentLibraryForm</Edit>
+  <New>DocumentLibraryForm</New>
+</FormTemplates>
+</file>
+
+<file path=customXml/item3.xml><?xml version="1.0" encoding="utf-8"?>
 <ct:contentTypeSchema xmlns:ct="http://schemas.microsoft.com/office/2006/metadata/contentType" xmlns:ma="http://schemas.microsoft.com/office/2006/metadata/properties/metaAttributes" ct:_="" ma:_="" ma:contentTypeName="Dokument" ma:contentTypeID="0x0101003A15E957932D6F4AB4FD28F85AF4FFD8" ma:contentTypeVersion="14" ma:contentTypeDescription="Ein neues Dokument erstellen." ma:contentTypeScope="" ma:versionID="e040dc8dbf4a4132031beaaf90e02bdd">
   <xsd:schema xmlns:xsd="http://www.w3.org/2001/XMLSchema" xmlns:xs="http://www.w3.org/2001/XMLSchema" xmlns:p="http://schemas.microsoft.com/office/2006/metadata/properties" xmlns:ns2="c0991f74-233a-4c46-9c55-a176f0e8ba44" xmlns:ns3="4de74af2-d2a7-4bc3-a319-420167317553" targetNamespace="http://schemas.microsoft.com/office/2006/metadata/properties" ma:root="true" ma:fieldsID="63fe477e893c7cf9e00d7d25e31408c1" ns2:_="" ns3:_="">
     <xsd:import namespace="c0991f74-233a-4c46-9c55-a176f0e8ba44"/>
@@ -13766,44 +14021,35 @@
 </ct:contentTypeSchema>
 </file>
 
-<file path=customXml/item3.xml><?xml version="1.0" encoding="utf-8"?>
-<?mso-contentType ?>
-<FormTemplates xmlns="http://schemas.microsoft.com/sharepoint/v3/contenttype/forms">
-  <Display>DocumentLibraryForm</Display>
-  <Edit>DocumentLibraryForm</Edit>
-  <New>DocumentLibraryForm</New>
-</FormTemplates>
-</file>
-
 <file path=customXml/item4.xml><?xml version="1.0" encoding="utf-8"?>
-<b:Sources xmlns:b="http://schemas.openxmlformats.org/officeDocument/2006/bibliography" xmlns="http://schemas.openxmlformats.org/officeDocument/2006/bibliography" SelectedStyle="/IEEE2006OfficeOnline.xsl" StyleName="IEEE" Version="2006">
-  <b:Source>
-    <b:Tag>Placeholder1</b:Tag>
-    <b:SourceType>Book</b:SourceType>
-    <b:Guid>{61C2BEB0-04B1-424E-AEC0-322EDBD1A18A}</b:Guid>
-    <b:RefOrder>2</b:RefOrder>
-  </b:Source>
-  <b:Source>
-    <b:Tag>Placeholder2</b:Tag>
-    <b:SourceType>Book</b:SourceType>
-    <b:Guid>{26E93F14-F601-D04A-A10D-E3BC3760B577}</b:Guid>
-    <b:RefOrder>1</b:RefOrder>
-  </b:Source>
-</b:Sources>
+<p:properties xmlns:p="http://schemas.microsoft.com/office/2006/metadata/properties" xmlns:xsi="http://www.w3.org/2001/XMLSchema-instance" xmlns:pc="http://schemas.microsoft.com/office/infopath/2007/PartnerControls">
+  <documentManagement>
+    <TaxCatchAll xmlns="4de74af2-d2a7-4bc3-a319-420167317553" xsi:nil="true"/>
+    <ArchiverLinkFileType xmlns="c0991f74-233a-4c46-9c55-a176f0e8ba44" xsi:nil="true"/>
+    <lcf76f155ced4ddcb4097134ff3c332f xmlns="c0991f74-233a-4c46-9c55-a176f0e8ba44">
+      <Terms xmlns="http://schemas.microsoft.com/office/infopath/2007/PartnerControls"/>
+    </lcf76f155ced4ddcb4097134ff3c332f>
+  </documentManagement>
+</p:properties>
 </file>
 
 <file path=customXml/itemProps1.xml><?xml version="1.0" encoding="utf-8"?>
-<ds:datastoreItem xmlns:ds="http://schemas.openxmlformats.org/officeDocument/2006/customXml" ds:itemID="{5DB99EA3-5A91-4DE8-9C2E-5E2756FB8116}">
+<ds:datastoreItem xmlns:ds="http://schemas.openxmlformats.org/officeDocument/2006/customXml" ds:itemID="{8ED87741-333E-524C-B42D-A34782CE569A}">
   <ds:schemaRefs>
-    <ds:schemaRef ds:uri="http://schemas.microsoft.com/office/2006/metadata/properties"/>
-    <ds:schemaRef ds:uri="http://schemas.microsoft.com/office/infopath/2007/PartnerControls"/>
-    <ds:schemaRef ds:uri="4de74af2-d2a7-4bc3-a319-420167317553"/>
-    <ds:schemaRef ds:uri="c0991f74-233a-4c46-9c55-a176f0e8ba44"/>
+    <ds:schemaRef ds:uri="http://schemas.openxmlformats.org/officeDocument/2006/bibliography"/>
   </ds:schemaRefs>
 </ds:datastoreItem>
 </file>
 
 <file path=customXml/itemProps2.xml><?xml version="1.0" encoding="utf-8"?>
+<ds:datastoreItem xmlns:ds="http://schemas.openxmlformats.org/officeDocument/2006/customXml" ds:itemID="{123745DA-69E4-464B-8AAF-512AB146EAEF}">
+  <ds:schemaRefs>
+    <ds:schemaRef ds:uri="http://schemas.microsoft.com/sharepoint/v3/contenttype/forms"/>
+  </ds:schemaRefs>
+</ds:datastoreItem>
+</file>
+
+<file path=customXml/itemProps3.xml><?xml version="1.0" encoding="utf-8"?>
 <ds:datastoreItem xmlns:ds="http://schemas.openxmlformats.org/officeDocument/2006/customXml" ds:itemID="{DB59158D-15C5-4DFF-AEB5-CA02C610712D}">
   <ds:schemaRefs>
     <ds:schemaRef ds:uri="http://schemas.microsoft.com/office/2006/metadata/contentType"/>
@@ -13822,18 +14068,13 @@
 </ds:datastoreItem>
 </file>
 
-<file path=customXml/itemProps3.xml><?xml version="1.0" encoding="utf-8"?>
-<ds:datastoreItem xmlns:ds="http://schemas.openxmlformats.org/officeDocument/2006/customXml" ds:itemID="{123745DA-69E4-464B-8AAF-512AB146EAEF}">
+<file path=customXml/itemProps4.xml><?xml version="1.0" encoding="utf-8"?>
+<ds:datastoreItem xmlns:ds="http://schemas.openxmlformats.org/officeDocument/2006/customXml" ds:itemID="{5DB99EA3-5A91-4DE8-9C2E-5E2756FB8116}">
   <ds:schemaRefs>
-    <ds:schemaRef ds:uri="http://schemas.microsoft.com/sharepoint/v3/contenttype/forms"/>
-  </ds:schemaRefs>
-</ds:datastoreItem>
-</file>
-
-<file path=customXml/itemProps4.xml><?xml version="1.0" encoding="utf-8"?>
-<ds:datastoreItem xmlns:ds="http://schemas.openxmlformats.org/officeDocument/2006/customXml" ds:itemID="{8ED87741-333E-524C-B42D-A34782CE569A}">
-  <ds:schemaRefs>
-    <ds:schemaRef ds:uri="http://schemas.openxmlformats.org/officeDocument/2006/bibliography"/>
+    <ds:schemaRef ds:uri="http://schemas.microsoft.com/office/2006/metadata/properties"/>
+    <ds:schemaRef ds:uri="http://schemas.microsoft.com/office/infopath/2007/PartnerControls"/>
+    <ds:schemaRef ds:uri="4de74af2-d2a7-4bc3-a319-420167317553"/>
+    <ds:schemaRef ds:uri="c0991f74-233a-4c46-9c55-a176f0e8ba44"/>
   </ds:schemaRefs>
 </ds:datastoreItem>
 </file>
</xml_diff>

<commit_message>
finished writing ptx chapter 2 section raw draft
</commit_message>
<xml_diff>
--- a/Thesis Report Rafi.docx
+++ b/Thesis Report Rafi.docx
@@ -1730,36 +1730,175 @@
     <w:p/>
     <w:p>
       <w:r>
-        <w:t xml:space="preserve">For the hydrogen pathway, </w:t>
-      </w:r>
-    </w:p>
-    <w:p>
-      <w:pPr>
-        <w:pStyle w:val="ListParagraph"/>
-        <w:numPr>
-          <w:ilvl w:val="0"/>
-          <w:numId w:val="47"/>
-        </w:numPr>
-      </w:pPr>
-      <w:r>
-        <w:t>SOEC is good for heat integaration and efficiency but not good for renewables coupling</w:t>
-      </w:r>
-    </w:p>
-    <w:p>
-      <w:pPr>
-        <w:pStyle w:val="ListParagraph"/>
-        <w:numPr>
-          <w:ilvl w:val="0"/>
-          <w:numId w:val="47"/>
-        </w:numPr>
-      </w:pPr>
+        <w:t xml:space="preserve">The hydrogen pathway starts with splitting water into hydrogen and oxygen in a electrochemical process by utilizing an electrolyzer. </w:t>
+      </w:r>
+      <w:r>
+        <w:t xml:space="preserve">Many literature points out to Solid Oxide Electrolyzer Cell (SOEC) as a good selection for a power-to-methanol plant. SOEC high temperature environment </w:t>
+      </w:r>
+      <w:r>
+        <w:lastRenderedPageBreak/>
+        <w:t xml:space="preserve">allows the ability to </w:t>
+      </w:r>
+      <w:r>
+        <w:t>use heat and oxygen integration that low-temperature systems do not exploit as well</w:t>
+      </w:r>
+      <w:r>
+        <w:t xml:space="preserve">, which can increase energy efficiency of the entire plant. </w:t>
+      </w:r>
+      <w:r>
+        <w:t>However, there is a significant downside in the long-term stack durability, technology maturaty, and limited dynamicity, which is crucial when coupled with variable renewable energy [</w:t>
+      </w:r>
+      <w:r>
+        <w:t>https://doi.org/10.1016/j.apenergy.2020.115113</w:t>
+      </w:r>
+      <w:r>
+        <w:t>]. One techno-economic comparison of electroylzer technologies in power-to-methanol says alaklaine routes are reasonable for shot. To mid – term realization, while SOE</w:t>
+      </w:r>
+      <w:r>
+        <w:t>C</w:t>
+      </w:r>
+      <w:r>
+        <w:t xml:space="preserve"> is more of a mid- to long-term option. The main upside of low-temperature</w:t>
+      </w:r>
+      <w:r>
+        <w:t xml:space="preserve"> electrolyzer technololgies such as Alkaline Water Electrolyzer (AWE) and PEM (Proton Exchange Membrane) Electrolyzer is that they have operational maturatiy and significantly superior load-following range, which is integral for renewables coupling, while giving up heat-integration and co-electrolyzsis upside from SOEC [</w:t>
+      </w:r>
+      <w:r>
+        <w:t>https://doi.org/10.1016/j.ijhydene.2026.153394</w:t>
+      </w:r>
+      <w:r>
+        <w:t>].</w:t>
+      </w:r>
+      <w:r>
+        <w:t xml:space="preserve"> </w:t>
+      </w:r>
+    </w:p>
+    <w:p/>
+    <w:p>
+      <w:r>
+        <w:t xml:space="preserve">Then, as mentioned, electrolyzer produces hydrogen and oxygen; hydrogen gets compressed and goes to the methanol synthesis reactor and oxygen is used as a feed for Autothermal Reformer (ATR) to reform methano to produce syngas. Both biomass and hydrogen pathway then meet in the methanol reactor to synthesize methanol. </w:t>
+      </w:r>
+    </w:p>
+    <w:p/>
+    <w:p>
+      <w:r>
+        <w:t xml:space="preserve">The hybrid approach to produce methanol is attractice because of the higher carbon utilization and better use of the biomass resource. One study </w:t>
+      </w:r>
+      <w:r>
+        <w:t>found hybrid production reaches 89.8% carbon utilization and 85.8% overall efficiency, and can produce 101% more methano per biomass ton than conventional biomass-to-methanol baseline [</w:t>
+      </w:r>
+      <w:r>
+        <w:t>https://dx.doi.org/10.2139/ssrn.4184476</w:t>
+      </w:r>
+      <w:r>
+        <w:t xml:space="preserve">]. </w:t>
+      </w:r>
+      <w:r>
+        <w:t>Another found that a state-of-the-art biomass-to-methanol case sits at 53.3% efficiency with a 4.8-year payback, while full carbon conversion with electrolysis rises to 64.5–66.0% efficiency, so the hybrid can improve thermodynamics even when the economics worsen</w:t>
+      </w:r>
+      <w:r>
+        <w:t xml:space="preserve"> [</w:t>
+      </w:r>
+      <w:r>
+        <w:t>https://doi.org/10.1016/j.apenergy.2019.114071</w:t>
+      </w:r>
+      <w:r>
+        <w:t>]</w:t>
+      </w:r>
+      <w:r>
+        <w:t>. In favorable electricity-price windows</w:t>
+      </w:r>
+      <w:r>
+        <w:t>,</w:t>
+      </w:r>
+      <w:r>
+        <w:t xml:space="preserve"> </w:t>
+      </w:r>
+      <w:r>
+        <w:t>a</w:t>
+      </w:r>
+      <w:r>
+        <w:t xml:space="preserve"> flexible plant can also earn value from changing power prices instead of running at a fixed load</w:t>
+      </w:r>
+      <w:r>
+        <w:t xml:space="preserve"> [</w:t>
+      </w:r>
+      <w:r>
+        <w:t>https://doi.org/10.1016/j.fuel.2021.122113</w:t>
+      </w:r>
+      <w:r>
+        <w:t>]</w:t>
+      </w:r>
+      <w:r>
+        <w:t>.</w:t>
+      </w:r>
+    </w:p>
+    <w:p/>
+    <w:p>
+      <w:r>
+        <w:t xml:space="preserve">Despite the benefits of the hzbrid system, some papers also point out main bottlenecks that challenge the feasibility of the hybrid plant. These bottlenecks touch on the topic of electrolyzer </w:t>
+      </w:r>
+      <w:r>
+        <w:lastRenderedPageBreak/>
+        <w:t xml:space="preserve">utilization, electricity price, stack cost, stack lifetime, and the integration of oxygen and heat streams. One study asserts that high electrolysis capacity factor is needed for </w:t>
+      </w:r>
+      <w:r>
+        <w:t>competitive</w:t>
+      </w:r>
+      <w:r>
+        <w:t xml:space="preserve"> e-MeOH, and the full-carbon-</w:t>
+      </w:r>
+      <w:r>
+        <w:t>conversion</w:t>
+      </w:r>
+      <w:r>
+        <w:t xml:space="preserve"> case only becomes </w:t>
+      </w:r>
+      <w:r>
+        <w:t>attractive</w:t>
+      </w:r>
+      <w:r>
+        <w:t xml:space="preserve"> if stack cost, electricity price, and lifetime all improve [</w:t>
+      </w:r>
+      <w:r>
+        <w:t>https://doi.org/10.1016/j.fuel.2021.122113</w:t>
+      </w:r>
+      <w:r>
+        <w:t>]. Oxygen handling is another practical blocker, because direct gasification can avoid large oxygen storage, which improves capex and safety, but only if the plant and the gasifiers oxygen demand match [</w:t>
+      </w:r>
+      <w:r>
+        <w:t>https://doi.org/10.3389/fenrg.2021.795673</w:t>
+      </w:r>
+      <w:r>
+        <w:t>].</w:t>
+      </w:r>
+      <w:r>
+        <w:t xml:space="preserve"> </w:t>
+      </w:r>
+    </w:p>
+    <w:p/>
+    <w:p>
+      <w:r>
+        <w:t>To address these challenges, it is then crucial to adopt an optimization strategy in order to maximize methanol yield and operational efficiency while minimizing the total cost of the plan. One paper did a study on optimizing the reactor of the Methanol synthesis for a power and biomass to methanol (PBtM) plant and the result shoed 20% cost reduction in e-MeOH cost [</w:t>
+      </w:r>
+      <w:r>
+        <w:t>https://doi.org/10.1016/j.fuel.2021.122113</w:t>
+      </w:r>
+      <w:r>
+        <w:t xml:space="preserve">]. Now this takes into account only optimization of one component, it is then intuitive to imagine a significant price reduction on an optimization on a plant level. This makes optimization the bridge between a technically plausible plant and one that can survive real electricity prices, real stack degradation, and real-scale capex. </w:t>
+      </w:r>
+    </w:p>
+    <w:p/>
+    <w:p>
+      <w:r>
+        <w:t xml:space="preserve"> </w:t>
+      </w:r>
     </w:p>
     <w:p>
       <w:pPr>
         <w:pStyle w:val="Heading2"/>
       </w:pPr>
       <w:r>
-        <w:lastRenderedPageBreak/>
         <w:t>MILP for Complex Polygeneration System</w:t>
       </w:r>
     </w:p>
@@ -1937,6 +2076,7 @@
         </w:numPr>
       </w:pPr>
       <w:r>
+        <w:lastRenderedPageBreak/>
         <w:t>Equation of sum of reward</w:t>
       </w:r>
     </w:p>
@@ -2396,7 +2536,6 @@
     </w:p>
     <w:p>
       <w:r>
-        <w:lastRenderedPageBreak/>
         <w:t xml:space="preserve">Modelling an accurate </w:t>
       </w:r>
       <w:r>
@@ -2538,7 +2677,11 @@
         <w:t xml:space="preserve">. This algorithm excels in </w:t>
       </w:r>
       <w:r>
-        <w:t>controlling and optimizing discrete choices but not continuous ones</w:t>
+        <w:t xml:space="preserve">controlling and optimizing discrete choices but not </w:t>
+      </w:r>
+      <w:r>
+        <w:lastRenderedPageBreak/>
+        <w:t>continuous ones</w:t>
       </w:r>
       <w:r>
         <w:t xml:space="preserve"> </w:t>
@@ -2718,7 +2861,6 @@
         <w:pStyle w:val="Heading2"/>
       </w:pPr>
       <w:r>
-        <w:lastRenderedPageBreak/>
         <w:t>RL vs MILP for Different Applications</w:t>
       </w:r>
     </w:p>
@@ -2945,7 +3087,14 @@
         <w:rPr>
           <w:color w:val="000000"/>
         </w:rPr>
-        <w:t>This is due to the fact that RL</w:t>
+        <w:t xml:space="preserve">This is due to the </w:t>
+      </w:r>
+      <w:r>
+        <w:rPr>
+          <w:color w:val="000000"/>
+        </w:rPr>
+        <w:lastRenderedPageBreak/>
+        <w:t>fact that RL</w:t>
       </w:r>
       <w:r>
         <w:rPr>
@@ -3211,14 +3360,7 @@
         <w:rPr>
           <w:color w:val="000000"/>
         </w:rPr>
-        <w:t xml:space="preserve">how important the modelling phase </w:t>
-      </w:r>
-      <w:r>
-        <w:rPr>
-          <w:color w:val="000000"/>
-        </w:rPr>
-        <w:lastRenderedPageBreak/>
-        <w:t>and identical assumption are for a fair comparison.</w:t>
+        <w:t>how important the modelling phase and identical assumption are for a fair comparison.</w:t>
       </w:r>
       <w:r>
         <w:rPr>
@@ -12928,6 +13070,7 @@
     <w:rsid w:val="00364EE5"/>
     <w:rsid w:val="003834D4"/>
     <w:rsid w:val="00387AFB"/>
+    <w:rsid w:val="003A3213"/>
     <w:rsid w:val="003A41B9"/>
     <w:rsid w:val="004A039B"/>
     <w:rsid w:val="004A3857"/>
@@ -12946,6 +13089,7 @@
     <w:rsid w:val="00737891"/>
     <w:rsid w:val="00770EC1"/>
     <w:rsid w:val="00806D95"/>
+    <w:rsid w:val="00846521"/>
     <w:rsid w:val="00862D9B"/>
     <w:rsid w:val="00867ADA"/>
     <w:rsid w:val="00874878"/>
@@ -13767,32 +13911,18 @@
 </file>
 
 <file path=customXml/item1.xml><?xml version="1.0" encoding="utf-8"?>
-<b:Sources xmlns:b="http://schemas.openxmlformats.org/officeDocument/2006/bibliography" xmlns="http://schemas.openxmlformats.org/officeDocument/2006/bibliography" SelectedStyle="/IEEE2006OfficeOnline.xsl" StyleName="IEEE" Version="2006">
-  <b:Source>
-    <b:Tag>Placeholder1</b:Tag>
-    <b:SourceType>Book</b:SourceType>
-    <b:Guid>{61C2BEB0-04B1-424E-AEC0-322EDBD1A18A}</b:Guid>
-    <b:RefOrder>2</b:RefOrder>
-  </b:Source>
-  <b:Source>
-    <b:Tag>Placeholder2</b:Tag>
-    <b:SourceType>Book</b:SourceType>
-    <b:Guid>{26E93F14-F601-D04A-A10D-E3BC3760B577}</b:Guid>
-    <b:RefOrder>1</b:RefOrder>
-  </b:Source>
-</b:Sources>
+<p:properties xmlns:p="http://schemas.microsoft.com/office/2006/metadata/properties" xmlns:xsi="http://www.w3.org/2001/XMLSchema-instance" xmlns:pc="http://schemas.microsoft.com/office/infopath/2007/PartnerControls">
+  <documentManagement>
+    <TaxCatchAll xmlns="4de74af2-d2a7-4bc3-a319-420167317553" xsi:nil="true"/>
+    <ArchiverLinkFileType xmlns="c0991f74-233a-4c46-9c55-a176f0e8ba44" xsi:nil="true"/>
+    <lcf76f155ced4ddcb4097134ff3c332f xmlns="c0991f74-233a-4c46-9c55-a176f0e8ba44">
+      <Terms xmlns="http://schemas.microsoft.com/office/infopath/2007/PartnerControls"/>
+    </lcf76f155ced4ddcb4097134ff3c332f>
+  </documentManagement>
+</p:properties>
 </file>
 
 <file path=customXml/item2.xml><?xml version="1.0" encoding="utf-8"?>
-<?mso-contentType ?>
-<FormTemplates xmlns="http://schemas.microsoft.com/sharepoint/v3/contenttype/forms">
-  <Display>DocumentLibraryForm</Display>
-  <Edit>DocumentLibraryForm</Edit>
-  <New>DocumentLibraryForm</New>
-</FormTemplates>
-</file>
-
-<file path=customXml/item3.xml><?xml version="1.0" encoding="utf-8"?>
 <ct:contentTypeSchema xmlns:ct="http://schemas.microsoft.com/office/2006/metadata/contentType" xmlns:ma="http://schemas.microsoft.com/office/2006/metadata/properties/metaAttributes" ct:_="" ma:_="" ma:contentTypeName="Dokument" ma:contentTypeID="0x0101003A15E957932D6F4AB4FD28F85AF4FFD8" ma:contentTypeVersion="14" ma:contentTypeDescription="Ein neues Dokument erstellen." ma:contentTypeScope="" ma:versionID="e040dc8dbf4a4132031beaaf90e02bdd">
   <xsd:schema xmlns:xsd="http://www.w3.org/2001/XMLSchema" xmlns:xs="http://www.w3.org/2001/XMLSchema" xmlns:p="http://schemas.microsoft.com/office/2006/metadata/properties" xmlns:ns2="c0991f74-233a-4c46-9c55-a176f0e8ba44" xmlns:ns3="4de74af2-d2a7-4bc3-a319-420167317553" targetNamespace="http://schemas.microsoft.com/office/2006/metadata/properties" ma:root="true" ma:fieldsID="63fe477e893c7cf9e00d7d25e31408c1" ns2:_="" ns3:_="">
     <xsd:import namespace="c0991f74-233a-4c46-9c55-a176f0e8ba44"/>
@@ -14021,35 +14151,44 @@
 </ct:contentTypeSchema>
 </file>
 
+<file path=customXml/item3.xml><?xml version="1.0" encoding="utf-8"?>
+<?mso-contentType ?>
+<FormTemplates xmlns="http://schemas.microsoft.com/sharepoint/v3/contenttype/forms">
+  <Display>DocumentLibraryForm</Display>
+  <Edit>DocumentLibraryForm</Edit>
+  <New>DocumentLibraryForm</New>
+</FormTemplates>
+</file>
+
 <file path=customXml/item4.xml><?xml version="1.0" encoding="utf-8"?>
-<p:properties xmlns:p="http://schemas.microsoft.com/office/2006/metadata/properties" xmlns:xsi="http://www.w3.org/2001/XMLSchema-instance" xmlns:pc="http://schemas.microsoft.com/office/infopath/2007/PartnerControls">
-  <documentManagement>
-    <TaxCatchAll xmlns="4de74af2-d2a7-4bc3-a319-420167317553" xsi:nil="true"/>
-    <ArchiverLinkFileType xmlns="c0991f74-233a-4c46-9c55-a176f0e8ba44" xsi:nil="true"/>
-    <lcf76f155ced4ddcb4097134ff3c332f xmlns="c0991f74-233a-4c46-9c55-a176f0e8ba44">
-      <Terms xmlns="http://schemas.microsoft.com/office/infopath/2007/PartnerControls"/>
-    </lcf76f155ced4ddcb4097134ff3c332f>
-  </documentManagement>
-</p:properties>
+<b:Sources xmlns:b="http://schemas.openxmlformats.org/officeDocument/2006/bibliography" xmlns="http://schemas.openxmlformats.org/officeDocument/2006/bibliography" SelectedStyle="/IEEE2006OfficeOnline.xsl" StyleName="IEEE" Version="2006">
+  <b:Source>
+    <b:Tag>Placeholder1</b:Tag>
+    <b:SourceType>Book</b:SourceType>
+    <b:Guid>{61C2BEB0-04B1-424E-AEC0-322EDBD1A18A}</b:Guid>
+    <b:RefOrder>2</b:RefOrder>
+  </b:Source>
+  <b:Source>
+    <b:Tag>Placeholder2</b:Tag>
+    <b:SourceType>Book</b:SourceType>
+    <b:Guid>{26E93F14-F601-D04A-A10D-E3BC3760B577}</b:Guid>
+    <b:RefOrder>1</b:RefOrder>
+  </b:Source>
+</b:Sources>
 </file>
 
 <file path=customXml/itemProps1.xml><?xml version="1.0" encoding="utf-8"?>
-<ds:datastoreItem xmlns:ds="http://schemas.openxmlformats.org/officeDocument/2006/customXml" ds:itemID="{8ED87741-333E-524C-B42D-A34782CE569A}">
+<ds:datastoreItem xmlns:ds="http://schemas.openxmlformats.org/officeDocument/2006/customXml" ds:itemID="{5DB99EA3-5A91-4DE8-9C2E-5E2756FB8116}">
   <ds:schemaRefs>
-    <ds:schemaRef ds:uri="http://schemas.openxmlformats.org/officeDocument/2006/bibliography"/>
+    <ds:schemaRef ds:uri="http://schemas.microsoft.com/office/2006/metadata/properties"/>
+    <ds:schemaRef ds:uri="http://schemas.microsoft.com/office/infopath/2007/PartnerControls"/>
+    <ds:schemaRef ds:uri="4de74af2-d2a7-4bc3-a319-420167317553"/>
+    <ds:schemaRef ds:uri="c0991f74-233a-4c46-9c55-a176f0e8ba44"/>
   </ds:schemaRefs>
 </ds:datastoreItem>
 </file>
 
 <file path=customXml/itemProps2.xml><?xml version="1.0" encoding="utf-8"?>
-<ds:datastoreItem xmlns:ds="http://schemas.openxmlformats.org/officeDocument/2006/customXml" ds:itemID="{123745DA-69E4-464B-8AAF-512AB146EAEF}">
-  <ds:schemaRefs>
-    <ds:schemaRef ds:uri="http://schemas.microsoft.com/sharepoint/v3/contenttype/forms"/>
-  </ds:schemaRefs>
-</ds:datastoreItem>
-</file>
-
-<file path=customXml/itemProps3.xml><?xml version="1.0" encoding="utf-8"?>
 <ds:datastoreItem xmlns:ds="http://schemas.openxmlformats.org/officeDocument/2006/customXml" ds:itemID="{DB59158D-15C5-4DFF-AEB5-CA02C610712D}">
   <ds:schemaRefs>
     <ds:schemaRef ds:uri="http://schemas.microsoft.com/office/2006/metadata/contentType"/>
@@ -14068,13 +14207,18 @@
 </ds:datastoreItem>
 </file>
 
+<file path=customXml/itemProps3.xml><?xml version="1.0" encoding="utf-8"?>
+<ds:datastoreItem xmlns:ds="http://schemas.openxmlformats.org/officeDocument/2006/customXml" ds:itemID="{123745DA-69E4-464B-8AAF-512AB146EAEF}">
+  <ds:schemaRefs>
+    <ds:schemaRef ds:uri="http://schemas.microsoft.com/sharepoint/v3/contenttype/forms"/>
+  </ds:schemaRefs>
+</ds:datastoreItem>
+</file>
+
 <file path=customXml/itemProps4.xml><?xml version="1.0" encoding="utf-8"?>
-<ds:datastoreItem xmlns:ds="http://schemas.openxmlformats.org/officeDocument/2006/customXml" ds:itemID="{5DB99EA3-5A91-4DE8-9C2E-5E2756FB8116}">
+<ds:datastoreItem xmlns:ds="http://schemas.openxmlformats.org/officeDocument/2006/customXml" ds:itemID="{8ED87741-333E-524C-B42D-A34782CE569A}">
   <ds:schemaRefs>
-    <ds:schemaRef ds:uri="http://schemas.microsoft.com/office/2006/metadata/properties"/>
-    <ds:schemaRef ds:uri="http://schemas.microsoft.com/office/infopath/2007/PartnerControls"/>
-    <ds:schemaRef ds:uri="4de74af2-d2a7-4bc3-a319-420167317553"/>
-    <ds:schemaRef ds:uri="c0991f74-233a-4c46-9c55-a176f0e8ba44"/>
+    <ds:schemaRef ds:uri="http://schemas.openxmlformats.org/officeDocument/2006/bibliography"/>
   </ds:schemaRefs>
 </ds:datastoreItem>
 </file>
</xml_diff>

<commit_message>
polished the previously commited section
</commit_message>
<xml_diff>
--- a/Thesis Report Rafi.docx
+++ b/Thesis Report Rafi.docx
@@ -1641,267 +1641,90 @@
       </w:r>
     </w:p>
     <w:p>
-      <w:pPr>
-        <w:pStyle w:val="ListParagraph"/>
-        <w:numPr>
-          <w:ilvl w:val="0"/>
-          <w:numId w:val="46"/>
-        </w:numPr>
-      </w:pPr>
-      <w:r>
-        <w:t>What the the hybrid biomass and power to methanol actually mean</w:t>
-      </w:r>
-    </w:p>
-    <w:p>
-      <w:pPr>
-        <w:pStyle w:val="ListParagraph"/>
-        <w:numPr>
-          <w:ilvl w:val="0"/>
-          <w:numId w:val="46"/>
-        </w:numPr>
-      </w:pPr>
-      <w:r>
-        <w:t>The process that entails this system and the most commong technology choice of the biomass and hydrogen routes</w:t>
-      </w:r>
-    </w:p>
-    <w:p>
-      <w:pPr>
-        <w:pStyle w:val="ListParagraph"/>
-        <w:numPr>
-          <w:ilvl w:val="0"/>
-          <w:numId w:val="46"/>
-        </w:numPr>
-      </w:pPr>
-      <w:r>
-        <w:t>Advantage of this hybridization</w:t>
-      </w:r>
-    </w:p>
-    <w:p>
-      <w:pPr>
-        <w:pStyle w:val="ListParagraph"/>
-        <w:numPr>
-          <w:ilvl w:val="0"/>
-          <w:numId w:val="46"/>
-        </w:numPr>
-      </w:pPr>
-      <w:r>
-        <w:t>What is important for this hybridization and what are the blocking points</w:t>
-      </w:r>
-    </w:p>
-    <w:p>
-      <w:pPr>
-        <w:pStyle w:val="ListParagraph"/>
-        <w:numPr>
-          <w:ilvl w:val="0"/>
-          <w:numId w:val="46"/>
-        </w:numPr>
-      </w:pPr>
-      <w:r>
-        <w:t>What is important to address these blocking points</w:t>
-      </w:r>
-    </w:p>
-    <w:p>
-      <w:pPr>
-        <w:pStyle w:val="ListParagraph"/>
-        <w:numPr>
-          <w:ilvl w:val="0"/>
-          <w:numId w:val="46"/>
-        </w:numPr>
-      </w:pPr>
-      <w:r>
-        <w:t>and how optimization can support the technological feasibility and economical viability of the hybrid biomass power to methanol project</w:t>
+      <w:r>
+        <w:t>The hybridization strategy considered in this thesis integrates two upstream pathways that jointly supply the feedstock for methanol synthesis: (i) a biomass-derived pathway and (ii) a hydrogen pathway based on water electrolysis. This configuration enables coordinated carbon and hydrogen management prior to the synthesis loop.</w:t>
       </w:r>
     </w:p>
     <w:p/>
     <w:p>
       <w:r>
-        <w:t xml:space="preserve">The hybridization strategy to produce methanol in this thesis essentially mean that there are two upstream pathways that become the feedstock of the methanol synthesis. The first pathway is the biomass pathway and the second pathway is the hydrogen pathway through electrolysis. </w:t>
+        <w:t>In the biomass pathway, available feedstocks are converted into either syngas or biogas, which is subsequently upgraded to syngas for methanol production. In the literature, gasification is most commonly employed to directly convert solid biomass into syngas. An alternative route relies on anaerobic digestion (AD), where biomass is first converted into biogas and then reformed to syngas prior to methanol synthesis. The differences in process steps primarily drive the trade-offs between these technologies. The AD-based route is attractive because it can be integrated with existing waste-treatment infrastructure; however, it requires additional downstream conversion steps, making the pathway less direct and more dependent on reforming, CO₂ handling, and potentially electrolysis integration. In contrast, gasifier-based routes are more established for methanol synthesis, as they provide syngas directly and are well suited for coupling with high-temperature processes. Their disadvantages include challenges related to high-temperature solid handling, the requirement for an oxygen supply (e.g., via an air separation unit, ASU), and stricter gas-cleaning requirements. [NEED REFERENCE: comparative assessment of AD vs. gasification routes for methanol production, including process complexity and integration constraints]</w:t>
       </w:r>
     </w:p>
     <w:p/>
     <w:p>
       <w:r>
-        <w:t xml:space="preserve">For </w:t>
-      </w:r>
-      <w:r>
-        <w:t>the biomass pathway, the process converts available biomass into biogas or syngas which then are transformed into methanol. In the literature, gasification processs is mostly utilized for such a plant to directly convert biomass into syngas, however, there is also another alternative of using anaerobic digester to initially produce biogas and this biogas will then be reformed to produce syngas for the methanol synthesis. The difference process steps are main drive for the tradeoff for each technology. The AD-based route is attractice because ist can sit on top of a waster treatment infrastructure but they need an extra conversion step before methanol, so the process is less direct and more dependent on reforming, CO2 handling, or electrolysis integration. Gasifier-based routes are more established for methanol synthesis because they give syngas directly and it is favored to be coupled with high temperature heat processes but comes with some penalties which are temperature solid handling, oxygen/ASU burden, and tighter cleanup requirement.</w:t>
+        <w:t xml:space="preserve">The hydrogen pathway begins with the electrochemical splitting of water into hydrogen and oxygen using an electrolyzer. Several studies identify Solid Oxide Electrolyzer Cells (SOECs) as a promising option for power-to-methanol systems. The high operating temperature of SOECs allows for heat integration and potential oxygen utilization, which can increase overall plant efficiency compared to low-temperature systems (e.g., https://doi.org/10.1016/j.apenergy.2020.115113). However, key challenges include long-term stack durability, technological maturity, and limited operational flexibility, which is particularly relevant for systems coupled to variable renewable electricity. Techno-economic comparisons </w:t>
+      </w:r>
+      <w:r>
+        <w:lastRenderedPageBreak/>
+        <w:t xml:space="preserve">suggest that alkaline water electrolysis (AWE) represents a viable short- to mid-term option, whereas SOECs are more likely to be competitive in the mid- to long-term. Low-temperature electrolyzers such as AWE and proton exchange membrane (PEM) systems offer higher technological maturity and superior load-following capability, which is advantageous for renewable integration, but they do not fully exploit heat integration or co-electrolysis opportunities available to SOECs (e.g., </w:t>
+      </w:r>
+      <w:hyperlink r:id="rId19" w:history="1">
+        <w:r>
+          <w:rPr>
+            <w:rStyle w:val="Hyperlink"/>
+          </w:rPr>
+          <w:t>https://doi.org/10.1016/j.ijhydene.2026.153394</w:t>
+        </w:r>
+      </w:hyperlink>
+      <w:r>
+        <w:t>).</w:t>
       </w:r>
     </w:p>
     <w:p/>
     <w:p>
       <w:r>
-        <w:t xml:space="preserve">The hydrogen pathway starts with splitting water into hydrogen and oxygen in a electrochemical process by utilizing an electrolyzer. </w:t>
-      </w:r>
-      <w:r>
-        <w:t xml:space="preserve">Many literature points out to Solid Oxide Electrolyzer Cell (SOEC) as a good selection for a power-to-methanol plant. SOEC high temperature environment </w:t>
+        <w:t>In the integrated configuration, the electrolyzer produces both hydrogen and oxygen. Hydrogen is compressed and supplied to the methanol synthesis reactor, while the co-produced oxygen can be utilized in an autothermal reformer (ATR) to convert methane (e.g., from biogas) into syngas. The biomass-derived and electrolysis-derived streams are thus combined upstream of, or within, the methanol synthesis loop. [NEED REFERENCE: process integration scheme describing oxygen use in ATR and hydrogen blending in methanol synthesis]</w:t>
+      </w:r>
+    </w:p>
+    <w:p/>
+    <w:p>
+      <w:r>
+        <w:t xml:space="preserve">The hybrid approach to methanol production is attractive due to its potential for higher carbon utilization and improved use of biomass resources. One study reports a carbon utilization of 89.8% and an overall efficiency of 85.8%, with up to 101% higher methanol production per unit of biomass compared to a conventional biomass-to-methanol baseline (e.g., https://dx.doi.org/10.2139/ssrn.4184476). Another analysis indicates that a state-of-the-art biomass-to-methanol process achieves approximately 53.3% efficiency with a 4.8-year payback period, while integrating electrolysis for full carbon conversion increases efficiency to 64.5–66.0%, albeit with less favorable economics (e.g., https://doi.org/10.1016/j.apenergy.2019.114071). Furthermore, under favorable electricity price conditions, flexible operation can allow the plant to capture value from temporal price variations instead of operating continuously at a fixed load (e.g., </w:t>
+      </w:r>
+      <w:hyperlink r:id="rId20" w:history="1">
+        <w:r>
+          <w:rPr>
+            <w:rStyle w:val="Hyperlink"/>
+          </w:rPr>
+          <w:t>https://doi.org/10.1016/j.fuel.2021.122113</w:t>
+        </w:r>
+      </w:hyperlink>
+      <w:r>
+        <w:t>).</w:t>
+      </w:r>
+    </w:p>
+    <w:p/>
+    <w:p>
+      <w:r>
+        <w:t xml:space="preserve">Despite these advantages, several bottlenecks challenge the feasibility of hybrid methanol systems. These include electrolyzer utilization rates, electricity price volatility, capital cost and lifetime of electrolyzer stacks, as well as the integration of oxygen and heat streams. For example, it has been reported that high electrolyzer capacity factors are required for competitive e-methanol production, and that full-carbon-conversion configurations become attractive only when improvements in </w:t>
       </w:r>
       <w:r>
         <w:lastRenderedPageBreak/>
-        <w:t xml:space="preserve">allows the ability to </w:t>
-      </w:r>
-      <w:r>
-        <w:t>use heat and oxygen integration that low-temperature systems do not exploit as well</w:t>
-      </w:r>
-      <w:r>
-        <w:t xml:space="preserve">, which can increase energy efficiency of the entire plant. </w:t>
-      </w:r>
-      <w:r>
-        <w:t>However, there is a significant downside in the long-term stack durability, technology maturaty, and limited dynamicity, which is crucial when coupled with variable renewable energy [</w:t>
-      </w:r>
-      <w:r>
-        <w:t>https://doi.org/10.1016/j.apenergy.2020.115113</w:t>
-      </w:r>
-      <w:r>
-        <w:t>]. One techno-economic comparison of electroylzer technologies in power-to-methanol says alaklaine routes are reasonable for shot. To mid – term realization, while SOE</w:t>
-      </w:r>
-      <w:r>
-        <w:t>C</w:t>
-      </w:r>
-      <w:r>
-        <w:t xml:space="preserve"> is more of a mid- to long-term option. The main upside of low-temperature</w:t>
-      </w:r>
-      <w:r>
-        <w:t xml:space="preserve"> electrolyzer technololgies such as Alkaline Water Electrolyzer (AWE) and PEM (Proton Exchange Membrane) Electrolyzer is that they have operational maturatiy and significantly superior load-following range, which is integral for renewables coupling, while giving up heat-integration and co-electrolyzsis upside from SOEC [</w:t>
-      </w:r>
-      <w:r>
-        <w:t>https://doi.org/10.1016/j.ijhydene.2026.153394</w:t>
-      </w:r>
-      <w:r>
-        <w:t>].</w:t>
-      </w:r>
+        <w:t>electricity costs, stack lifetime, and capital expenditure are realized (e.g., https://doi.org/10.1016/j.fuel.2021.122113). Oxygen management represents an additional practical constraint: while direct integration of oxygen streams may reduce the need for large-scale oxygen storage and improve capital efficiency and safety, this is contingent on matching oxygen supply and demand within the plant (e.g., https://doi.org/10.3389/fenrg.2021.795673). [NEED REFERENCE: quantitative analysis of oxygen balancing and storage requirements in hybrid systems]</w:t>
+      </w:r>
+    </w:p>
+    <w:p/>
+    <w:p>
+      <w:r>
+        <w:t>To address these challenges, process and system-level optimization emerges as a critical tool for improving both technical and economic performance. For instance, optimization of the methanol synthesis reactor in a power-and-biomass-to-methanol (PBtM) configuration has been shown to reduce e-methanol production costs by approximately 20% (e.g., https://doi.org/10.1016/j.fuel.2021.122113). While such studies typically focus on individual subsystems, it is reasonable to expect that plant-wide optimization could yield further cost reductions and efficiency gains. [NEED REFERENCE: system-level optimization studies demonstrating integrated plant improvements] In this context, optimization acts as the bridge between technically feasible system designs and configurations that remain viable under realistic operating conditions, including fluctuating electricity prices, electrolyzer degradation, and large-scale capital constraints.</w:t>
+      </w:r>
+    </w:p>
+    <w:p>
       <w:r>
         <w:t xml:space="preserve"> </w:t>
       </w:r>
     </w:p>
+    <w:p>
+      <w:pPr>
+        <w:pStyle w:val="Heading2"/>
+      </w:pPr>
+      <w:r>
+        <w:t>MILP for Complex Polygeneration System</w:t>
+      </w:r>
+    </w:p>
     <w:p/>
-    <w:p>
-      <w:r>
-        <w:t xml:space="preserve">Then, as mentioned, electrolyzer produces hydrogen and oxygen; hydrogen gets compressed and goes to the methanol synthesis reactor and oxygen is used as a feed for Autothermal Reformer (ATR) to reform methano to produce syngas. Both biomass and hydrogen pathway then meet in the methanol reactor to synthesize methanol. </w:t>
-      </w:r>
-    </w:p>
-    <w:p/>
-    <w:p>
-      <w:r>
-        <w:t xml:space="preserve">The hybrid approach to produce methanol is attractice because of the higher carbon utilization and better use of the biomass resource. One study </w:t>
-      </w:r>
-      <w:r>
-        <w:t>found hybrid production reaches 89.8% carbon utilization and 85.8% overall efficiency, and can produce 101% more methano per biomass ton than conventional biomass-to-methanol baseline [</w:t>
-      </w:r>
-      <w:r>
-        <w:t>https://dx.doi.org/10.2139/ssrn.4184476</w:t>
-      </w:r>
-      <w:r>
-        <w:t xml:space="preserve">]. </w:t>
-      </w:r>
-      <w:r>
-        <w:t>Another found that a state-of-the-art biomass-to-methanol case sits at 53.3% efficiency with a 4.8-year payback, while full carbon conversion with electrolysis rises to 64.5–66.0% efficiency, so the hybrid can improve thermodynamics even when the economics worsen</w:t>
-      </w:r>
-      <w:r>
-        <w:t xml:space="preserve"> [</w:t>
-      </w:r>
-      <w:r>
-        <w:t>https://doi.org/10.1016/j.apenergy.2019.114071</w:t>
-      </w:r>
-      <w:r>
-        <w:t>]</w:t>
-      </w:r>
-      <w:r>
-        <w:t>. In favorable electricity-price windows</w:t>
-      </w:r>
-      <w:r>
-        <w:t>,</w:t>
-      </w:r>
-      <w:r>
-        <w:t xml:space="preserve"> </w:t>
-      </w:r>
-      <w:r>
-        <w:t>a</w:t>
-      </w:r>
-      <w:r>
-        <w:t xml:space="preserve"> flexible plant can also earn value from changing power prices instead of running at a fixed load</w:t>
-      </w:r>
-      <w:r>
-        <w:t xml:space="preserve"> [</w:t>
-      </w:r>
-      <w:r>
-        <w:t>https://doi.org/10.1016/j.fuel.2021.122113</w:t>
-      </w:r>
-      <w:r>
-        <w:t>]</w:t>
-      </w:r>
-      <w:r>
-        <w:t>.</w:t>
-      </w:r>
-    </w:p>
-    <w:p/>
-    <w:p>
-      <w:r>
-        <w:t xml:space="preserve">Despite the benefits of the hzbrid system, some papers also point out main bottlenecks that challenge the feasibility of the hybrid plant. These bottlenecks touch on the topic of electrolyzer </w:t>
-      </w:r>
-      <w:r>
-        <w:lastRenderedPageBreak/>
-        <w:t xml:space="preserve">utilization, electricity price, stack cost, stack lifetime, and the integration of oxygen and heat streams. One study asserts that high electrolysis capacity factor is needed for </w:t>
-      </w:r>
-      <w:r>
-        <w:t>competitive</w:t>
-      </w:r>
-      <w:r>
-        <w:t xml:space="preserve"> e-MeOH, and the full-carbon-</w:t>
-      </w:r>
-      <w:r>
-        <w:t>conversion</w:t>
-      </w:r>
-      <w:r>
-        <w:t xml:space="preserve"> case only becomes </w:t>
-      </w:r>
-      <w:r>
-        <w:t>attractive</w:t>
-      </w:r>
-      <w:r>
-        <w:t xml:space="preserve"> if stack cost, electricity price, and lifetime all improve [</w:t>
-      </w:r>
-      <w:r>
-        <w:t>https://doi.org/10.1016/j.fuel.2021.122113</w:t>
-      </w:r>
-      <w:r>
-        <w:t>]. Oxygen handling is another practical blocker, because direct gasification can avoid large oxygen storage, which improves capex and safety, but only if the plant and the gasifiers oxygen demand match [</w:t>
-      </w:r>
-      <w:r>
-        <w:t>https://doi.org/10.3389/fenrg.2021.795673</w:t>
-      </w:r>
-      <w:r>
-        <w:t>].</w:t>
-      </w:r>
-      <w:r>
-        <w:t xml:space="preserve"> </w:t>
-      </w:r>
-    </w:p>
-    <w:p/>
-    <w:p>
-      <w:r>
-        <w:t>To address these challenges, it is then crucial to adopt an optimization strategy in order to maximize methanol yield and operational efficiency while minimizing the total cost of the plan. One paper did a study on optimizing the reactor of the Methanol synthesis for a power and biomass to methanol (PBtM) plant and the result shoed 20% cost reduction in e-MeOH cost [</w:t>
-      </w:r>
-      <w:r>
-        <w:t>https://doi.org/10.1016/j.fuel.2021.122113</w:t>
-      </w:r>
-      <w:r>
-        <w:t xml:space="preserve">]. Now this takes into account only optimization of one component, it is then intuitive to imagine a significant price reduction on an optimization on a plant level. This makes optimization the bridge between a technically plausible plant and one that can survive real electricity prices, real stack degradation, and real-scale capex. </w:t>
-      </w:r>
-    </w:p>
-    <w:p/>
-    <w:p>
-      <w:r>
-        <w:t xml:space="preserve"> </w:t>
-      </w:r>
-    </w:p>
-    <w:p>
-      <w:pPr>
-        <w:pStyle w:val="Heading2"/>
-      </w:pPr>
-      <w:r>
-        <w:t>MILP for Complex Polygeneration System</w:t>
-      </w:r>
-    </w:p>
     <w:p>
       <w:pPr>
         <w:pStyle w:val="Heading2"/>
@@ -2013,6 +1836,7 @@
         </w:numPr>
       </w:pPr>
       <w:r>
+        <w:lastRenderedPageBreak/>
         <w:t>Diagram of MDP process</w:t>
       </w:r>
     </w:p>
@@ -2076,7 +1900,6 @@
         </w:numPr>
       </w:pPr>
       <w:r>
-        <w:lastRenderedPageBreak/>
         <w:t>Equation of sum of reward</w:t>
       </w:r>
     </w:p>
@@ -2630,7 +2453,11 @@
         <w:t xml:space="preserve">chooses an action that returns best estimated value. </w:t>
       </w:r>
       <w:r>
-        <w:t>Some example of value.based RL are Q-learning and Deep</w:t>
+        <w:t xml:space="preserve">Some example of </w:t>
+      </w:r>
+      <w:r>
+        <w:lastRenderedPageBreak/>
+        <w:t>value.based RL are Q-learning and Deep</w:t>
       </w:r>
       <w:r>
         <w:t xml:space="preserve"> Q Network (</w:t>
@@ -2677,11 +2504,7 @@
         <w:t xml:space="preserve">. This algorithm excels in </w:t>
       </w:r>
       <w:r>
-        <w:t xml:space="preserve">controlling and optimizing discrete choices but not </w:t>
-      </w:r>
-      <w:r>
-        <w:lastRenderedPageBreak/>
-        <w:t>continuous ones</w:t>
+        <w:t>controlling and optimizing discrete choices but not continuous ones</w:t>
       </w:r>
       <w:r>
         <w:t xml:space="preserve"> </w:t>
@@ -3045,12 +2868,19 @@
         <w:rPr>
           <w:color w:val="000000"/>
         </w:rPr>
-        <w:t xml:space="preserve">the reference scenario with MILP having </w:t>
+        <w:t xml:space="preserve">the reference scenario </w:t>
       </w:r>
       <w:r>
         <w:rPr>
           <w:color w:val="000000"/>
         </w:rPr>
+        <w:lastRenderedPageBreak/>
+        <w:t xml:space="preserve">with MILP having </w:t>
+      </w:r>
+      <w:r>
+        <w:rPr>
+          <w:color w:val="000000"/>
+        </w:rPr>
         <w:t>greater</w:t>
       </w:r>
       <w:r>
@@ -3087,14 +2917,7 @@
         <w:rPr>
           <w:color w:val="000000"/>
         </w:rPr>
-        <w:t xml:space="preserve">This is due to the </w:t>
-      </w:r>
-      <w:r>
-        <w:rPr>
-          <w:color w:val="000000"/>
-        </w:rPr>
-        <w:lastRenderedPageBreak/>
-        <w:t>fact that RL</w:t>
+        <w:t>This is due to the fact that RL</w:t>
       </w:r>
       <w:r>
         <w:rPr>
@@ -3536,7 +3359,14 @@
         <w:rPr>
           <w:color w:val="000000"/>
         </w:rPr>
-        <w:t>. According to the authors of the study, this poorer performance of RL could be due to a lot of reasons, two of the notable reasons includ</w:t>
+        <w:t xml:space="preserve">. According to the authors of the study, this poorer </w:t>
+      </w:r>
+      <w:r>
+        <w:rPr>
+          <w:color w:val="000000"/>
+        </w:rPr>
+        <w:lastRenderedPageBreak/>
+        <w:t>performance of RL could be due to a lot of reasons, two of the notable reasons includ</w:t>
       </w:r>
       <w:r>
         <w:rPr>
@@ -5400,7 +5230,7 @@
     <w:p/>
     <w:p/>
     <w:sectPr>
-      <w:headerReference w:type="default" r:id="rId19"/>
+      <w:headerReference w:type="default" r:id="rId21"/>
       <w:pgSz w:w="12240" w:h="15840"/>
       <w:pgMar w:top="1440" w:right="1440" w:bottom="1440" w:left="1440" w:header="708" w:footer="708" w:gutter="0"/>
       <w:pgNumType w:start="1"/>
@@ -13089,7 +12919,6 @@
     <w:rsid w:val="00737891"/>
     <w:rsid w:val="00770EC1"/>
     <w:rsid w:val="00806D95"/>
-    <w:rsid w:val="00846521"/>
     <w:rsid w:val="00862D9B"/>
     <w:rsid w:val="00867ADA"/>
     <w:rsid w:val="00874878"/>
@@ -13117,6 +12946,7 @@
     <w:rsid w:val="00DA1BDA"/>
     <w:rsid w:val="00DF0C8C"/>
     <w:rsid w:val="00DF3A7C"/>
+    <w:rsid w:val="00DF4D73"/>
     <w:rsid w:val="00DF7D90"/>
     <w:rsid w:val="00E24E9F"/>
     <w:rsid w:val="00ED4800"/>

</xml_diff>

<commit_message>
created the structure of MILP literature review
</commit_message>
<xml_diff>
--- a/Thesis Report Rafi.docx
+++ b/Thesis Report Rafi.docx
@@ -1724,6 +1724,104 @@
         <w:t>MILP for Complex Polygeneration System</w:t>
       </w:r>
     </w:p>
+    <w:p>
+      <w:pPr>
+        <w:pStyle w:val="ListParagraph"/>
+        <w:numPr>
+          <w:ilvl w:val="0"/>
+          <w:numId w:val="48"/>
+        </w:numPr>
+      </w:pPr>
+      <w:r>
+        <w:t>Introduction of MILP as the state-of-the-art methodology for optimizing various energy system by defining linear models, constraints and objective functions</w:t>
+      </w:r>
+    </w:p>
+    <w:p>
+      <w:pPr>
+        <w:pStyle w:val="ListParagraph"/>
+        <w:numPr>
+          <w:ilvl w:val="0"/>
+          <w:numId w:val="48"/>
+        </w:numPr>
+      </w:pPr>
+      <w:r>
+        <w:t>What other methodologies that are used that are adjacent to MILP</w:t>
+      </w:r>
+    </w:p>
+    <w:p>
+      <w:pPr>
+        <w:pStyle w:val="ListParagraph"/>
+        <w:numPr>
+          <w:ilvl w:val="0"/>
+          <w:numId w:val="48"/>
+        </w:numPr>
+      </w:pPr>
+      <w:r>
+        <w:t>Strengths and gaps of MILP</w:t>
+      </w:r>
+      <w:r>
+        <w:t xml:space="preserve"> compared to the other adjacent methodologies</w:t>
+      </w:r>
+    </w:p>
+    <w:p>
+      <w:pPr>
+        <w:pStyle w:val="ListParagraph"/>
+        <w:numPr>
+          <w:ilvl w:val="0"/>
+          <w:numId w:val="48"/>
+        </w:numPr>
+      </w:pPr>
+      <w:r>
+        <w:t xml:space="preserve">MILP use cases in optimizing hybrid methanol system or other polygeneration </w:t>
+      </w:r>
+      <w:r>
+        <w:t xml:space="preserve">or specifically hybrid biomass power-to-methanol </w:t>
+      </w:r>
+      <w:r>
+        <w:t>system</w:t>
+      </w:r>
+    </w:p>
+    <w:p>
+      <w:pPr>
+        <w:pStyle w:val="ListParagraph"/>
+        <w:numPr>
+          <w:ilvl w:val="0"/>
+          <w:numId w:val="48"/>
+        </w:numPr>
+      </w:pPr>
+      <w:r>
+        <w:t>The gap that MILP has that incentivizes the use of RL for optimizing a complex polygeneration system</w:t>
+      </w:r>
+    </w:p>
+    <w:p>
+      <w:pPr>
+        <w:ind w:left="360"/>
+      </w:pPr>
+    </w:p>
+    <w:p>
+      <w:r>
+        <w:lastRenderedPageBreak/>
+        <w:t>MILP or Multi Integer Linear Programming has been used as a tool to optimize different kinds of energy or industrial plants by linearizing the model of these processes and setting up a linear objective function to either maximize or minimize a specific KPI based on the</w:t>
+      </w:r>
+      <w:r>
+        <w:t xml:space="preserve"> optimization</w:t>
+      </w:r>
+      <w:r>
+        <w:t xml:space="preserve"> objective</w:t>
+      </w:r>
+      <w:r>
+        <w:t xml:space="preserve"> []</w:t>
+      </w:r>
+      <w:r>
+        <w:t>.</w:t>
+      </w:r>
+      <w:r>
+        <w:t xml:space="preserve"> </w:t>
+      </w:r>
+      <w:r>
+        <w:t xml:space="preserve"> </w:t>
+      </w:r>
+    </w:p>
     <w:p/>
     <w:p>
       <w:pPr>
@@ -1836,7 +1934,6 @@
         </w:numPr>
       </w:pPr>
       <w:r>
-        <w:lastRenderedPageBreak/>
         <w:t>Diagram of MDP process</w:t>
       </w:r>
     </w:p>
@@ -2296,6 +2393,7 @@
     </w:p>
     <w:p>
       <w:r>
+        <w:lastRenderedPageBreak/>
         <w:t xml:space="preserve">In short, </w:t>
       </w:r>
       <w:r>
@@ -2453,11 +2551,7 @@
         <w:t xml:space="preserve">chooses an action that returns best estimated value. </w:t>
       </w:r>
       <w:r>
-        <w:t xml:space="preserve">Some example of </w:t>
-      </w:r>
-      <w:r>
-        <w:lastRenderedPageBreak/>
-        <w:t>value.based RL are Q-learning and Deep</w:t>
+        <w:t>Some example of value.based RL are Q-learning and Deep</w:t>
       </w:r>
       <w:r>
         <w:t xml:space="preserve"> Q Network (</w:t>
@@ -2868,14 +2962,7 @@
         <w:rPr>
           <w:color w:val="000000"/>
         </w:rPr>
-        <w:t xml:space="preserve">the reference scenario </w:t>
-      </w:r>
-      <w:r>
-        <w:rPr>
-          <w:color w:val="000000"/>
-        </w:rPr>
-        <w:lastRenderedPageBreak/>
-        <w:t xml:space="preserve">with MILP having </w:t>
+        <w:t xml:space="preserve">the reference scenario with MILP having </w:t>
       </w:r>
       <w:r>
         <w:rPr>
@@ -3153,12 +3240,19 @@
         <w:rPr>
           <w:color w:val="000000"/>
         </w:rPr>
-        <w:t xml:space="preserve">modelling limitations that the RL excludes </w:t>
+        <w:t xml:space="preserve">modelling limitations that </w:t>
       </w:r>
       <w:r>
         <w:rPr>
           <w:color w:val="000000"/>
         </w:rPr>
+        <w:lastRenderedPageBreak/>
+        <w:t xml:space="preserve">the RL excludes </w:t>
+      </w:r>
+      <w:r>
+        <w:rPr>
+          <w:color w:val="000000"/>
+        </w:rPr>
         <w:t xml:space="preserve">which is the battery SOC state at the end of the simulation that should be the same as the initial SOC state. </w:t>
       </w:r>
       <w:r>
@@ -3359,14 +3453,7 @@
         <w:rPr>
           <w:color w:val="000000"/>
         </w:rPr>
-        <w:t xml:space="preserve">. According to the authors of the study, this poorer </w:t>
-      </w:r>
-      <w:r>
-        <w:rPr>
-          <w:color w:val="000000"/>
-        </w:rPr>
-        <w:lastRenderedPageBreak/>
-        <w:t>performance of RL could be due to a lot of reasons, two of the notable reasons includ</w:t>
+        <w:t>. According to the authors of the study, this poorer performance of RL could be due to a lot of reasons, two of the notable reasons includ</w:t>
       </w:r>
       <w:r>
         <w:rPr>
@@ -7308,6 +7395,118 @@
     </w:lvl>
   </w:abstractNum>
   <w:abstractNum w:abstractNumId="15" w15:restartNumberingAfterBreak="0">
+    <w:nsid w:val="22D20551"/>
+    <w:multiLevelType w:val="hybridMultilevel"/>
+    <w:tmpl w:val="7B8AE820"/>
+    <w:lvl w:ilvl="0" w:tplc="8FF06462">
+      <w:numFmt w:val="bullet"/>
+      <w:lvlText w:val="-"/>
+      <w:lvlJc w:val="left"/>
+      <w:pPr>
+        <w:ind w:left="720" w:hanging="360"/>
+      </w:pPr>
+      <w:rPr>
+        <w:rFonts w:ascii="Times New Roman" w:eastAsia="MS Mincho" w:hAnsi="Times New Roman" w:cs="Times New Roman" w:hint="default"/>
+      </w:rPr>
+    </w:lvl>
+    <w:lvl w:ilvl="1" w:tplc="04090003" w:tentative="1">
+      <w:start w:val="1"/>
+      <w:numFmt w:val="bullet"/>
+      <w:lvlText w:val="o"/>
+      <w:lvlJc w:val="left"/>
+      <w:pPr>
+        <w:ind w:left="1440" w:hanging="360"/>
+      </w:pPr>
+      <w:rPr>
+        <w:rFonts w:ascii="Courier New" w:hAnsi="Courier New" w:cs="Courier New" w:hint="default"/>
+      </w:rPr>
+    </w:lvl>
+    <w:lvl w:ilvl="2" w:tplc="04090005" w:tentative="1">
+      <w:start w:val="1"/>
+      <w:numFmt w:val="bullet"/>
+      <w:lvlText w:val=""/>
+      <w:lvlJc w:val="left"/>
+      <w:pPr>
+        <w:ind w:left="2160" w:hanging="360"/>
+      </w:pPr>
+      <w:rPr>
+        <w:rFonts w:ascii="Wingdings" w:hAnsi="Wingdings" w:hint="default"/>
+      </w:rPr>
+    </w:lvl>
+    <w:lvl w:ilvl="3" w:tplc="04090001" w:tentative="1">
+      <w:start w:val="1"/>
+      <w:numFmt w:val="bullet"/>
+      <w:lvlText w:val=""/>
+      <w:lvlJc w:val="left"/>
+      <w:pPr>
+        <w:ind w:left="2880" w:hanging="360"/>
+      </w:pPr>
+      <w:rPr>
+        <w:rFonts w:ascii="Symbol" w:hAnsi="Symbol" w:hint="default"/>
+      </w:rPr>
+    </w:lvl>
+    <w:lvl w:ilvl="4" w:tplc="04090003" w:tentative="1">
+      <w:start w:val="1"/>
+      <w:numFmt w:val="bullet"/>
+      <w:lvlText w:val="o"/>
+      <w:lvlJc w:val="left"/>
+      <w:pPr>
+        <w:ind w:left="3600" w:hanging="360"/>
+      </w:pPr>
+      <w:rPr>
+        <w:rFonts w:ascii="Courier New" w:hAnsi="Courier New" w:cs="Courier New" w:hint="default"/>
+      </w:rPr>
+    </w:lvl>
+    <w:lvl w:ilvl="5" w:tplc="04090005" w:tentative="1">
+      <w:start w:val="1"/>
+      <w:numFmt w:val="bullet"/>
+      <w:lvlText w:val=""/>
+      <w:lvlJc w:val="left"/>
+      <w:pPr>
+        <w:ind w:left="4320" w:hanging="360"/>
+      </w:pPr>
+      <w:rPr>
+        <w:rFonts w:ascii="Wingdings" w:hAnsi="Wingdings" w:hint="default"/>
+      </w:rPr>
+    </w:lvl>
+    <w:lvl w:ilvl="6" w:tplc="04090001" w:tentative="1">
+      <w:start w:val="1"/>
+      <w:numFmt w:val="bullet"/>
+      <w:lvlText w:val=""/>
+      <w:lvlJc w:val="left"/>
+      <w:pPr>
+        <w:ind w:left="5040" w:hanging="360"/>
+      </w:pPr>
+      <w:rPr>
+        <w:rFonts w:ascii="Symbol" w:hAnsi="Symbol" w:hint="default"/>
+      </w:rPr>
+    </w:lvl>
+    <w:lvl w:ilvl="7" w:tplc="04090003" w:tentative="1">
+      <w:start w:val="1"/>
+      <w:numFmt w:val="bullet"/>
+      <w:lvlText w:val="o"/>
+      <w:lvlJc w:val="left"/>
+      <w:pPr>
+        <w:ind w:left="5760" w:hanging="360"/>
+      </w:pPr>
+      <w:rPr>
+        <w:rFonts w:ascii="Courier New" w:hAnsi="Courier New" w:cs="Courier New" w:hint="default"/>
+      </w:rPr>
+    </w:lvl>
+    <w:lvl w:ilvl="8" w:tplc="04090005" w:tentative="1">
+      <w:start w:val="1"/>
+      <w:numFmt w:val="bullet"/>
+      <w:lvlText w:val=""/>
+      <w:lvlJc w:val="left"/>
+      <w:pPr>
+        <w:ind w:left="6480" w:hanging="360"/>
+      </w:pPr>
+      <w:rPr>
+        <w:rFonts w:ascii="Wingdings" w:hAnsi="Wingdings" w:hint="default"/>
+      </w:rPr>
+    </w:lvl>
+  </w:abstractNum>
+  <w:abstractNum w:abstractNumId="16" w15:restartNumberingAfterBreak="0">
     <w:nsid w:val="23327DE5"/>
     <w:multiLevelType w:val="hybridMultilevel"/>
     <w:tmpl w:val="1A4C4022"/>
@@ -7420,7 +7619,7 @@
       </w:rPr>
     </w:lvl>
   </w:abstractNum>
-  <w:abstractNum w:abstractNumId="16" w15:restartNumberingAfterBreak="0">
+  <w:abstractNum w:abstractNumId="17" w15:restartNumberingAfterBreak="0">
     <w:nsid w:val="256433CE"/>
     <w:multiLevelType w:val="hybridMultilevel"/>
     <w:tmpl w:val="495493D6"/>
@@ -7533,7 +7732,7 @@
       </w:rPr>
     </w:lvl>
   </w:abstractNum>
-  <w:abstractNum w:abstractNumId="17" w15:restartNumberingAfterBreak="0">
+  <w:abstractNum w:abstractNumId="18" w15:restartNumberingAfterBreak="0">
     <w:nsid w:val="29B24864"/>
     <w:multiLevelType w:val="hybridMultilevel"/>
     <w:tmpl w:val="06204748"/>
@@ -7622,7 +7821,7 @@
       </w:pPr>
     </w:lvl>
   </w:abstractNum>
-  <w:abstractNum w:abstractNumId="18" w15:restartNumberingAfterBreak="0">
+  <w:abstractNum w:abstractNumId="19" w15:restartNumberingAfterBreak="0">
     <w:nsid w:val="2C2246C1"/>
     <w:multiLevelType w:val="hybridMultilevel"/>
     <w:tmpl w:val="48F2C360"/>
@@ -7734,7 +7933,7 @@
       </w:rPr>
     </w:lvl>
   </w:abstractNum>
-  <w:abstractNum w:abstractNumId="19" w15:restartNumberingAfterBreak="0">
+  <w:abstractNum w:abstractNumId="20" w15:restartNumberingAfterBreak="0">
     <w:nsid w:val="2EEA75E5"/>
     <w:multiLevelType w:val="hybridMultilevel"/>
     <w:tmpl w:val="2926FC02"/>
@@ -7847,7 +8046,7 @@
       </w:rPr>
     </w:lvl>
   </w:abstractNum>
-  <w:abstractNum w:abstractNumId="20" w15:restartNumberingAfterBreak="0">
+  <w:abstractNum w:abstractNumId="21" w15:restartNumberingAfterBreak="0">
     <w:nsid w:val="300E4837"/>
     <w:multiLevelType w:val="hybridMultilevel"/>
     <w:tmpl w:val="21A88B6C"/>
@@ -7960,7 +8159,7 @@
       </w:rPr>
     </w:lvl>
   </w:abstractNum>
-  <w:abstractNum w:abstractNumId="21" w15:restartNumberingAfterBreak="0">
+  <w:abstractNum w:abstractNumId="22" w15:restartNumberingAfterBreak="0">
     <w:nsid w:val="325C3B4B"/>
     <w:multiLevelType w:val="hybridMultilevel"/>
     <w:tmpl w:val="C6E029BA"/>
@@ -8073,7 +8272,7 @@
       </w:rPr>
     </w:lvl>
   </w:abstractNum>
-  <w:abstractNum w:abstractNumId="22" w15:restartNumberingAfterBreak="0">
+  <w:abstractNum w:abstractNumId="23" w15:restartNumberingAfterBreak="0">
     <w:nsid w:val="36C30D85"/>
     <w:multiLevelType w:val="hybridMultilevel"/>
     <w:tmpl w:val="DE32E2F2"/>
@@ -8186,7 +8385,7 @@
       </w:rPr>
     </w:lvl>
   </w:abstractNum>
-  <w:abstractNum w:abstractNumId="23" w15:restartNumberingAfterBreak="0">
+  <w:abstractNum w:abstractNumId="24" w15:restartNumberingAfterBreak="0">
     <w:nsid w:val="3C2C271D"/>
     <w:multiLevelType w:val="hybridMultilevel"/>
     <w:tmpl w:val="978EAE6C"/>
@@ -8299,7 +8498,7 @@
       </w:rPr>
     </w:lvl>
   </w:abstractNum>
-  <w:abstractNum w:abstractNumId="24" w15:restartNumberingAfterBreak="0">
+  <w:abstractNum w:abstractNumId="25" w15:restartNumberingAfterBreak="0">
     <w:nsid w:val="3C9B4DAC"/>
     <w:multiLevelType w:val="hybridMultilevel"/>
     <w:tmpl w:val="E6F26226"/>
@@ -8385,7 +8584,7 @@
       </w:pPr>
     </w:lvl>
   </w:abstractNum>
-  <w:abstractNum w:abstractNumId="25" w15:restartNumberingAfterBreak="0">
+  <w:abstractNum w:abstractNumId="26" w15:restartNumberingAfterBreak="0">
     <w:nsid w:val="3D250691"/>
     <w:multiLevelType w:val="hybridMultilevel"/>
     <w:tmpl w:val="293652FA"/>
@@ -8498,7 +8697,7 @@
       </w:rPr>
     </w:lvl>
   </w:abstractNum>
-  <w:abstractNum w:abstractNumId="26" w15:restartNumberingAfterBreak="0">
+  <w:abstractNum w:abstractNumId="27" w15:restartNumberingAfterBreak="0">
     <w:nsid w:val="3E4219A4"/>
     <w:multiLevelType w:val="hybridMultilevel"/>
     <w:tmpl w:val="831E829E"/>
@@ -8610,7 +8809,7 @@
       </w:rPr>
     </w:lvl>
   </w:abstractNum>
-  <w:abstractNum w:abstractNumId="27" w15:restartNumberingAfterBreak="0">
+  <w:abstractNum w:abstractNumId="28" w15:restartNumberingAfterBreak="0">
     <w:nsid w:val="3F206DB5"/>
     <w:multiLevelType w:val="multilevel"/>
     <w:tmpl w:val="3544CBE4"/>
@@ -8759,7 +8958,7 @@
       </w:rPr>
     </w:lvl>
   </w:abstractNum>
-  <w:abstractNum w:abstractNumId="28" w15:restartNumberingAfterBreak="0">
+  <w:abstractNum w:abstractNumId="29" w15:restartNumberingAfterBreak="0">
     <w:nsid w:val="4056699C"/>
     <w:multiLevelType w:val="hybridMultilevel"/>
     <w:tmpl w:val="F6CED83E"/>
@@ -8872,7 +9071,7 @@
       </w:rPr>
     </w:lvl>
   </w:abstractNum>
-  <w:abstractNum w:abstractNumId="29" w15:restartNumberingAfterBreak="0">
+  <w:abstractNum w:abstractNumId="30" w15:restartNumberingAfterBreak="0">
     <w:nsid w:val="43804A33"/>
     <w:multiLevelType w:val="hybridMultilevel"/>
     <w:tmpl w:val="BF2A2F88"/>
@@ -8984,7 +9183,7 @@
       </w:rPr>
     </w:lvl>
   </w:abstractNum>
-  <w:abstractNum w:abstractNumId="30" w15:restartNumberingAfterBreak="0">
+  <w:abstractNum w:abstractNumId="31" w15:restartNumberingAfterBreak="0">
     <w:nsid w:val="44924F22"/>
     <w:multiLevelType w:val="hybridMultilevel"/>
     <w:tmpl w:val="F3AA4096"/>
@@ -9097,7 +9296,7 @@
       </w:rPr>
     </w:lvl>
   </w:abstractNum>
-  <w:abstractNum w:abstractNumId="31" w15:restartNumberingAfterBreak="0">
+  <w:abstractNum w:abstractNumId="32" w15:restartNumberingAfterBreak="0">
     <w:nsid w:val="4CAE6E69"/>
     <w:multiLevelType w:val="hybridMultilevel"/>
     <w:tmpl w:val="0E4A8148"/>
@@ -9209,7 +9408,7 @@
       </w:rPr>
     </w:lvl>
   </w:abstractNum>
-  <w:abstractNum w:abstractNumId="32" w15:restartNumberingAfterBreak="0">
+  <w:abstractNum w:abstractNumId="33" w15:restartNumberingAfterBreak="0">
     <w:nsid w:val="52D0448A"/>
     <w:multiLevelType w:val="hybridMultilevel"/>
     <w:tmpl w:val="17D823EE"/>
@@ -9322,7 +9521,7 @@
       </w:rPr>
     </w:lvl>
   </w:abstractNum>
-  <w:abstractNum w:abstractNumId="33" w15:restartNumberingAfterBreak="0">
+  <w:abstractNum w:abstractNumId="34" w15:restartNumberingAfterBreak="0">
     <w:nsid w:val="55975563"/>
     <w:multiLevelType w:val="hybridMultilevel"/>
     <w:tmpl w:val="F5EE2CAE"/>
@@ -9435,7 +9634,7 @@
       </w:rPr>
     </w:lvl>
   </w:abstractNum>
-  <w:abstractNum w:abstractNumId="34" w15:restartNumberingAfterBreak="0">
+  <w:abstractNum w:abstractNumId="35" w15:restartNumberingAfterBreak="0">
     <w:nsid w:val="5BD54EFD"/>
     <w:multiLevelType w:val="hybridMultilevel"/>
     <w:tmpl w:val="0F1030CA"/>
@@ -9548,7 +9747,7 @@
       </w:rPr>
     </w:lvl>
   </w:abstractNum>
-  <w:abstractNum w:abstractNumId="35" w15:restartNumberingAfterBreak="0">
+  <w:abstractNum w:abstractNumId="36" w15:restartNumberingAfterBreak="0">
     <w:nsid w:val="5C340F92"/>
     <w:multiLevelType w:val="hybridMultilevel"/>
     <w:tmpl w:val="AA529710"/>
@@ -9660,7 +9859,7 @@
       </w:rPr>
     </w:lvl>
   </w:abstractNum>
-  <w:abstractNum w:abstractNumId="36" w15:restartNumberingAfterBreak="0">
+  <w:abstractNum w:abstractNumId="37" w15:restartNumberingAfterBreak="0">
     <w:nsid w:val="5EC56EDC"/>
     <w:multiLevelType w:val="hybridMultilevel"/>
     <w:tmpl w:val="10C21EE0"/>
@@ -9772,7 +9971,7 @@
       </w:rPr>
     </w:lvl>
   </w:abstractNum>
-  <w:abstractNum w:abstractNumId="37" w15:restartNumberingAfterBreak="0">
+  <w:abstractNum w:abstractNumId="38" w15:restartNumberingAfterBreak="0">
     <w:nsid w:val="62175FB6"/>
     <w:multiLevelType w:val="hybridMultilevel"/>
     <w:tmpl w:val="1772F19E"/>
@@ -9884,7 +10083,7 @@
       </w:rPr>
     </w:lvl>
   </w:abstractNum>
-  <w:abstractNum w:abstractNumId="38" w15:restartNumberingAfterBreak="0">
+  <w:abstractNum w:abstractNumId="39" w15:restartNumberingAfterBreak="0">
     <w:nsid w:val="6329582B"/>
     <w:multiLevelType w:val="hybridMultilevel"/>
     <w:tmpl w:val="5BC61120"/>
@@ -9997,7 +10196,7 @@
       </w:rPr>
     </w:lvl>
   </w:abstractNum>
-  <w:abstractNum w:abstractNumId="39" w15:restartNumberingAfterBreak="0">
+  <w:abstractNum w:abstractNumId="40" w15:restartNumberingAfterBreak="0">
     <w:nsid w:val="677657B3"/>
     <w:multiLevelType w:val="hybridMultilevel"/>
     <w:tmpl w:val="5524D014"/>
@@ -10110,7 +10309,7 @@
       </w:rPr>
     </w:lvl>
   </w:abstractNum>
-  <w:abstractNum w:abstractNumId="40" w15:restartNumberingAfterBreak="0">
+  <w:abstractNum w:abstractNumId="41" w15:restartNumberingAfterBreak="0">
     <w:nsid w:val="67F61E84"/>
     <w:multiLevelType w:val="hybridMultilevel"/>
     <w:tmpl w:val="430EF71E"/>
@@ -10223,7 +10422,7 @@
       </w:rPr>
     </w:lvl>
   </w:abstractNum>
-  <w:abstractNum w:abstractNumId="41" w15:restartNumberingAfterBreak="0">
+  <w:abstractNum w:abstractNumId="42" w15:restartNumberingAfterBreak="0">
     <w:nsid w:val="6B8D481B"/>
     <w:multiLevelType w:val="hybridMultilevel"/>
     <w:tmpl w:val="01149C52"/>
@@ -10336,7 +10535,7 @@
       </w:rPr>
     </w:lvl>
   </w:abstractNum>
-  <w:abstractNum w:abstractNumId="42" w15:restartNumberingAfterBreak="0">
+  <w:abstractNum w:abstractNumId="43" w15:restartNumberingAfterBreak="0">
     <w:nsid w:val="6E7267F1"/>
     <w:multiLevelType w:val="hybridMultilevel"/>
     <w:tmpl w:val="3432C5BC"/>
@@ -10448,7 +10647,7 @@
       </w:rPr>
     </w:lvl>
   </w:abstractNum>
-  <w:abstractNum w:abstractNumId="43" w15:restartNumberingAfterBreak="0">
+  <w:abstractNum w:abstractNumId="44" w15:restartNumberingAfterBreak="0">
     <w:nsid w:val="6FE57B32"/>
     <w:multiLevelType w:val="hybridMultilevel"/>
     <w:tmpl w:val="8F24FF80"/>
@@ -10560,7 +10759,7 @@
       </w:rPr>
     </w:lvl>
   </w:abstractNum>
-  <w:abstractNum w:abstractNumId="44" w15:restartNumberingAfterBreak="0">
+  <w:abstractNum w:abstractNumId="45" w15:restartNumberingAfterBreak="0">
     <w:nsid w:val="71F17535"/>
     <w:multiLevelType w:val="hybridMultilevel"/>
     <w:tmpl w:val="CDCED060"/>
@@ -10673,7 +10872,7 @@
       </w:rPr>
     </w:lvl>
   </w:abstractNum>
-  <w:abstractNum w:abstractNumId="45" w15:restartNumberingAfterBreak="0">
+  <w:abstractNum w:abstractNumId="46" w15:restartNumberingAfterBreak="0">
     <w:nsid w:val="75050389"/>
     <w:multiLevelType w:val="hybridMultilevel"/>
     <w:tmpl w:val="5D4490F8"/>
@@ -10793,31 +10992,31 @@
     <w:abstractNumId w:val="10"/>
   </w:num>
   <w:num w:numId="3" w16cid:durableId="627468108">
-    <w:abstractNumId w:val="35"/>
+    <w:abstractNumId w:val="36"/>
   </w:num>
   <w:num w:numId="4" w16cid:durableId="2147312317">
-    <w:abstractNumId w:val="26"/>
+    <w:abstractNumId w:val="27"/>
   </w:num>
   <w:num w:numId="5" w16cid:durableId="1468888951">
-    <w:abstractNumId w:val="41"/>
+    <w:abstractNumId w:val="42"/>
   </w:num>
   <w:num w:numId="6" w16cid:durableId="1505826805">
-    <w:abstractNumId w:val="32"/>
+    <w:abstractNumId w:val="33"/>
   </w:num>
   <w:num w:numId="7" w16cid:durableId="410201841">
     <w:abstractNumId w:val="12"/>
   </w:num>
   <w:num w:numId="8" w16cid:durableId="177933021">
-    <w:abstractNumId w:val="38"/>
+    <w:abstractNumId w:val="39"/>
   </w:num>
   <w:num w:numId="9" w16cid:durableId="453066233">
-    <w:abstractNumId w:val="23"/>
+    <w:abstractNumId w:val="24"/>
   </w:num>
   <w:num w:numId="10" w16cid:durableId="308437867">
-    <w:abstractNumId w:val="25"/>
+    <w:abstractNumId w:val="26"/>
   </w:num>
   <w:num w:numId="11" w16cid:durableId="2044015130">
-    <w:abstractNumId w:val="37"/>
+    <w:abstractNumId w:val="38"/>
   </w:num>
   <w:num w:numId="12" w16cid:durableId="1894543432">
     <w:abstractNumId w:val="3"/>
@@ -10826,85 +11025,85 @@
     <w:abstractNumId w:val="11"/>
   </w:num>
   <w:num w:numId="14" w16cid:durableId="1105805891">
-    <w:abstractNumId w:val="24"/>
+    <w:abstractNumId w:val="25"/>
   </w:num>
   <w:num w:numId="15" w16cid:durableId="1910379217">
-    <w:abstractNumId w:val="17"/>
+    <w:abstractNumId w:val="18"/>
   </w:num>
   <w:num w:numId="16" w16cid:durableId="532619251">
-    <w:abstractNumId w:val="33"/>
+    <w:abstractNumId w:val="34"/>
   </w:num>
   <w:num w:numId="17" w16cid:durableId="483934593">
     <w:abstractNumId w:val="14"/>
   </w:num>
   <w:num w:numId="18" w16cid:durableId="114177715">
-    <w:abstractNumId w:val="28"/>
+    <w:abstractNumId w:val="29"/>
   </w:num>
   <w:num w:numId="19" w16cid:durableId="1754081084">
-    <w:abstractNumId w:val="34"/>
+    <w:abstractNumId w:val="35"/>
   </w:num>
   <w:num w:numId="20" w16cid:durableId="1659842329">
-    <w:abstractNumId w:val="44"/>
+    <w:abstractNumId w:val="45"/>
   </w:num>
   <w:num w:numId="21" w16cid:durableId="163865201">
     <w:abstractNumId w:val="8"/>
   </w:num>
   <w:num w:numId="22" w16cid:durableId="1701786197">
-    <w:abstractNumId w:val="22"/>
+    <w:abstractNumId w:val="23"/>
   </w:num>
   <w:num w:numId="23" w16cid:durableId="1258517052">
-    <w:abstractNumId w:val="16"/>
+    <w:abstractNumId w:val="17"/>
   </w:num>
   <w:num w:numId="24" w16cid:durableId="961375172">
     <w:abstractNumId w:val="5"/>
   </w:num>
   <w:num w:numId="25" w16cid:durableId="1663504458">
-    <w:abstractNumId w:val="15"/>
+    <w:abstractNumId w:val="16"/>
   </w:num>
   <w:num w:numId="26" w16cid:durableId="307058015">
-    <w:abstractNumId w:val="39"/>
+    <w:abstractNumId w:val="40"/>
   </w:num>
   <w:num w:numId="27" w16cid:durableId="82074765">
-    <w:abstractNumId w:val="29"/>
+    <w:abstractNumId w:val="30"/>
   </w:num>
   <w:num w:numId="28" w16cid:durableId="231620995">
-    <w:abstractNumId w:val="42"/>
+    <w:abstractNumId w:val="43"/>
   </w:num>
   <w:num w:numId="29" w16cid:durableId="941106550">
-    <w:abstractNumId w:val="31"/>
+    <w:abstractNumId w:val="32"/>
   </w:num>
   <w:num w:numId="30" w16cid:durableId="1248537759">
     <w:abstractNumId w:val="4"/>
   </w:num>
   <w:num w:numId="31" w16cid:durableId="113404857">
-    <w:abstractNumId w:val="30"/>
+    <w:abstractNumId w:val="31"/>
   </w:num>
   <w:num w:numId="32" w16cid:durableId="405617677">
     <w:abstractNumId w:val="9"/>
   </w:num>
   <w:num w:numId="33" w16cid:durableId="667246042">
-    <w:abstractNumId w:val="20"/>
+    <w:abstractNumId w:val="21"/>
   </w:num>
   <w:num w:numId="34" w16cid:durableId="763064616">
-    <w:abstractNumId w:val="36"/>
+    <w:abstractNumId w:val="37"/>
   </w:num>
   <w:num w:numId="35" w16cid:durableId="481195516">
     <w:abstractNumId w:val="13"/>
   </w:num>
   <w:num w:numId="36" w16cid:durableId="1067534202">
-    <w:abstractNumId w:val="43"/>
+    <w:abstractNumId w:val="44"/>
   </w:num>
   <w:num w:numId="37" w16cid:durableId="1271402247">
-    <w:abstractNumId w:val="45"/>
+    <w:abstractNumId w:val="46"/>
   </w:num>
   <w:num w:numId="38" w16cid:durableId="1723824251">
-    <w:abstractNumId w:val="21"/>
+    <w:abstractNumId w:val="22"/>
   </w:num>
   <w:num w:numId="39" w16cid:durableId="545145559">
     <w:abstractNumId w:val="2"/>
   </w:num>
   <w:num w:numId="40" w16cid:durableId="1538007799">
-    <w:abstractNumId w:val="40"/>
+    <w:abstractNumId w:val="41"/>
   </w:num>
   <w:num w:numId="41" w16cid:durableId="151679100">
     <w:abstractNumId w:val="6"/>
@@ -10913,19 +11112,22 @@
     <w:abstractNumId w:val="7"/>
   </w:num>
   <w:num w:numId="43" w16cid:durableId="785393384">
-    <w:abstractNumId w:val="27"/>
+    <w:abstractNumId w:val="28"/>
   </w:num>
   <w:num w:numId="44" w16cid:durableId="993264226">
     <w:abstractNumId w:val="1"/>
   </w:num>
   <w:num w:numId="45" w16cid:durableId="273287179">
-    <w:abstractNumId w:val="19"/>
+    <w:abstractNumId w:val="20"/>
   </w:num>
   <w:num w:numId="46" w16cid:durableId="213275907">
-    <w:abstractNumId w:val="18"/>
+    <w:abstractNumId w:val="19"/>
   </w:num>
   <w:num w:numId="47" w16cid:durableId="1590310353">
     <w:abstractNumId w:val="0"/>
+  </w:num>
+  <w:num w:numId="48" w16cid:durableId="1541211727">
+    <w:abstractNumId w:val="15"/>
   </w:num>
 </w:numbering>
 </file>
@@ -11589,6 +11791,7 @@
   <w:style w:type="character" w:default="1" w:styleId="DefaultParagraphFont">
     <w:name w:val="Default Paragraph Font"/>
     <w:uiPriority w:val="1"/>
+    <w:semiHidden/>
     <w:unhideWhenUsed/>
   </w:style>
   <w:style w:type="table" w:default="1" w:styleId="TableNormal">
@@ -12932,6 +13135,7 @@
     <w:rsid w:val="009C0C40"/>
     <w:rsid w:val="009D185F"/>
     <w:rsid w:val="00A0380F"/>
+    <w:rsid w:val="00A04B4C"/>
     <w:rsid w:val="00A16840"/>
     <w:rsid w:val="00A9316A"/>
     <w:rsid w:val="00AA3301"/>
@@ -12953,6 +13157,7 @@
     <w:rsid w:val="00F57839"/>
     <w:rsid w:val="00F744D8"/>
     <w:rsid w:val="00F86607"/>
+    <w:rsid w:val="00F94122"/>
     <w:rsid w:val="00FA3901"/>
     <w:rsid w:val="00FE7648"/>
     <w:rsid w:val="00FF679D"/>
@@ -13741,18 +13946,32 @@
 </file>
 
 <file path=customXml/item1.xml><?xml version="1.0" encoding="utf-8"?>
-<p:properties xmlns:p="http://schemas.microsoft.com/office/2006/metadata/properties" xmlns:xsi="http://www.w3.org/2001/XMLSchema-instance" xmlns:pc="http://schemas.microsoft.com/office/infopath/2007/PartnerControls">
-  <documentManagement>
-    <TaxCatchAll xmlns="4de74af2-d2a7-4bc3-a319-420167317553" xsi:nil="true"/>
-    <ArchiverLinkFileType xmlns="c0991f74-233a-4c46-9c55-a176f0e8ba44" xsi:nil="true"/>
-    <lcf76f155ced4ddcb4097134ff3c332f xmlns="c0991f74-233a-4c46-9c55-a176f0e8ba44">
-      <Terms xmlns="http://schemas.microsoft.com/office/infopath/2007/PartnerControls"/>
-    </lcf76f155ced4ddcb4097134ff3c332f>
-  </documentManagement>
-</p:properties>
+<b:Sources xmlns:b="http://schemas.openxmlformats.org/officeDocument/2006/bibliography" xmlns="http://schemas.openxmlformats.org/officeDocument/2006/bibliography" SelectedStyle="/IEEE2006OfficeOnline.xsl" StyleName="IEEE" Version="2006">
+  <b:Source>
+    <b:Tag>Placeholder1</b:Tag>
+    <b:SourceType>Book</b:SourceType>
+    <b:Guid>{61C2BEB0-04B1-424E-AEC0-322EDBD1A18A}</b:Guid>
+    <b:RefOrder>2</b:RefOrder>
+  </b:Source>
+  <b:Source>
+    <b:Tag>Placeholder2</b:Tag>
+    <b:SourceType>Book</b:SourceType>
+    <b:Guid>{26E93F14-F601-D04A-A10D-E3BC3760B577}</b:Guid>
+    <b:RefOrder>1</b:RefOrder>
+  </b:Source>
+</b:Sources>
 </file>
 
 <file path=customXml/item2.xml><?xml version="1.0" encoding="utf-8"?>
+<?mso-contentType ?>
+<FormTemplates xmlns="http://schemas.microsoft.com/sharepoint/v3/contenttype/forms">
+  <Display>DocumentLibraryForm</Display>
+  <Edit>DocumentLibraryForm</Edit>
+  <New>DocumentLibraryForm</New>
+</FormTemplates>
+</file>
+
+<file path=customXml/item3.xml><?xml version="1.0" encoding="utf-8"?>
 <ct:contentTypeSchema xmlns:ct="http://schemas.microsoft.com/office/2006/metadata/contentType" xmlns:ma="http://schemas.microsoft.com/office/2006/metadata/properties/metaAttributes" ct:_="" ma:_="" ma:contentTypeName="Dokument" ma:contentTypeID="0x0101003A15E957932D6F4AB4FD28F85AF4FFD8" ma:contentTypeVersion="14" ma:contentTypeDescription="Ein neues Dokument erstellen." ma:contentTypeScope="" ma:versionID="e040dc8dbf4a4132031beaaf90e02bdd">
   <xsd:schema xmlns:xsd="http://www.w3.org/2001/XMLSchema" xmlns:xs="http://www.w3.org/2001/XMLSchema" xmlns:p="http://schemas.microsoft.com/office/2006/metadata/properties" xmlns:ns2="c0991f74-233a-4c46-9c55-a176f0e8ba44" xmlns:ns3="4de74af2-d2a7-4bc3-a319-420167317553" targetNamespace="http://schemas.microsoft.com/office/2006/metadata/properties" ma:root="true" ma:fieldsID="63fe477e893c7cf9e00d7d25e31408c1" ns2:_="" ns3:_="">
     <xsd:import namespace="c0991f74-233a-4c46-9c55-a176f0e8ba44"/>
@@ -13981,44 +14200,35 @@
 </ct:contentTypeSchema>
 </file>
 
-<file path=customXml/item3.xml><?xml version="1.0" encoding="utf-8"?>
-<?mso-contentType ?>
-<FormTemplates xmlns="http://schemas.microsoft.com/sharepoint/v3/contenttype/forms">
-  <Display>DocumentLibraryForm</Display>
-  <Edit>DocumentLibraryForm</Edit>
-  <New>DocumentLibraryForm</New>
-</FormTemplates>
-</file>
-
 <file path=customXml/item4.xml><?xml version="1.0" encoding="utf-8"?>
-<b:Sources xmlns:b="http://schemas.openxmlformats.org/officeDocument/2006/bibliography" xmlns="http://schemas.openxmlformats.org/officeDocument/2006/bibliography" SelectedStyle="/IEEE2006OfficeOnline.xsl" StyleName="IEEE" Version="2006">
-  <b:Source>
-    <b:Tag>Placeholder1</b:Tag>
-    <b:SourceType>Book</b:SourceType>
-    <b:Guid>{61C2BEB0-04B1-424E-AEC0-322EDBD1A18A}</b:Guid>
-    <b:RefOrder>2</b:RefOrder>
-  </b:Source>
-  <b:Source>
-    <b:Tag>Placeholder2</b:Tag>
-    <b:SourceType>Book</b:SourceType>
-    <b:Guid>{26E93F14-F601-D04A-A10D-E3BC3760B577}</b:Guid>
-    <b:RefOrder>1</b:RefOrder>
-  </b:Source>
-</b:Sources>
+<p:properties xmlns:p="http://schemas.microsoft.com/office/2006/metadata/properties" xmlns:xsi="http://www.w3.org/2001/XMLSchema-instance" xmlns:pc="http://schemas.microsoft.com/office/infopath/2007/PartnerControls">
+  <documentManagement>
+    <TaxCatchAll xmlns="4de74af2-d2a7-4bc3-a319-420167317553" xsi:nil="true"/>
+    <ArchiverLinkFileType xmlns="c0991f74-233a-4c46-9c55-a176f0e8ba44" xsi:nil="true"/>
+    <lcf76f155ced4ddcb4097134ff3c332f xmlns="c0991f74-233a-4c46-9c55-a176f0e8ba44">
+      <Terms xmlns="http://schemas.microsoft.com/office/infopath/2007/PartnerControls"/>
+    </lcf76f155ced4ddcb4097134ff3c332f>
+  </documentManagement>
+</p:properties>
 </file>
 
 <file path=customXml/itemProps1.xml><?xml version="1.0" encoding="utf-8"?>
-<ds:datastoreItem xmlns:ds="http://schemas.openxmlformats.org/officeDocument/2006/customXml" ds:itemID="{5DB99EA3-5A91-4DE8-9C2E-5E2756FB8116}">
+<ds:datastoreItem xmlns:ds="http://schemas.openxmlformats.org/officeDocument/2006/customXml" ds:itemID="{8ED87741-333E-524C-B42D-A34782CE569A}">
   <ds:schemaRefs>
-    <ds:schemaRef ds:uri="http://schemas.microsoft.com/office/2006/metadata/properties"/>
-    <ds:schemaRef ds:uri="http://schemas.microsoft.com/office/infopath/2007/PartnerControls"/>
-    <ds:schemaRef ds:uri="4de74af2-d2a7-4bc3-a319-420167317553"/>
-    <ds:schemaRef ds:uri="c0991f74-233a-4c46-9c55-a176f0e8ba44"/>
+    <ds:schemaRef ds:uri="http://schemas.openxmlformats.org/officeDocument/2006/bibliography"/>
   </ds:schemaRefs>
 </ds:datastoreItem>
 </file>
 
 <file path=customXml/itemProps2.xml><?xml version="1.0" encoding="utf-8"?>
+<ds:datastoreItem xmlns:ds="http://schemas.openxmlformats.org/officeDocument/2006/customXml" ds:itemID="{123745DA-69E4-464B-8AAF-512AB146EAEF}">
+  <ds:schemaRefs>
+    <ds:schemaRef ds:uri="http://schemas.microsoft.com/sharepoint/v3/contenttype/forms"/>
+  </ds:schemaRefs>
+</ds:datastoreItem>
+</file>
+
+<file path=customXml/itemProps3.xml><?xml version="1.0" encoding="utf-8"?>
 <ds:datastoreItem xmlns:ds="http://schemas.openxmlformats.org/officeDocument/2006/customXml" ds:itemID="{DB59158D-15C5-4DFF-AEB5-CA02C610712D}">
   <ds:schemaRefs>
     <ds:schemaRef ds:uri="http://schemas.microsoft.com/office/2006/metadata/contentType"/>
@@ -14037,18 +14247,13 @@
 </ds:datastoreItem>
 </file>
 
-<file path=customXml/itemProps3.xml><?xml version="1.0" encoding="utf-8"?>
-<ds:datastoreItem xmlns:ds="http://schemas.openxmlformats.org/officeDocument/2006/customXml" ds:itemID="{123745DA-69E4-464B-8AAF-512AB146EAEF}">
+<file path=customXml/itemProps4.xml><?xml version="1.0" encoding="utf-8"?>
+<ds:datastoreItem xmlns:ds="http://schemas.openxmlformats.org/officeDocument/2006/customXml" ds:itemID="{5DB99EA3-5A91-4DE8-9C2E-5E2756FB8116}">
   <ds:schemaRefs>
-    <ds:schemaRef ds:uri="http://schemas.microsoft.com/sharepoint/v3/contenttype/forms"/>
-  </ds:schemaRefs>
-</ds:datastoreItem>
-</file>
-
-<file path=customXml/itemProps4.xml><?xml version="1.0" encoding="utf-8"?>
-<ds:datastoreItem xmlns:ds="http://schemas.openxmlformats.org/officeDocument/2006/customXml" ds:itemID="{8ED87741-333E-524C-B42D-A34782CE569A}">
-  <ds:schemaRefs>
-    <ds:schemaRef ds:uri="http://schemas.openxmlformats.org/officeDocument/2006/bibliography"/>
+    <ds:schemaRef ds:uri="http://schemas.microsoft.com/office/2006/metadata/properties"/>
+    <ds:schemaRef ds:uri="http://schemas.microsoft.com/office/infopath/2007/PartnerControls"/>
+    <ds:schemaRef ds:uri="4de74af2-d2a7-4bc3-a319-420167317553"/>
+    <ds:schemaRef ds:uri="c0991f74-233a-4c46-9c55-a176f0e8ba44"/>
   </ds:schemaRefs>
 </ds:datastoreItem>
 </file>
</xml_diff>

<commit_message>
test pushing from mac
</commit_message>
<xml_diff>
--- a/Thesis Report Rafi.docx
+++ b/Thesis Report Rafi.docx
@@ -1820,6 +1820,9 @@
       </w:r>
       <w:r>
         <w:t xml:space="preserve"> </w:t>
+      </w:r>
+      <w:r>
+        <w:t>asfasfas</w:t>
       </w:r>
     </w:p>
     <w:p/>
@@ -13006,15 +13009,15 @@
   </w:font>
   <w:font w:name="Wingdings">
     <w:panose1 w:val="05000000000000000000"/>
-    <w:charset w:val="02"/>
-    <w:family w:val="auto"/>
+    <w:charset w:val="4D"/>
+    <w:family w:val="decorative"/>
     <w:pitch w:val="variable"/>
-    <w:sig w:usb0="00000000" w:usb1="10000000" w:usb2="00000000" w:usb3="00000000" w:csb0="80000000" w:csb1="00000000"/>
+    <w:sig w:usb0="00000003" w:usb1="00000000" w:usb2="00000000" w:usb3="00000000" w:csb0="80000001" w:csb1="00000000"/>
   </w:font>
   <w:font w:name="Symbol">
     <w:panose1 w:val="05050102010706020507"/>
     <w:charset w:val="02"/>
-    <w:family w:val="roman"/>
+    <w:family w:val="decorative"/>
     <w:pitch w:val="variable"/>
     <w:sig w:usb0="00000000" w:usb1="10000000" w:usb2="00000000" w:usb3="00000000" w:csb0="80000000" w:csb1="00000000"/>
   </w:font>
@@ -13041,6 +13044,8 @@
     <w:sig w:usb0="E4002EFF" w:usb1="C200247B" w:usb2="00000009" w:usb3="00000000" w:csb0="000001FF" w:csb1="00000000"/>
   </w:font>
   <w:font w:name="Yu Mincho">
+    <w:altName w:val="游明朝"/>
+    <w:panose1 w:val="02020400000000000000"/>
     <w:charset w:val="80"/>
     <w:family w:val="roman"/>
     <w:pitch w:val="variable"/>
@@ -13054,12 +13059,14 @@
     <w:sig w:usb0="E00006FF" w:usb1="420024FF" w:usb2="02000000" w:usb3="00000000" w:csb0="0000019F" w:csb1="00000000"/>
   </w:font>
   <w:font w:name="Aptos">
+    <w:panose1 w:val="020B0604020202020204"/>
     <w:charset w:val="00"/>
     <w:family w:val="swiss"/>
     <w:pitch w:val="variable"/>
     <w:sig w:usb0="20000287" w:usb1="00000003" w:usb2="00000000" w:usb3="00000000" w:csb0="0000019F" w:csb1="00000000"/>
   </w:font>
   <w:font w:name="Aptos Display">
+    <w:panose1 w:val="020B0004020202020204"/>
     <w:charset w:val="00"/>
     <w:family w:val="swiss"/>
     <w:pitch w:val="variable"/>
@@ -13112,6 +13119,7 @@
     <w:rsid w:val="005A2D59"/>
     <w:rsid w:val="005B691E"/>
     <w:rsid w:val="005D6A23"/>
+    <w:rsid w:val="005E2A9C"/>
     <w:rsid w:val="0062143D"/>
     <w:rsid w:val="00636444"/>
     <w:rsid w:val="00643BB4"/>
@@ -13159,6 +13167,7 @@
     <w:rsid w:val="00F86607"/>
     <w:rsid w:val="00F94122"/>
     <w:rsid w:val="00FA3901"/>
+    <w:rsid w:val="00FB7667"/>
     <w:rsid w:val="00FE7648"/>
     <w:rsid w:val="00FF679D"/>
   </w:rsids>
@@ -13177,8 +13186,8 @@
   </m:mathPr>
   <w:themeFontLang w:val="en-US" w:eastAsia="ja-JP"/>
   <w:clrSchemeMapping w:bg1="light1" w:t1="dark1" w:bg2="light2" w:t2="dark2" w:accent1="accent1" w:accent2="accent2" w:accent3="accent3" w:accent4="accent4" w:accent5="accent5" w:accent6="accent6" w:hyperlink="hyperlink" w:followedHyperlink="followedHyperlink"/>
-  <w:decimalSymbol w:val=","/>
-  <w:listSeparator w:val=";"/>
+  <w:decimalSymbol w:val="."/>
+  <w:listSeparator w:val=","/>
   <w15:chartTrackingRefBased/>
 </w:settings>
 </file>
@@ -13963,12 +13972,15 @@
 </file>
 
 <file path=customXml/item2.xml><?xml version="1.0" encoding="utf-8"?>
-<?mso-contentType ?>
-<FormTemplates xmlns="http://schemas.microsoft.com/sharepoint/v3/contenttype/forms">
-  <Display>DocumentLibraryForm</Display>
-  <Edit>DocumentLibraryForm</Edit>
-  <New>DocumentLibraryForm</New>
-</FormTemplates>
+<p:properties xmlns:p="http://schemas.microsoft.com/office/2006/metadata/properties" xmlns:xsi="http://www.w3.org/2001/XMLSchema-instance" xmlns:pc="http://schemas.microsoft.com/office/infopath/2007/PartnerControls">
+  <documentManagement>
+    <TaxCatchAll xmlns="4de74af2-d2a7-4bc3-a319-420167317553" xsi:nil="true"/>
+    <ArchiverLinkFileType xmlns="c0991f74-233a-4c46-9c55-a176f0e8ba44" xsi:nil="true"/>
+    <lcf76f155ced4ddcb4097134ff3c332f xmlns="c0991f74-233a-4c46-9c55-a176f0e8ba44">
+      <Terms xmlns="http://schemas.microsoft.com/office/infopath/2007/PartnerControls"/>
+    </lcf76f155ced4ddcb4097134ff3c332f>
+  </documentManagement>
+</p:properties>
 </file>
 
 <file path=customXml/item3.xml><?xml version="1.0" encoding="utf-8"?>
@@ -14201,15 +14213,12 @@
 </file>
 
 <file path=customXml/item4.xml><?xml version="1.0" encoding="utf-8"?>
-<p:properties xmlns:p="http://schemas.microsoft.com/office/2006/metadata/properties" xmlns:xsi="http://www.w3.org/2001/XMLSchema-instance" xmlns:pc="http://schemas.microsoft.com/office/infopath/2007/PartnerControls">
-  <documentManagement>
-    <TaxCatchAll xmlns="4de74af2-d2a7-4bc3-a319-420167317553" xsi:nil="true"/>
-    <ArchiverLinkFileType xmlns="c0991f74-233a-4c46-9c55-a176f0e8ba44" xsi:nil="true"/>
-    <lcf76f155ced4ddcb4097134ff3c332f xmlns="c0991f74-233a-4c46-9c55-a176f0e8ba44">
-      <Terms xmlns="http://schemas.microsoft.com/office/infopath/2007/PartnerControls"/>
-    </lcf76f155ced4ddcb4097134ff3c332f>
-  </documentManagement>
-</p:properties>
+<?mso-contentType ?>
+<FormTemplates xmlns="http://schemas.microsoft.com/sharepoint/v3/contenttype/forms">
+  <Display>DocumentLibraryForm</Display>
+  <Edit>DocumentLibraryForm</Edit>
+  <New>DocumentLibraryForm</New>
+</FormTemplates>
 </file>
 
 <file path=customXml/itemProps1.xml><?xml version="1.0" encoding="utf-8"?>
@@ -14221,9 +14230,12 @@
 </file>
 
 <file path=customXml/itemProps2.xml><?xml version="1.0" encoding="utf-8"?>
-<ds:datastoreItem xmlns:ds="http://schemas.openxmlformats.org/officeDocument/2006/customXml" ds:itemID="{123745DA-69E4-464B-8AAF-512AB146EAEF}">
+<ds:datastoreItem xmlns:ds="http://schemas.openxmlformats.org/officeDocument/2006/customXml" ds:itemID="{5DB99EA3-5A91-4DE8-9C2E-5E2756FB8116}">
   <ds:schemaRefs>
-    <ds:schemaRef ds:uri="http://schemas.microsoft.com/sharepoint/v3/contenttype/forms"/>
+    <ds:schemaRef ds:uri="http://schemas.microsoft.com/office/2006/metadata/properties"/>
+    <ds:schemaRef ds:uri="http://schemas.microsoft.com/office/infopath/2007/PartnerControls"/>
+    <ds:schemaRef ds:uri="4de74af2-d2a7-4bc3-a319-420167317553"/>
+    <ds:schemaRef ds:uri="c0991f74-233a-4c46-9c55-a176f0e8ba44"/>
   </ds:schemaRefs>
 </ds:datastoreItem>
 </file>
@@ -14248,12 +14260,9 @@
 </file>
 
 <file path=customXml/itemProps4.xml><?xml version="1.0" encoding="utf-8"?>
-<ds:datastoreItem xmlns:ds="http://schemas.openxmlformats.org/officeDocument/2006/customXml" ds:itemID="{5DB99EA3-5A91-4DE8-9C2E-5E2756FB8116}">
+<ds:datastoreItem xmlns:ds="http://schemas.openxmlformats.org/officeDocument/2006/customXml" ds:itemID="{123745DA-69E4-464B-8AAF-512AB146EAEF}">
   <ds:schemaRefs>
-    <ds:schemaRef ds:uri="http://schemas.microsoft.com/office/2006/metadata/properties"/>
-    <ds:schemaRef ds:uri="http://schemas.microsoft.com/office/infopath/2007/PartnerControls"/>
-    <ds:schemaRef ds:uri="4de74af2-d2a7-4bc3-a319-420167317553"/>
-    <ds:schemaRef ds:uri="c0991f74-233a-4c46-9c55-a176f0e8ba44"/>
+    <ds:schemaRef ds:uri="http://schemas.microsoft.com/sharepoint/v3/contenttype/forms"/>
   </ds:schemaRefs>
 </ds:datastoreItem>
 </file>
</xml_diff>

<commit_message>
Drafted MILP subsection in chapter 2
</commit_message>
<xml_diff>
--- a/Thesis Report Rafi.docx
+++ b/Thesis Report Rafi.docx
@@ -1047,21 +1047,7 @@
                 <w:rStyle w:val="Hyperlink"/>
                 <w:noProof/>
               </w:rPr>
-              <w:t>Power-to-X Integration for M</w:t>
-            </w:r>
-            <w:r>
-              <w:rPr>
-                <w:rStyle w:val="Hyperlink"/>
-                <w:noProof/>
-              </w:rPr>
-              <w:t>e</w:t>
-            </w:r>
-            <w:r>
-              <w:rPr>
-                <w:rStyle w:val="Hyperlink"/>
-                <w:noProof/>
-              </w:rPr>
-              <w:t>thanol Synthesis System</w:t>
+              <w:t>Power-to-X Integration for Methanol Synthesis System</w:t>
             </w:r>
             <w:r>
               <w:rPr>
@@ -2769,6 +2755,25 @@
     </w:p>
     <w:p/>
     <w:p>
+      <w:pPr>
+        <w:pStyle w:val="ListParagraph"/>
+        <w:numPr>
+          <w:ilvl w:val="0"/>
+          <w:numId w:val="49"/>
+        </w:numPr>
+        <w:rPr>
+          <w:color w:val="EE0000"/>
+        </w:rPr>
+      </w:pPr>
+      <w:r>
+        <w:rPr>
+          <w:color w:val="EE0000"/>
+        </w:rPr>
+        <w:t>Table of combination of biogas reactor and electrolyzer technology with LCOM attached to it and its reference</w:t>
+      </w:r>
+    </w:p>
+    <w:p/>
+    <w:p>
       <w:r>
         <w:t>In the integrated configuration, the electrolyzer produces both hydrogen and oxygen. Hydrogen is compressed and supplied to the methanol synthesis reactor, while the co-produced oxygen can be utilized in an autothermal reformer (ATR) to convert methane (e.g., from biogas) into syngas. The biomass-derived and electrolysis-derived streams are thus combined upstream of, or within, the methanol synthesis loop. [NEED REFERENCE: process integration scheme describing oxygen use in ATR and hydrogen blending in methanol synthesis]</w:t>
       </w:r>
@@ -2793,11 +2798,11 @@
     <w:p/>
     <w:p>
       <w:r>
-        <w:t xml:space="preserve">Despite these advantages, several bottlenecks challenge the feasibility of hybrid methanol systems. These include electrolyzer utilization rates, electricity price volatility, capital cost and lifetime of electrolyzer stacks, as well as the integration of oxygen and heat streams. For example, it has been reported that high electrolyzer capacity factors are required for competitive e-methanol production, and that full-carbon-conversion configurations become attractive only when improvements in </w:t>
+        <w:t xml:space="preserve">Despite these advantages, several bottlenecks challenge the feasibility of hybrid methanol systems. These include electrolyzer utilization rates, electricity price volatility, capital cost and lifetime of </w:t>
       </w:r>
       <w:r>
         <w:lastRenderedPageBreak/>
-        <w:t>electricity costs, stack lifetime, and capital expenditure are realized (e.g., https://doi.org/10.1016/j.fuel.2021.122113). Oxygen management represents an additional practical constraint: while direct integration of oxygen streams may reduce the need for large-scale oxygen storage and improve capital efficiency and safety, this is contingent on matching oxygen supply and demand within the plant (e.g., https://doi.org/10.3389/fenrg.2021.795673). [NEED REFERENCE: quantitative analysis of oxygen balancing and storage requirements in hybrid systems]</w:t>
+        <w:t>electrolyzer stacks, as well as the integration of oxygen and heat streams. For example, it has been reported that high electrolyzer capacity factors are required for competitive e-methanol production, and that full-carbon-conversion configurations become attractive only when improvements in electricity costs, stack lifetime, and capital expenditure are realized (e.g., https://doi.org/10.1016/j.fuel.2021.122113). Oxygen management represents an additional practical constraint: while direct integration of oxygen streams may reduce the need for large-scale oxygen storage and improve capital efficiency and safety, this is contingent on matching oxygen supply and demand within the plant (e.g., https://doi.org/10.3389/fenrg.2021.795673). [NEED REFERENCE: quantitative analysis of oxygen balancing and storage requirements in hybrid systems]</w:t>
       </w:r>
     </w:p>
     <w:p/>
@@ -2887,6 +2892,7 @@
         </w:numPr>
       </w:pPr>
       <w:r>
+        <w:lastRenderedPageBreak/>
         <w:t>The gap that MILP has that incentivizes the use of RL for optimizing a complex polygeneration system</w:t>
       </w:r>
     </w:p>
@@ -2905,14 +2911,103 @@
         <w:rPr>
           <w:kern w:val="0"/>
         </w:rPr>
-        <w:lastRenderedPageBreak/>
-        <w:t>MILP, or Mixed-Integer Linear Programming, has been used as a tool to optimize different kinds of energy or industrial plants by linearizing the model of these processes and setting up a linear objective function to either maximize or minimize a specific KPI based on the optimization objective []. In an energy system that includes the flow of electricity, heat, and mass, the constraints considered will then dictate how the balance of the system should behave, the minimum and maximum operational dispatch, and the evolution of the storage state of charge, if storage exists. On the other hand, the objective function mainly includes the capital expenditure (CAPEX) and operational expenditure (OPEX) of the models defined in the system. Together, MILP will generate a global equation that takes into account the constraints and the objective function, and using the MILP solver, it will conduct the process of relaxation, branch, and bound to find the valleys or hills within the linear boundaries. </w:t>
-      </w:r>
-      <w:r>
-        <w:rPr>
+        <w:t xml:space="preserve">MILP, or Mixed-Integer Linear Programming, has been used as a tool to optimize different kinds of energy or industrial plants by linearizing the model of these processes and setting up a linear objective function to either maximize or minimize a specific KPI based on the optimization objective []. In an energy system that includes the flow of electricity, heat, and mass, the constraints considered will then dictate how the balance of the system should behave, the minimum and maximum operational dispatch, and the evolution of the storage state of charge, if storage exists. </w:t>
+      </w:r>
+    </w:p>
+    <w:p>
+      <w:pPr>
+        <w:pStyle w:val="ListParagraph"/>
+        <w:numPr>
+          <w:ilvl w:val="0"/>
+          <w:numId w:val="48"/>
+        </w:numPr>
+        <w:rPr>
+          <w:color w:val="EE0000"/>
           <w:kern w:val="0"/>
         </w:rPr>
-        <w:t>In practice, MILP has been used as the reference method for operational optimization, demand response, secheduling in energy communities, industrial plants, and integrated multi-energy systems because it produces globally optimal solutions to the defined linear problem when sufficient computation time is available</w:t>
+      </w:pPr>
+      <w:r>
+        <w:rPr>
+          <w:color w:val="EE0000"/>
+          <w:kern w:val="0"/>
+        </w:rPr>
+        <w:t>Equations considered in the MILP formulation</w:t>
+      </w:r>
+    </w:p>
+    <w:p>
+      <w:pPr>
+        <w:rPr>
+          <w:kern w:val="0"/>
+        </w:rPr>
+      </w:pPr>
+      <w:r>
+        <w:rPr>
+          <w:kern w:val="0"/>
+        </w:rPr>
+        <w:t xml:space="preserve">On the other hand, the objective function mainly includes the capital expenditure (CAPEX) and operational expenditure (OPEX) of the models defined in the system. </w:t>
+      </w:r>
+    </w:p>
+    <w:p>
+      <w:pPr>
+        <w:pStyle w:val="ListParagraph"/>
+        <w:numPr>
+          <w:ilvl w:val="0"/>
+          <w:numId w:val="48"/>
+        </w:numPr>
+        <w:rPr>
+          <w:color w:val="EE0000"/>
+          <w:kern w:val="0"/>
+        </w:rPr>
+      </w:pPr>
+      <w:r>
+        <w:rPr>
+          <w:color w:val="EE0000"/>
+          <w:kern w:val="0"/>
+        </w:rPr>
+        <w:t>How CAPEX and OPEX is defined in MILP as linear equations</w:t>
+      </w:r>
+    </w:p>
+    <w:p>
+      <w:pPr>
+        <w:rPr>
+          <w:kern w:val="0"/>
+        </w:rPr>
+      </w:pPr>
+      <w:r>
+        <w:rPr>
+          <w:kern w:val="0"/>
+        </w:rPr>
+        <w:t xml:space="preserve">Together, </w:t>
+      </w:r>
+      <w:r>
+        <w:rPr>
+          <w:kern w:val="0"/>
+        </w:rPr>
+        <w:t>the MILP will generate a global equation that accounts for the constraints and the objective function, and, using the MILP solver, it will perform relaxation</w:t>
+      </w:r>
+      <w:r>
+        <w:rPr>
+          <w:kern w:val="0"/>
+        </w:rPr>
+        <w:t xml:space="preserve"> and</w:t>
+      </w:r>
+      <w:r>
+        <w:rPr>
+          <w:kern w:val="0"/>
+        </w:rPr>
+        <w:t xml:space="preserve"> branch-and-bound</w:t>
+      </w:r>
+      <w:r>
+        <w:rPr>
+          <w:kern w:val="0"/>
+        </w:rPr>
+        <w:t xml:space="preserve"> to find the valleys or hills within the linear boundaries. </w:t>
+      </w:r>
+      <w:r>
+        <w:rPr>
+          <w:kern w:val="0"/>
+        </w:rPr>
+        <w:t>In practice, MILP has been used as the reference method for operational optimization, demand response, scheduling in energy communities, industrial plants, and integrated multi-energy systems because it produces globally optimal solutions to the defined linear problem when sufficient computation time is available</w:t>
       </w:r>
       <w:r>
         <w:rPr>
@@ -2996,42 +3091,298 @@
         </w:rPr>
         <w:t xml:space="preserve">. </w:t>
       </w:r>
-    </w:p>
-    <w:p>
-      <w:pPr>
+      <w:r>
         <w:rPr>
           <w:kern w:val="0"/>
         </w:rPr>
-      </w:pPr>
-    </w:p>
-    <w:p>
-      <w:pPr>
+        <w:t xml:space="preserve">MINLP is utilized when the non-linear physics of the assigned system is prevalent, but as the system gets bigger and more variables are involved, the problem can grow exponentially to the point where it is extremely difficult to solve. Stochastic programming addresses uncertainty by executing the system in many scenarios, but its computational burden rises sharply with scenario count and system size. Metaheuristics such as Particle Swarm Optimization (PSO) and Genetic Algorithm (GA) are widely used for non-linear multiobjective hybrid energy problem due to its flexibility and robustness, however, they do not guarantee the global optamility in comparison to the MILP counterpart. There is also a hybrid approach that is usually called a bilevel formulation, where it separates the optimization process of sizing selection using a metaheuristic approach and </w:t>
+      </w:r>
+      <w:r>
         <w:rPr>
           <w:kern w:val="0"/>
         </w:rPr>
-      </w:pPr>
-    </w:p>
-    <w:p>
-      <w:pPr>
+        <w:lastRenderedPageBreak/>
+        <w:t xml:space="preserve">operational dispatch optimization using approach like MILP or RL. This will be discussed even further in depth in </w:t>
+      </w:r>
+      <w:r>
         <w:rPr>
           <w:kern w:val="0"/>
         </w:rPr>
-      </w:pPr>
-    </w:p>
-    <w:p/>
-    <w:p/>
+        <w:t xml:space="preserve">another </w:t>
+      </w:r>
+      <w:r>
+        <w:rPr>
+          <w:kern w:val="0"/>
+        </w:rPr>
+        <w:t>sub-</w:t>
+      </w:r>
+      <w:commentRangeStart w:id="10"/>
+      <w:r>
+        <w:rPr>
+          <w:kern w:val="0"/>
+        </w:rPr>
+        <w:t>section</w:t>
+      </w:r>
+      <w:commentRangeEnd w:id="10"/>
+      <w:r>
+        <w:rPr>
+          <w:rStyle w:val="CommentReference"/>
+          <w:kern w:val="0"/>
+          <w:sz w:val="24"/>
+          <w:szCs w:val="22"/>
+        </w:rPr>
+        <w:commentReference w:id="10"/>
+      </w:r>
+      <w:r>
+        <w:rPr>
+          <w:kern w:val="0"/>
+        </w:rPr>
+        <w:t xml:space="preserve">. </w:t>
+      </w:r>
+    </w:p>
+    <w:p>
+      <w:pPr>
+        <w:rPr>
+          <w:kern w:val="0"/>
+        </w:rPr>
+      </w:pPr>
+    </w:p>
+    <w:p>
+      <w:pPr>
+        <w:pStyle w:val="ListParagraph"/>
+        <w:numPr>
+          <w:ilvl w:val="0"/>
+          <w:numId w:val="48"/>
+        </w:numPr>
+        <w:rPr>
+          <w:color w:val="EE0000"/>
+          <w:kern w:val="0"/>
+        </w:rPr>
+      </w:pPr>
+      <w:r>
+        <w:rPr>
+          <w:color w:val="EE0000"/>
+          <w:kern w:val="0"/>
+        </w:rPr>
+        <w:t>Table of main advantage and disadvantage</w:t>
+      </w:r>
+      <w:r>
+        <w:rPr>
+          <w:color w:val="EE0000"/>
+          <w:kern w:val="0"/>
+        </w:rPr>
+        <w:t xml:space="preserve"> of different optimization approaches </w:t>
+      </w:r>
+    </w:p>
+    <w:p>
+      <w:pPr>
+        <w:rPr>
+          <w:color w:val="EE0000"/>
+          <w:kern w:val="0"/>
+        </w:rPr>
+      </w:pPr>
+    </w:p>
+    <w:p>
+      <w:pPr>
+        <w:rPr>
+          <w:kern w:val="0"/>
+        </w:rPr>
+      </w:pPr>
+      <w:r>
+        <w:rPr>
+          <w:kern w:val="0"/>
+        </w:rPr>
+        <w:t>MILP has been used a lot of times in the literature to optimize different kinds of polygeneration system. A similar study that researches the use of MILP to optimize a similar system of hybrid biomass power-to-methanol system showed that MILP discovered optimal sizing and dispatch that results in LCOM of 805 EUR /t under the assumption of high biogas availability. This system adopts a configuration consisting of a low-pressure AWE, absorption-based CO2 capture, and steam production from methanol purge gas for internal heat supply [</w:t>
+      </w:r>
+      <w:r>
+        <w:rPr>
+          <w:kern w:val="0"/>
+        </w:rPr>
+        <w:t>10.1515/psr-2020-0058</w:t>
+      </w:r>
+      <w:r>
+        <w:rPr>
+          <w:kern w:val="0"/>
+        </w:rPr>
+        <w:t>]. In one energy-community case, MILP has been used to optimize jointly design and operate distributed polygeneration with district heatng and cooling, storage, and energy sharing, showing clear cost-emissions tradeoffs. The result showed two results can come out depending on objective function emphasis of either 24.3% CO2 emission cut at 1.9% cost increase or 31.9% CO2 cut with a 2.22.2% CO2 emissions increase [</w:t>
+      </w:r>
+      <w:r>
+        <w:rPr>
+          <w:kern w:val="0"/>
+        </w:rPr>
+        <w:t>10.3390/en17133085</w:t>
+      </w:r>
+      <w:r>
+        <w:rPr>
+          <w:kern w:val="0"/>
+        </w:rPr>
+        <w:t xml:space="preserve">]. </w:t>
+      </w:r>
+    </w:p>
+    <w:p>
+      <w:pPr>
+        <w:rPr>
+          <w:color w:val="EE0000"/>
+          <w:kern w:val="0"/>
+        </w:rPr>
+      </w:pPr>
+    </w:p>
+    <w:p>
+      <w:pPr>
+        <w:rPr>
+          <w:kern w:val="0"/>
+        </w:rPr>
+      </w:pPr>
+      <w:commentRangeStart w:id="11"/>
+      <w:r>
+        <w:rPr>
+          <w:kern w:val="0"/>
+        </w:rPr>
+        <w:t xml:space="preserve">The key strength of MILP is the deterministic model that it offers on the modeled problem. If the system can be expressed with linear relationships, MILP guarantees an optimal solution to that formulation, which makes it highly attractive for sizing and dispatching problems with hard operational constraints []. </w:t>
+      </w:r>
+      <w:r>
+        <w:rPr>
+          <w:kern w:val="0"/>
+        </w:rPr>
+        <w:t>Other than that, every constraint, feasibility, and infeasibility are explicit and can be traced to how the system is defined, thus it has the benefit of easier interpretability and debugging. Due to the exactness and deterministic model, MILP becomes a great baseline for benchmarking novel methodologies such as RL [].</w:t>
+      </w:r>
+    </w:p>
+    <w:p>
+      <w:pPr>
+        <w:rPr>
+          <w:kern w:val="0"/>
+        </w:rPr>
+      </w:pPr>
+    </w:p>
+    <w:p>
+      <w:pPr>
+        <w:rPr>
+          <w:kern w:val="0"/>
+        </w:rPr>
+      </w:pPr>
+      <w:r>
+        <w:rPr>
+          <w:kern w:val="0"/>
+        </w:rPr>
+        <w:t xml:space="preserve"> The main gap of MILP is that optimality is guareanteed only for the approximated linear model, not necessarily the real physical system []. Therefore, in the case of complex polygeneration system that contains nonlinear part-load efficiencies, thermal inertia, degradation, recycle interactions, and stochastic renewables, they often need to be simplified to their linear equivalent or linearized thorugh process such as piecewise linearization</w:t>
+      </w:r>
+      <w:r>
+        <w:rPr>
+          <w:kern w:val="0"/>
+        </w:rPr>
+        <w:t xml:space="preserve"> []</w:t>
+      </w:r>
+      <w:r>
+        <w:rPr>
+          <w:kern w:val="0"/>
+        </w:rPr>
+        <w:t xml:space="preserve">. Another significant drawback is also the computation time that significantly inreases with the number of non-convex definition, </w:t>
+      </w:r>
+      <w:r>
+        <w:rPr>
+          <w:kern w:val="0"/>
+        </w:rPr>
+        <w:lastRenderedPageBreak/>
+        <w:t xml:space="preserve">decision variables, and long horizon, which is the exact opposite to a trained RL agent that can run in millisecond after being trained, and results in a major limitation for real-time operation []. </w:t>
+      </w:r>
+      <w:commentRangeEnd w:id="11"/>
+      <w:r>
+        <w:rPr>
+          <w:rStyle w:val="CommentReference"/>
+          <w:kern w:val="0"/>
+          <w:sz w:val="24"/>
+          <w:szCs w:val="22"/>
+        </w:rPr>
+        <w:commentReference w:id="11"/>
+      </w:r>
+    </w:p>
+    <w:p>
+      <w:pPr>
+        <w:rPr>
+          <w:kern w:val="0"/>
+        </w:rPr>
+      </w:pPr>
+    </w:p>
+    <w:p>
+      <w:pPr>
+        <w:rPr>
+          <w:kern w:val="0"/>
+        </w:rPr>
+      </w:pPr>
+      <w:r>
+        <w:rPr>
+          <w:kern w:val="0"/>
+        </w:rPr>
+        <w:t>The reason why RL becomes interesting to explore is not because MILP is weak at optimization, rather that it is less suitable for fast repeated control when the environment is uncertain, partially observed, and dynamically changing [</w:t>
+      </w:r>
+      <w:r>
+        <w:rPr>
+          <w:kern w:val="0"/>
+        </w:rPr>
+        <w:t>10.3390/en18174489</w:t>
+      </w:r>
+      <w:r>
+        <w:rPr>
+          <w:kern w:val="0"/>
+        </w:rPr>
+        <w:t xml:space="preserve">, </w:t>
+      </w:r>
+      <w:r>
+        <w:rPr>
+          <w:kern w:val="0"/>
+        </w:rPr>
+        <w:t>10.48550/arxiv.2305.05484</w:t>
+      </w:r>
+      <w:r>
+        <w:rPr>
+          <w:kern w:val="0"/>
+        </w:rPr>
+        <w:t xml:space="preserve">, </w:t>
+      </w:r>
+      <w:r>
+        <w:rPr>
+          <w:kern w:val="0"/>
+        </w:rPr>
+        <w:t>10.3390/electronics13081459</w:t>
+      </w:r>
+      <w:r>
+        <w:rPr>
+          <w:kern w:val="0"/>
+        </w:rPr>
+        <w:t>]. In biomass power-to-methanol systems, this would matter when biomass quality, renewable power input, hydrogen availability, market signals, and flexible downstream deman vary over time, forcing frequent re-optimization under nonlinear couplings. In this nische, RL literature positions itself as a complementary method rather than a direct replacement for MILP, and MILP remains a robust baseline to validate the results of this RL approach [</w:t>
+      </w:r>
+      <w:r>
+        <w:rPr>
+          <w:kern w:val="0"/>
+        </w:rPr>
+        <w:t>10.48550/arxiv.2305.05484</w:t>
+      </w:r>
+      <w:r>
+        <w:rPr>
+          <w:kern w:val="0"/>
+        </w:rPr>
+        <w:t>].</w:t>
+      </w:r>
+    </w:p>
+    <w:p>
+      <w:pPr>
+        <w:rPr>
+          <w:kern w:val="0"/>
+        </w:rPr>
+      </w:pPr>
+    </w:p>
     <w:p>
       <w:pPr>
         <w:pStyle w:val="Heading2"/>
       </w:pPr>
-      <w:bookmarkStart w:id="10" w:name="_Toc235289155"/>
+      <w:bookmarkStart w:id="12" w:name="_Toc235289155"/>
       <w:r>
         <w:t>State-of-the</w:t>
       </w:r>
       <w:r>
         <w:t>-art RL in Optimizing Energy System and Industrial Processes</w:t>
       </w:r>
-      <w:bookmarkEnd w:id="10"/>
+      <w:bookmarkEnd w:id="12"/>
       <w:r>
         <w:t xml:space="preserve"> </w:t>
       </w:r>
@@ -3133,7 +3484,6 @@
         </w:numPr>
       </w:pPr>
       <w:r>
-        <w:lastRenderedPageBreak/>
         <w:t>Diagram of MDP process</w:t>
       </w:r>
     </w:p>
@@ -3392,7 +3742,11 @@
         <w:t xml:space="preserve"> </w:t>
       </w:r>
       <w:r>
-        <w:t>to map the maximum value ofver all possible policies:</w:t>
+        <w:t xml:space="preserve">to map the maximum value ofver all </w:t>
+      </w:r>
+      <w:r>
+        <w:lastRenderedPageBreak/>
+        <w:t>possible policies:</w:t>
       </w:r>
     </w:p>
     <w:p>
@@ -3750,11 +4104,7 @@
         <w:t xml:space="preserve">chooses an action that returns best estimated value. </w:t>
       </w:r>
       <w:r>
-        <w:t xml:space="preserve">Some example of </w:t>
-      </w:r>
-      <w:r>
-        <w:lastRenderedPageBreak/>
-        <w:t>value.based RL are Q-learning and Deep</w:t>
+        <w:t>Some example of value.based RL are Q-learning and Deep</w:t>
       </w:r>
       <w:r>
         <w:t xml:space="preserve"> Q Network (</w:t>
@@ -3880,7 +4230,11 @@
         <w:t>a value-based approach, howe</w:t>
       </w:r>
       <w:r>
-        <w:t>ver, since energy problem are often continuous, high-dimensional, and constrained, policy-based approach are usually preferred</w:t>
+        <w:t xml:space="preserve">ver, since energy problem are often continuous, high-dimensional, and constrained, policy-based approach are </w:t>
+      </w:r>
+      <w:r>
+        <w:lastRenderedPageBreak/>
+        <w:t>usually preferred</w:t>
       </w:r>
       <w:r>
         <w:t xml:space="preserve"> </w:t>
@@ -3980,11 +4334,11 @@
       <w:pPr>
         <w:pStyle w:val="Heading2"/>
       </w:pPr>
-      <w:bookmarkStart w:id="11" w:name="_Toc235289156"/>
+      <w:bookmarkStart w:id="13" w:name="_Toc235289156"/>
       <w:r>
         <w:t>RL vs MILP for Different Applications</w:t>
       </w:r>
-      <w:bookmarkEnd w:id="11"/>
+      <w:bookmarkEnd w:id="13"/>
     </w:p>
     <w:p>
       <w:pPr>
@@ -4167,14 +4521,7 @@
         <w:rPr>
           <w:color w:val="000000"/>
         </w:rPr>
-        <w:t xml:space="preserve">the reference scenario </w:t>
-      </w:r>
-      <w:r>
-        <w:rPr>
-          <w:color w:val="000000"/>
-        </w:rPr>
-        <w:lastRenderedPageBreak/>
-        <w:t xml:space="preserve">with MILP having </w:t>
+        <w:t xml:space="preserve">the reference scenario with MILP having </w:t>
       </w:r>
       <w:r>
         <w:rPr>
@@ -4350,12 +4697,19 @@
         <w:rPr>
           <w:color w:val="000000"/>
         </w:rPr>
-        <w:t xml:space="preserve"> and optimize</w:t>
+        <w:t xml:space="preserve"> and </w:t>
       </w:r>
       <w:r>
         <w:rPr>
           <w:color w:val="000000"/>
         </w:rPr>
+        <w:lastRenderedPageBreak/>
+        <w:t>optimize</w:t>
+      </w:r>
+      <w:r>
+        <w:rPr>
+          <w:color w:val="000000"/>
+        </w:rPr>
         <w:t xml:space="preserve"> the performance of RL and MILP</w:t>
       </w:r>
       <w:r>
@@ -4658,38 +5012,52 @@
         <w:rPr>
           <w:color w:val="000000"/>
         </w:rPr>
-        <w:t xml:space="preserve">. According to the authors of the study, this poorer </w:t>
+        <w:t>. According to the authors of the study, this poorer performance of RL could be due to a lot of reasons, two of the notable reasons includ</w:t>
       </w:r>
       <w:r>
         <w:rPr>
           <w:color w:val="000000"/>
         </w:rPr>
-        <w:lastRenderedPageBreak/>
-        <w:t>performance of RL could be due to a lot of reasons, two of the notable reasons includ</w:t>
+        <w:t xml:space="preserve">e hyperparameter tuning and </w:t>
       </w:r>
       <w:r>
         <w:rPr>
           <w:color w:val="000000"/>
         </w:rPr>
-        <w:t xml:space="preserve">e hyperparameter tuning and </w:t>
+        <w:t xml:space="preserve">outdated </w:t>
       </w:r>
       <w:r>
         <w:rPr>
           <w:color w:val="000000"/>
         </w:rPr>
-        <w:t xml:space="preserve">outdated </w:t>
+        <w:t>chosen RL algorithm that</w:t>
       </w:r>
       <w:r>
         <w:rPr>
           <w:color w:val="000000"/>
         </w:rPr>
-        <w:t>chosen RL algorithm that</w:t>
-      </w:r>
-      <w:r>
+        <w:t xml:space="preserve"> was developed in 1992. </w:t>
+      </w:r>
+    </w:p>
+    <w:p>
+      <w:pPr>
         <w:rPr>
           <w:color w:val="000000"/>
         </w:rPr>
-        <w:t xml:space="preserve"> was developed in 1992. </w:t>
+      </w:pPr>
+    </w:p>
+    <w:p>
+      <w:pPr>
+        <w:pStyle w:val="Heading2"/>
+      </w:pPr>
+      <w:r>
+        <w:t xml:space="preserve">Hybrid Bayesian Optimization and MILP or RL </w:t>
+      </w:r>
+      <w:r>
+        <w:t xml:space="preserve">as </w:t>
+      </w:r>
+      <w:r>
+        <w:t>Bilevel Formulation</w:t>
       </w:r>
     </w:p>
     <w:p>
@@ -4720,20 +5088,6 @@
         </w:rPr>
       </w:pPr>
     </w:p>
-    <w:p>
-      <w:pPr>
-        <w:rPr>
-          <w:color w:val="000000"/>
-        </w:rPr>
-      </w:pPr>
-    </w:p>
-    <w:p>
-      <w:pPr>
-        <w:rPr>
-          <w:color w:val="000000"/>
-        </w:rPr>
-      </w:pPr>
-    </w:p>
     <w:p/>
     <w:p>
       <w:r>
@@ -4744,22 +5098,22 @@
       <w:pPr>
         <w:pStyle w:val="Heading1"/>
       </w:pPr>
-      <w:bookmarkStart w:id="12" w:name="_Toc235289157"/>
+      <w:bookmarkStart w:id="14" w:name="_Toc235289157"/>
       <w:r>
         <w:lastRenderedPageBreak/>
         <w:t>Methodology</w:t>
       </w:r>
-      <w:bookmarkEnd w:id="12"/>
+      <w:bookmarkEnd w:id="14"/>
     </w:p>
     <w:p>
       <w:pPr>
         <w:pStyle w:val="Heading2"/>
       </w:pPr>
-      <w:bookmarkStart w:id="13" w:name="_Toc235289158"/>
+      <w:bookmarkStart w:id="15" w:name="_Toc235289158"/>
       <w:r>
         <w:t>Hybrid Biomass Power-to-Methanol System Model</w:t>
       </w:r>
-      <w:bookmarkEnd w:id="13"/>
+      <w:bookmarkEnd w:id="15"/>
     </w:p>
     <w:p>
       <w:pPr>
@@ -4801,17 +5155,17 @@
       <w:pPr>
         <w:pStyle w:val="Heading2"/>
       </w:pPr>
-      <w:bookmarkStart w:id="14" w:name="_Toc235289159"/>
+      <w:bookmarkStart w:id="16" w:name="_Toc235289159"/>
       <w:r>
         <w:t>Two-steps Outerloop &amp; Innerloop Strategy</w:t>
       </w:r>
-      <w:bookmarkEnd w:id="14"/>
+      <w:bookmarkEnd w:id="16"/>
     </w:p>
     <w:p>
       <w:pPr>
         <w:pStyle w:val="Heading2"/>
       </w:pPr>
-      <w:bookmarkStart w:id="15" w:name="_Toc235289160"/>
+      <w:bookmarkStart w:id="17" w:name="_Toc235289160"/>
       <w:r>
         <w:t xml:space="preserve">Level 2 </w:t>
       </w:r>
@@ -4821,7 +5175,7 @@
       <w:r>
         <w:t>(MILP)</w:t>
       </w:r>
-      <w:bookmarkEnd w:id="15"/>
+      <w:bookmarkEnd w:id="17"/>
     </w:p>
     <w:p>
       <w:pPr>
@@ -4893,7 +5247,7 @@
       <w:pPr>
         <w:pStyle w:val="Heading2"/>
       </w:pPr>
-      <w:bookmarkStart w:id="16" w:name="_Toc235289161"/>
+      <w:bookmarkStart w:id="18" w:name="_Toc235289161"/>
       <w:r>
         <w:t xml:space="preserve">Level 3 </w:t>
       </w:r>
@@ -4903,7 +5257,7 @@
       <w:r>
         <w:t>(RL)</w:t>
       </w:r>
-      <w:bookmarkEnd w:id="16"/>
+      <w:bookmarkEnd w:id="18"/>
     </w:p>
     <w:p>
       <w:pPr>
@@ -4981,24 +5335,24 @@
       <w:pPr>
         <w:pStyle w:val="Heading2"/>
       </w:pPr>
-      <w:bookmarkStart w:id="17" w:name="_Toc235289162"/>
+      <w:bookmarkStart w:id="19" w:name="_Toc235289162"/>
       <w:r>
         <w:t>Data</w:t>
       </w:r>
-      <w:bookmarkEnd w:id="17"/>
+      <w:bookmarkEnd w:id="19"/>
     </w:p>
     <w:p>
       <w:pPr>
         <w:pStyle w:val="Heading2"/>
       </w:pPr>
-      <w:bookmarkStart w:id="18" w:name="_Toc235289163"/>
+      <w:bookmarkStart w:id="20" w:name="_Toc235289163"/>
       <w:r>
         <w:t>Comparison Stages</w:t>
       </w:r>
       <w:r>
         <w:t xml:space="preserve"> &amp; Scenario Definition</w:t>
       </w:r>
-      <w:bookmarkEnd w:id="18"/>
+      <w:bookmarkEnd w:id="20"/>
     </w:p>
     <w:p>
       <w:pPr>
@@ -5020,18 +5374,18 @@
           <w:numId w:val="22"/>
         </w:numPr>
       </w:pPr>
-      <w:commentRangeStart w:id="19"/>
+      <w:commentRangeStart w:id="21"/>
       <w:r>
         <w:t>Outerloop comparison</w:t>
       </w:r>
-      <w:commentRangeEnd w:id="19"/>
+      <w:commentRangeEnd w:id="21"/>
       <w:r>
         <w:rPr>
           <w:rStyle w:val="CommentReference"/>
           <w:sz w:val="24"/>
           <w:szCs w:val="22"/>
         </w:rPr>
-        <w:commentReference w:id="19"/>
+        <w:commentReference w:id="21"/>
       </w:r>
       <w:r>
         <w:t xml:space="preserve"> </w:t>
@@ -5088,7 +5442,7 @@
       <w:r>
         <w:t>.</w:t>
       </w:r>
-      <w:commentRangeStart w:id="20"/>
+      <w:commentRangeStart w:id="22"/>
     </w:p>
     <w:p>
       <w:pPr>
@@ -5104,14 +5458,14 @@
       <w:r>
         <w:t>Electricity Supply &amp; Power to X Optimization</w:t>
       </w:r>
-      <w:commentRangeEnd w:id="20"/>
+      <w:commentRangeEnd w:id="22"/>
       <w:r>
         <w:rPr>
           <w:rStyle w:val="CommentReference"/>
           <w:sz w:val="24"/>
           <w:szCs w:val="22"/>
         </w:rPr>
-        <w:commentReference w:id="20"/>
+        <w:commentReference w:id="22"/>
       </w:r>
     </w:p>
     <w:p>
@@ -5122,18 +5476,18 @@
           <w:numId w:val="22"/>
         </w:numPr>
       </w:pPr>
-      <w:commentRangeStart w:id="21"/>
+      <w:commentRangeStart w:id="23"/>
       <w:r>
         <w:t>Innerloop comparison</w:t>
       </w:r>
-      <w:commentRangeEnd w:id="21"/>
+      <w:commentRangeEnd w:id="23"/>
       <w:r>
         <w:rPr>
           <w:rStyle w:val="CommentReference"/>
           <w:sz w:val="24"/>
           <w:szCs w:val="22"/>
         </w:rPr>
-        <w:commentReference w:id="21"/>
+        <w:commentReference w:id="23"/>
       </w:r>
       <w:r>
         <w:t xml:space="preserve">: </w:t>
@@ -5285,7 +5639,7 @@
           <w:numId w:val="22"/>
         </w:numPr>
       </w:pPr>
-      <w:commentRangeStart w:id="22"/>
+      <w:commentRangeStart w:id="24"/>
       <w:r>
         <w:t xml:space="preserve">Stage </w:t>
       </w:r>
@@ -5307,21 +5661,21 @@
       <w:r>
         <w:t xml:space="preserve">vs </w:t>
       </w:r>
-      <w:commentRangeStart w:id="23"/>
+      <w:commentRangeStart w:id="25"/>
       <w:r>
         <w:t xml:space="preserve">BO </w:t>
       </w:r>
       <w:r>
         <w:t xml:space="preserve">Oemof Linear </w:t>
       </w:r>
-      <w:commentRangeEnd w:id="23"/>
+      <w:commentRangeEnd w:id="25"/>
       <w:r>
         <w:rPr>
           <w:rStyle w:val="CommentReference"/>
           <w:sz w:val="24"/>
           <w:szCs w:val="22"/>
         </w:rPr>
-        <w:commentReference w:id="23"/>
+        <w:commentReference w:id="25"/>
       </w:r>
       <w:r>
         <w:t>pathway</w:t>
@@ -5329,14 +5683,14 @@
       <w:r>
         <w:t xml:space="preserve"> </w:t>
       </w:r>
-      <w:commentRangeEnd w:id="22"/>
+      <w:commentRangeEnd w:id="24"/>
       <w:r>
         <w:rPr>
           <w:rStyle w:val="CommentReference"/>
           <w:sz w:val="24"/>
           <w:szCs w:val="22"/>
         </w:rPr>
-        <w:commentReference w:id="22"/>
+        <w:commentReference w:id="24"/>
       </w:r>
     </w:p>
     <w:p>
@@ -6038,19 +6392,19 @@
       <w:pPr>
         <w:pStyle w:val="Heading1"/>
       </w:pPr>
-      <w:bookmarkStart w:id="24" w:name="_Toc235289164"/>
+      <w:bookmarkStart w:id="26" w:name="_Toc235289164"/>
       <w:r>
         <w:lastRenderedPageBreak/>
         <w:t>Results and Discussions</w:t>
       </w:r>
-      <w:bookmarkEnd w:id="24"/>
+      <w:bookmarkEnd w:id="26"/>
     </w:p>
     <w:p>
       <w:pPr>
         <w:pStyle w:val="Heading2"/>
       </w:pPr>
-      <w:bookmarkStart w:id="25" w:name="_Toc235289165"/>
-      <w:bookmarkEnd w:id="25"/>
+      <w:bookmarkStart w:id="27" w:name="_Toc235289165"/>
+      <w:bookmarkEnd w:id="27"/>
     </w:p>
     <w:p>
       <w:pPr>
@@ -6065,12 +6419,12 @@
       <w:pPr>
         <w:pStyle w:val="Heading1"/>
       </w:pPr>
-      <w:bookmarkStart w:id="26" w:name="_Toc235289166"/>
+      <w:bookmarkStart w:id="28" w:name="_Toc235289166"/>
       <w:r>
         <w:lastRenderedPageBreak/>
         <w:t>Conclusions</w:t>
       </w:r>
-      <w:bookmarkEnd w:id="26"/>
+      <w:bookmarkEnd w:id="28"/>
     </w:p>
     <w:p>
       <w:pPr>
@@ -6101,12 +6455,12 @@
       <w:pPr>
         <w:pStyle w:val="Heading1"/>
       </w:pPr>
-      <w:bookmarkStart w:id="27" w:name="_Toc235289167"/>
+      <w:bookmarkStart w:id="29" w:name="_Toc235289167"/>
       <w:r>
         <w:lastRenderedPageBreak/>
         <w:t>References</w:t>
       </w:r>
-      <w:bookmarkEnd w:id="27"/>
+      <w:bookmarkEnd w:id="29"/>
     </w:p>
     <w:sdt>
       <w:sdtPr>
@@ -6576,7 +6930,47 @@
       </w:r>
     </w:p>
   </w:comment>
-  <w:comment w:id="19" w:author="Indrajaya, Muhammad Rafi Afif" w:date="2026-05-06T09:20:00Z" w:initials="MI">
+  <w:comment w:id="10" w:author="rafi indrajaya" w:date="2026-07-19T16:42:00Z" w:initials="ri">
+    <w:p>
+      <w:pPr>
+        <w:jc w:val="left"/>
+      </w:pPr>
+      <w:r>
+        <w:rPr>
+          <w:rStyle w:val="CommentReference"/>
+        </w:rPr>
+        <w:annotationRef/>
+      </w:r>
+      <w:r>
+        <w:rPr>
+          <w:sz w:val="20"/>
+          <w:szCs w:val="20"/>
+        </w:rPr>
+        <w:t>Make sure to add references for this paragraph</w:t>
+      </w:r>
+    </w:p>
+  </w:comment>
+  <w:comment w:id="11" w:author="rafi indrajaya" w:date="2026-07-19T16:42:00Z" w:initials="ri">
+    <w:p>
+      <w:pPr>
+        <w:jc w:val="left"/>
+      </w:pPr>
+      <w:r>
+        <w:rPr>
+          <w:rStyle w:val="CommentReference"/>
+        </w:rPr>
+        <w:annotationRef/>
+      </w:r>
+      <w:r>
+        <w:rPr>
+          <w:sz w:val="20"/>
+          <w:szCs w:val="20"/>
+        </w:rPr>
+        <w:t>this paragraph reference is in consensus app</w:t>
+      </w:r>
+    </w:p>
+  </w:comment>
+  <w:comment w:id="21" w:author="Indrajaya, Muhammad Rafi Afif" w:date="2026-05-06T09:20:00Z" w:initials="MI">
     <w:p>
       <w:pPr>
         <w:pStyle w:val="CommentText"/>
@@ -6596,7 +6990,7 @@
       </w:r>
     </w:p>
   </w:comment>
-  <w:comment w:id="20" w:author="Indrajaya, Muhammad Rafi Afif" w:date="2026-05-06T09:23:00Z" w:initials="MI">
+  <w:comment w:id="22" w:author="Indrajaya, Muhammad Rafi Afif" w:date="2026-05-06T09:23:00Z" w:initials="MI">
     <w:p>
       <w:pPr>
         <w:pStyle w:val="CommentText"/>
@@ -6616,7 +7010,7 @@
       </w:r>
     </w:p>
   </w:comment>
-  <w:comment w:id="21" w:author="Indrajaya, Muhammad Rafi Afif" w:date="2026-05-05T16:56:00Z" w:initials="MI">
+  <w:comment w:id="23" w:author="Indrajaya, Muhammad Rafi Afif" w:date="2026-05-05T16:56:00Z" w:initials="MI">
     <w:p>
       <w:pPr>
         <w:pStyle w:val="CommentText"/>
@@ -6682,7 +7076,7 @@
       </w:r>
     </w:p>
   </w:comment>
-  <w:comment w:id="23" w:author="Indrajaya, Muhammad Rafi Afif" w:date="2026-05-12T16:47:00Z" w:initials="MI">
+  <w:comment w:id="25" w:author="Indrajaya, Muhammad Rafi Afif" w:date="2026-05-12T16:47:00Z" w:initials="MI">
     <w:p>
       <w:pPr>
         <w:pStyle w:val="CommentText"/>
@@ -6702,7 +7096,7 @@
       </w:r>
     </w:p>
   </w:comment>
-  <w:comment w:id="22" w:author="Indrajaya, Muhammad Rafi Afif" w:date="2026-05-12T16:48:00Z" w:initials="MI">
+  <w:comment w:id="24" w:author="Indrajaya, Muhammad Rafi Afif" w:date="2026-05-12T16:48:00Z" w:initials="MI">
     <w:p>
       <w:pPr>
         <w:pStyle w:val="CommentText"/>
@@ -6728,6 +7122,8 @@
 <file path=word/commentsExtended.xml><?xml version="1.0" encoding="utf-8"?>
 <w15:commentsEx xmlns:wpc="http://schemas.microsoft.com/office/word/2010/wordprocessingCanvas" xmlns:cx="http://schemas.microsoft.com/office/drawing/2014/chartex" xmlns:cx1="http://schemas.microsoft.com/office/drawing/2015/9/8/chartex" xmlns:cx2="http://schemas.microsoft.com/office/drawing/2015/10/21/chartex" xmlns:cx3="http://schemas.microsoft.com/office/drawing/2016/5/9/chartex" xmlns:cx4="http://schemas.microsoft.com/office/drawing/2016/5/10/chartex" xmlns:cx5="http://schemas.microsoft.com/office/drawing/2016/5/11/chartex" xmlns:cx6="http://schemas.microsoft.com/office/drawing/2016/5/12/chartex" xmlns:cx7="http://schemas.microsoft.com/office/drawing/2016/5/13/chartex" xmlns:cx8="http://schemas.microsoft.com/office/drawing/2016/5/14/chartex" xmlns:mc="http://schemas.openxmlformats.org/markup-compatibility/2006" xmlns:aink="http://schemas.microsoft.com/office/drawing/2016/ink" xmlns:am3d="http://schemas.microsoft.com/office/drawing/2017/model3d" xmlns:o="urn:schemas-microsoft-com:office:office" xmlns:oel="http://schemas.microsoft.com/office/2019/extlst" xmlns:r="http://schemas.openxmlformats.org/officeDocument/2006/relationships" xmlns:m="http://schemas.openxmlformats.org/officeDocument/2006/math" xmlns:v="urn:schemas-microsoft-com:vml" xmlns:wp14="http://schemas.microsoft.com/office/word/2010/wordprocessingDrawing" xmlns:wp="http://schemas.openxmlformats.org/drawingml/2006/wordprocessingDrawing" xmlns:w10="urn:schemas-microsoft-com:office:word" xmlns:w="http://schemas.openxmlformats.org/wordprocessingml/2006/main" xmlns:w14="http://schemas.microsoft.com/office/word/2010/wordml" xmlns:w15="http://schemas.microsoft.com/office/word/2012/wordml" xmlns:w16cex="http://schemas.microsoft.com/office/word/2018/wordml/cex" xmlns:w16cid="http://schemas.microsoft.com/office/word/2016/wordml/cid" xmlns:w16="http://schemas.microsoft.com/office/word/2018/wordml" xmlns:w16du="http://schemas.microsoft.com/office/word/2023/wordml/word16du" xmlns:w16sdtdh="http://schemas.microsoft.com/office/word/2020/wordml/sdtdatahash" xmlns:w16sdtfl="http://schemas.microsoft.com/office/word/2024/wordml/sdtformatlock" xmlns:w16se="http://schemas.microsoft.com/office/word/2015/wordml/symex" xmlns:wpg="http://schemas.microsoft.com/office/word/2010/wordprocessingGroup" xmlns:wpi="http://schemas.microsoft.com/office/word/2010/wordprocessingInk" xmlns:wne="http://schemas.microsoft.com/office/word/2006/wordml" xmlns:wps="http://schemas.microsoft.com/office/word/2010/wordprocessingShape" mc:Ignorable="w14 w15 w16se w16cid w16 w16cex w16sdtdh w16sdtfl w16du wp14">
   <w15:commentEx w15:paraId="049C91FB" w15:done="0"/>
+  <w15:commentEx w15:paraId="774F926C" w15:done="0"/>
+  <w15:commentEx w15:paraId="49CD925A" w15:done="0"/>
   <w15:commentEx w15:paraId="1034419E" w15:done="0"/>
   <w15:commentEx w15:paraId="19E49370" w15:done="0"/>
   <w15:commentEx w15:paraId="7A955883" w15:done="0"/>
@@ -6739,6 +7135,8 @@
 <file path=word/commentsExtensible.xml><?xml version="1.0" encoding="utf-8"?>
 <w16cex:commentsExtensible xmlns:wpc="http://schemas.microsoft.com/office/word/2010/wordprocessingCanvas" xmlns:cx="http://schemas.microsoft.com/office/drawing/2014/chartex" xmlns:cx1="http://schemas.microsoft.com/office/drawing/2015/9/8/chartex" xmlns:cx2="http://schemas.microsoft.com/office/drawing/2015/10/21/chartex" xmlns:cx3="http://schemas.microsoft.com/office/drawing/2016/5/9/chartex" xmlns:cx4="http://schemas.microsoft.com/office/drawing/2016/5/10/chartex" xmlns:cx5="http://schemas.microsoft.com/office/drawing/2016/5/11/chartex" xmlns:cx6="http://schemas.microsoft.com/office/drawing/2016/5/12/chartex" xmlns:cx7="http://schemas.microsoft.com/office/drawing/2016/5/13/chartex" xmlns:cx8="http://schemas.microsoft.com/office/drawing/2016/5/14/chartex" xmlns:cr="http://schemas.microsoft.com/office/comments/2020/reactions" xmlns:mc="http://schemas.openxmlformats.org/markup-compatibility/2006" xmlns:aink="http://schemas.microsoft.com/office/drawing/2016/ink" xmlns:am3d="http://schemas.microsoft.com/office/drawing/2017/model3d" xmlns:o="urn:schemas-microsoft-com:office:office" xmlns:oel="http://schemas.microsoft.com/office/2019/extlst" xmlns:r="http://schemas.openxmlformats.org/officeDocument/2006/relationships" xmlns:m="http://schemas.openxmlformats.org/officeDocument/2006/math" xmlns:v="urn:schemas-microsoft-com:vml" xmlns:wp14="http://schemas.microsoft.com/office/word/2010/wordprocessingDrawing" xmlns:wp="http://schemas.openxmlformats.org/drawingml/2006/wordprocessingDrawing" xmlns:w10="urn:schemas-microsoft-com:office:word" xmlns:w="http://schemas.openxmlformats.org/wordprocessingml/2006/main" xmlns:w14="http://schemas.microsoft.com/office/word/2010/wordml" xmlns:w15="http://schemas.microsoft.com/office/word/2012/wordml" xmlns:w16cex="http://schemas.microsoft.com/office/word/2018/wordml/cex" xmlns:w16cid="http://schemas.microsoft.com/office/word/2016/wordml/cid" xmlns:w16="http://schemas.microsoft.com/office/word/2018/wordml" xmlns:w16du="http://schemas.microsoft.com/office/word/2023/wordml/word16du" xmlns:w16sdtdh="http://schemas.microsoft.com/office/word/2020/wordml/sdtdatahash" xmlns:w16sdtfl="http://schemas.microsoft.com/office/word/2024/wordml/sdtformatlock" xmlns:w16se="http://schemas.microsoft.com/office/word/2015/wordml/symex" xmlns:wpg="http://schemas.microsoft.com/office/word/2010/wordprocessingGroup" xmlns:wpi="http://schemas.microsoft.com/office/word/2010/wordprocessingInk" xmlns:wne="http://schemas.microsoft.com/office/word/2006/wordml" xmlns:wps="http://schemas.microsoft.com/office/word/2010/wordprocessingShape" mc:Ignorable="w14 w15 w16se w16cid w16 w16cex w16sdtdh w16sdtfl cr w16du wp14">
   <w16cex:commentExtensible w16cex:durableId="2E4753F3" w16cex:dateUtc="2026-05-04T13:18:00Z"/>
+  <w16cex:commentExtensible w16cex:durableId="4CB75C3B" w16cex:dateUtc="2026-07-19T14:42:00Z"/>
+  <w16cex:commentExtensible w16cex:durableId="4AA1067B" w16cex:dateUtc="2026-07-19T14:42:00Z"/>
   <w16cex:commentExtensible w16cex:durableId="14DFEBD2" w16cex:dateUtc="2026-05-06T07:20:00Z"/>
   <w16cex:commentExtensible w16cex:durableId="3016A959" w16cex:dateUtc="2026-05-06T07:23:00Z"/>
   <w16cex:commentExtensible w16cex:durableId="3D5864D4" w16cex:dateUtc="2026-05-05T14:56:00Z"/>
@@ -6750,6 +7148,8 @@
 <file path=word/commentsIds.xml><?xml version="1.0" encoding="utf-8"?>
 <w16cid:commentsIds xmlns:wpc="http://schemas.microsoft.com/office/word/2010/wordprocessingCanvas" xmlns:cx="http://schemas.microsoft.com/office/drawing/2014/chartex" xmlns:cx1="http://schemas.microsoft.com/office/drawing/2015/9/8/chartex" xmlns:cx2="http://schemas.microsoft.com/office/drawing/2015/10/21/chartex" xmlns:cx3="http://schemas.microsoft.com/office/drawing/2016/5/9/chartex" xmlns:cx4="http://schemas.microsoft.com/office/drawing/2016/5/10/chartex" xmlns:cx5="http://schemas.microsoft.com/office/drawing/2016/5/11/chartex" xmlns:cx6="http://schemas.microsoft.com/office/drawing/2016/5/12/chartex" xmlns:cx7="http://schemas.microsoft.com/office/drawing/2016/5/13/chartex" xmlns:cx8="http://schemas.microsoft.com/office/drawing/2016/5/14/chartex" xmlns:mc="http://schemas.openxmlformats.org/markup-compatibility/2006" xmlns:aink="http://schemas.microsoft.com/office/drawing/2016/ink" xmlns:am3d="http://schemas.microsoft.com/office/drawing/2017/model3d" xmlns:o="urn:schemas-microsoft-com:office:office" xmlns:oel="http://schemas.microsoft.com/office/2019/extlst" xmlns:r="http://schemas.openxmlformats.org/officeDocument/2006/relationships" xmlns:m="http://schemas.openxmlformats.org/officeDocument/2006/math" xmlns:v="urn:schemas-microsoft-com:vml" xmlns:wp14="http://schemas.microsoft.com/office/word/2010/wordprocessingDrawing" xmlns:wp="http://schemas.openxmlformats.org/drawingml/2006/wordprocessingDrawing" xmlns:w10="urn:schemas-microsoft-com:office:word" xmlns:w="http://schemas.openxmlformats.org/wordprocessingml/2006/main" xmlns:w14="http://schemas.microsoft.com/office/word/2010/wordml" xmlns:w15="http://schemas.microsoft.com/office/word/2012/wordml" xmlns:w16cex="http://schemas.microsoft.com/office/word/2018/wordml/cex" xmlns:w16cid="http://schemas.microsoft.com/office/word/2016/wordml/cid" xmlns:w16="http://schemas.microsoft.com/office/word/2018/wordml" xmlns:w16du="http://schemas.microsoft.com/office/word/2023/wordml/word16du" xmlns:w16sdtdh="http://schemas.microsoft.com/office/word/2020/wordml/sdtdatahash" xmlns:w16sdtfl="http://schemas.microsoft.com/office/word/2024/wordml/sdtformatlock" xmlns:w16se="http://schemas.microsoft.com/office/word/2015/wordml/symex" xmlns:wpg="http://schemas.microsoft.com/office/word/2010/wordprocessingGroup" xmlns:wpi="http://schemas.microsoft.com/office/word/2010/wordprocessingInk" xmlns:wne="http://schemas.microsoft.com/office/word/2006/wordml" xmlns:wps="http://schemas.microsoft.com/office/word/2010/wordprocessingShape" mc:Ignorable="w14 w15 w16se w16cid w16 w16cex w16sdtdh w16sdtfl w16du wp14">
   <w16cid:commentId w16cid:paraId="049C91FB" w16cid:durableId="2E4753F3"/>
+  <w16cid:commentId w16cid:paraId="774F926C" w16cid:durableId="4CB75C3B"/>
+  <w16cid:commentId w16cid:paraId="49CD925A" w16cid:durableId="4AA1067B"/>
   <w16cid:commentId w16cid:paraId="1034419E" w16cid:durableId="14DFEBD2"/>
   <w16cid:commentId w16cid:paraId="19E49370" w16cid:durableId="3016A959"/>
   <w16cid:commentId w16cid:paraId="7A955883" w16cid:durableId="3D5864D4"/>
@@ -9612,6 +10012,118 @@
     </w:lvl>
   </w:abstractNum>
   <w:abstractNum w:abstractNumId="24" w15:restartNumberingAfterBreak="0">
+    <w:nsid w:val="37D117CB"/>
+    <w:multiLevelType w:val="hybridMultilevel"/>
+    <w:tmpl w:val="C2C6B188"/>
+    <w:lvl w:ilvl="0" w:tplc="ACCE10E0">
+      <w:numFmt w:val="bullet"/>
+      <w:lvlText w:val="-"/>
+      <w:lvlJc w:val="left"/>
+      <w:pPr>
+        <w:ind w:left="720" w:hanging="360"/>
+      </w:pPr>
+      <w:rPr>
+        <w:rFonts w:ascii="Times New Roman" w:eastAsia="MS Mincho" w:hAnsi="Times New Roman" w:cs="Times New Roman" w:hint="default"/>
+      </w:rPr>
+    </w:lvl>
+    <w:lvl w:ilvl="1" w:tplc="04090003" w:tentative="1">
+      <w:start w:val="1"/>
+      <w:numFmt w:val="bullet"/>
+      <w:lvlText w:val="o"/>
+      <w:lvlJc w:val="left"/>
+      <w:pPr>
+        <w:ind w:left="1440" w:hanging="360"/>
+      </w:pPr>
+      <w:rPr>
+        <w:rFonts w:ascii="Courier New" w:hAnsi="Courier New" w:hint="default"/>
+      </w:rPr>
+    </w:lvl>
+    <w:lvl w:ilvl="2" w:tplc="04090005" w:tentative="1">
+      <w:start w:val="1"/>
+      <w:numFmt w:val="bullet"/>
+      <w:lvlText w:val=""/>
+      <w:lvlJc w:val="left"/>
+      <w:pPr>
+        <w:ind w:left="2160" w:hanging="360"/>
+      </w:pPr>
+      <w:rPr>
+        <w:rFonts w:ascii="Wingdings" w:hAnsi="Wingdings" w:hint="default"/>
+      </w:rPr>
+    </w:lvl>
+    <w:lvl w:ilvl="3" w:tplc="04090001" w:tentative="1">
+      <w:start w:val="1"/>
+      <w:numFmt w:val="bullet"/>
+      <w:lvlText w:val=""/>
+      <w:lvlJc w:val="left"/>
+      <w:pPr>
+        <w:ind w:left="2880" w:hanging="360"/>
+      </w:pPr>
+      <w:rPr>
+        <w:rFonts w:ascii="Symbol" w:hAnsi="Symbol" w:hint="default"/>
+      </w:rPr>
+    </w:lvl>
+    <w:lvl w:ilvl="4" w:tplc="04090003" w:tentative="1">
+      <w:start w:val="1"/>
+      <w:numFmt w:val="bullet"/>
+      <w:lvlText w:val="o"/>
+      <w:lvlJc w:val="left"/>
+      <w:pPr>
+        <w:ind w:left="3600" w:hanging="360"/>
+      </w:pPr>
+      <w:rPr>
+        <w:rFonts w:ascii="Courier New" w:hAnsi="Courier New" w:hint="default"/>
+      </w:rPr>
+    </w:lvl>
+    <w:lvl w:ilvl="5" w:tplc="04090005" w:tentative="1">
+      <w:start w:val="1"/>
+      <w:numFmt w:val="bullet"/>
+      <w:lvlText w:val=""/>
+      <w:lvlJc w:val="left"/>
+      <w:pPr>
+        <w:ind w:left="4320" w:hanging="360"/>
+      </w:pPr>
+      <w:rPr>
+        <w:rFonts w:ascii="Wingdings" w:hAnsi="Wingdings" w:hint="default"/>
+      </w:rPr>
+    </w:lvl>
+    <w:lvl w:ilvl="6" w:tplc="04090001" w:tentative="1">
+      <w:start w:val="1"/>
+      <w:numFmt w:val="bullet"/>
+      <w:lvlText w:val=""/>
+      <w:lvlJc w:val="left"/>
+      <w:pPr>
+        <w:ind w:left="5040" w:hanging="360"/>
+      </w:pPr>
+      <w:rPr>
+        <w:rFonts w:ascii="Symbol" w:hAnsi="Symbol" w:hint="default"/>
+      </w:rPr>
+    </w:lvl>
+    <w:lvl w:ilvl="7" w:tplc="04090003" w:tentative="1">
+      <w:start w:val="1"/>
+      <w:numFmt w:val="bullet"/>
+      <w:lvlText w:val="o"/>
+      <w:lvlJc w:val="left"/>
+      <w:pPr>
+        <w:ind w:left="5760" w:hanging="360"/>
+      </w:pPr>
+      <w:rPr>
+        <w:rFonts w:ascii="Courier New" w:hAnsi="Courier New" w:hint="default"/>
+      </w:rPr>
+    </w:lvl>
+    <w:lvl w:ilvl="8" w:tplc="04090005" w:tentative="1">
+      <w:start w:val="1"/>
+      <w:numFmt w:val="bullet"/>
+      <w:lvlText w:val=""/>
+      <w:lvlJc w:val="left"/>
+      <w:pPr>
+        <w:ind w:left="6480" w:hanging="360"/>
+      </w:pPr>
+      <w:rPr>
+        <w:rFonts w:ascii="Wingdings" w:hAnsi="Wingdings" w:hint="default"/>
+      </w:rPr>
+    </w:lvl>
+  </w:abstractNum>
+  <w:abstractNum w:abstractNumId="25" w15:restartNumberingAfterBreak="0">
     <w:nsid w:val="3C2C271D"/>
     <w:multiLevelType w:val="hybridMultilevel"/>
     <w:tmpl w:val="978EAE6C"/>
@@ -9724,7 +10236,7 @@
       </w:rPr>
     </w:lvl>
   </w:abstractNum>
-  <w:abstractNum w:abstractNumId="25" w15:restartNumberingAfterBreak="0">
+  <w:abstractNum w:abstractNumId="26" w15:restartNumberingAfterBreak="0">
     <w:nsid w:val="3C9B4DAC"/>
     <w:multiLevelType w:val="hybridMultilevel"/>
     <w:tmpl w:val="E6F26226"/>
@@ -9810,7 +10322,7 @@
       </w:pPr>
     </w:lvl>
   </w:abstractNum>
-  <w:abstractNum w:abstractNumId="26" w15:restartNumberingAfterBreak="0">
+  <w:abstractNum w:abstractNumId="27" w15:restartNumberingAfterBreak="0">
     <w:nsid w:val="3D250691"/>
     <w:multiLevelType w:val="hybridMultilevel"/>
     <w:tmpl w:val="293652FA"/>
@@ -9923,7 +10435,7 @@
       </w:rPr>
     </w:lvl>
   </w:abstractNum>
-  <w:abstractNum w:abstractNumId="27" w15:restartNumberingAfterBreak="0">
+  <w:abstractNum w:abstractNumId="28" w15:restartNumberingAfterBreak="0">
     <w:nsid w:val="3E4219A4"/>
     <w:multiLevelType w:val="hybridMultilevel"/>
     <w:tmpl w:val="831E829E"/>
@@ -10035,7 +10547,7 @@
       </w:rPr>
     </w:lvl>
   </w:abstractNum>
-  <w:abstractNum w:abstractNumId="28" w15:restartNumberingAfterBreak="0">
+  <w:abstractNum w:abstractNumId="29" w15:restartNumberingAfterBreak="0">
     <w:nsid w:val="3F206DB5"/>
     <w:multiLevelType w:val="multilevel"/>
     <w:tmpl w:val="3544CBE4"/>
@@ -10184,7 +10696,7 @@
       </w:rPr>
     </w:lvl>
   </w:abstractNum>
-  <w:abstractNum w:abstractNumId="29" w15:restartNumberingAfterBreak="0">
+  <w:abstractNum w:abstractNumId="30" w15:restartNumberingAfterBreak="0">
     <w:nsid w:val="4056699C"/>
     <w:multiLevelType w:val="hybridMultilevel"/>
     <w:tmpl w:val="F6CED83E"/>
@@ -10297,7 +10809,7 @@
       </w:rPr>
     </w:lvl>
   </w:abstractNum>
-  <w:abstractNum w:abstractNumId="30" w15:restartNumberingAfterBreak="0">
+  <w:abstractNum w:abstractNumId="31" w15:restartNumberingAfterBreak="0">
     <w:nsid w:val="43804A33"/>
     <w:multiLevelType w:val="hybridMultilevel"/>
     <w:tmpl w:val="BF2A2F88"/>
@@ -10409,7 +10921,7 @@
       </w:rPr>
     </w:lvl>
   </w:abstractNum>
-  <w:abstractNum w:abstractNumId="31" w15:restartNumberingAfterBreak="0">
+  <w:abstractNum w:abstractNumId="32" w15:restartNumberingAfterBreak="0">
     <w:nsid w:val="44924F22"/>
     <w:multiLevelType w:val="hybridMultilevel"/>
     <w:tmpl w:val="F3AA4096"/>
@@ -10522,7 +11034,7 @@
       </w:rPr>
     </w:lvl>
   </w:abstractNum>
-  <w:abstractNum w:abstractNumId="32" w15:restartNumberingAfterBreak="0">
+  <w:abstractNum w:abstractNumId="33" w15:restartNumberingAfterBreak="0">
     <w:nsid w:val="4CAE6E69"/>
     <w:multiLevelType w:val="hybridMultilevel"/>
     <w:tmpl w:val="0E4A8148"/>
@@ -10634,7 +11146,7 @@
       </w:rPr>
     </w:lvl>
   </w:abstractNum>
-  <w:abstractNum w:abstractNumId="33" w15:restartNumberingAfterBreak="0">
+  <w:abstractNum w:abstractNumId="34" w15:restartNumberingAfterBreak="0">
     <w:nsid w:val="52D0448A"/>
     <w:multiLevelType w:val="hybridMultilevel"/>
     <w:tmpl w:val="17D823EE"/>
@@ -10747,7 +11259,7 @@
       </w:rPr>
     </w:lvl>
   </w:abstractNum>
-  <w:abstractNum w:abstractNumId="34" w15:restartNumberingAfterBreak="0">
+  <w:abstractNum w:abstractNumId="35" w15:restartNumberingAfterBreak="0">
     <w:nsid w:val="55975563"/>
     <w:multiLevelType w:val="hybridMultilevel"/>
     <w:tmpl w:val="F5EE2CAE"/>
@@ -10860,7 +11372,7 @@
       </w:rPr>
     </w:lvl>
   </w:abstractNum>
-  <w:abstractNum w:abstractNumId="35" w15:restartNumberingAfterBreak="0">
+  <w:abstractNum w:abstractNumId="36" w15:restartNumberingAfterBreak="0">
     <w:nsid w:val="5BD54EFD"/>
     <w:multiLevelType w:val="hybridMultilevel"/>
     <w:tmpl w:val="0F1030CA"/>
@@ -10973,7 +11485,7 @@
       </w:rPr>
     </w:lvl>
   </w:abstractNum>
-  <w:abstractNum w:abstractNumId="36" w15:restartNumberingAfterBreak="0">
+  <w:abstractNum w:abstractNumId="37" w15:restartNumberingAfterBreak="0">
     <w:nsid w:val="5C340F92"/>
     <w:multiLevelType w:val="hybridMultilevel"/>
     <w:tmpl w:val="AA529710"/>
@@ -11085,7 +11597,7 @@
       </w:rPr>
     </w:lvl>
   </w:abstractNum>
-  <w:abstractNum w:abstractNumId="37" w15:restartNumberingAfterBreak="0">
+  <w:abstractNum w:abstractNumId="38" w15:restartNumberingAfterBreak="0">
     <w:nsid w:val="5EC56EDC"/>
     <w:multiLevelType w:val="hybridMultilevel"/>
     <w:tmpl w:val="10C21EE0"/>
@@ -11197,7 +11709,7 @@
       </w:rPr>
     </w:lvl>
   </w:abstractNum>
-  <w:abstractNum w:abstractNumId="38" w15:restartNumberingAfterBreak="0">
+  <w:abstractNum w:abstractNumId="39" w15:restartNumberingAfterBreak="0">
     <w:nsid w:val="62175FB6"/>
     <w:multiLevelType w:val="hybridMultilevel"/>
     <w:tmpl w:val="1772F19E"/>
@@ -11309,7 +11821,7 @@
       </w:rPr>
     </w:lvl>
   </w:abstractNum>
-  <w:abstractNum w:abstractNumId="39" w15:restartNumberingAfterBreak="0">
+  <w:abstractNum w:abstractNumId="40" w15:restartNumberingAfterBreak="0">
     <w:nsid w:val="6329582B"/>
     <w:multiLevelType w:val="hybridMultilevel"/>
     <w:tmpl w:val="5BC61120"/>
@@ -11422,7 +11934,7 @@
       </w:rPr>
     </w:lvl>
   </w:abstractNum>
-  <w:abstractNum w:abstractNumId="40" w15:restartNumberingAfterBreak="0">
+  <w:abstractNum w:abstractNumId="41" w15:restartNumberingAfterBreak="0">
     <w:nsid w:val="677657B3"/>
     <w:multiLevelType w:val="hybridMultilevel"/>
     <w:tmpl w:val="5524D014"/>
@@ -11535,7 +12047,7 @@
       </w:rPr>
     </w:lvl>
   </w:abstractNum>
-  <w:abstractNum w:abstractNumId="41" w15:restartNumberingAfterBreak="0">
+  <w:abstractNum w:abstractNumId="42" w15:restartNumberingAfterBreak="0">
     <w:nsid w:val="67F61E84"/>
     <w:multiLevelType w:val="hybridMultilevel"/>
     <w:tmpl w:val="430EF71E"/>
@@ -11648,7 +12160,7 @@
       </w:rPr>
     </w:lvl>
   </w:abstractNum>
-  <w:abstractNum w:abstractNumId="42" w15:restartNumberingAfterBreak="0">
+  <w:abstractNum w:abstractNumId="43" w15:restartNumberingAfterBreak="0">
     <w:nsid w:val="6B8D481B"/>
     <w:multiLevelType w:val="hybridMultilevel"/>
     <w:tmpl w:val="01149C52"/>
@@ -11761,7 +12273,7 @@
       </w:rPr>
     </w:lvl>
   </w:abstractNum>
-  <w:abstractNum w:abstractNumId="43" w15:restartNumberingAfterBreak="0">
+  <w:abstractNum w:abstractNumId="44" w15:restartNumberingAfterBreak="0">
     <w:nsid w:val="6E7267F1"/>
     <w:multiLevelType w:val="hybridMultilevel"/>
     <w:tmpl w:val="3432C5BC"/>
@@ -11873,7 +12385,7 @@
       </w:rPr>
     </w:lvl>
   </w:abstractNum>
-  <w:abstractNum w:abstractNumId="44" w15:restartNumberingAfterBreak="0">
+  <w:abstractNum w:abstractNumId="45" w15:restartNumberingAfterBreak="0">
     <w:nsid w:val="6FE57B32"/>
     <w:multiLevelType w:val="hybridMultilevel"/>
     <w:tmpl w:val="8F24FF80"/>
@@ -11985,7 +12497,7 @@
       </w:rPr>
     </w:lvl>
   </w:abstractNum>
-  <w:abstractNum w:abstractNumId="45" w15:restartNumberingAfterBreak="0">
+  <w:abstractNum w:abstractNumId="46" w15:restartNumberingAfterBreak="0">
     <w:nsid w:val="71F17535"/>
     <w:multiLevelType w:val="hybridMultilevel"/>
     <w:tmpl w:val="CDCED060"/>
@@ -12098,7 +12610,7 @@
       </w:rPr>
     </w:lvl>
   </w:abstractNum>
-  <w:abstractNum w:abstractNumId="46" w15:restartNumberingAfterBreak="0">
+  <w:abstractNum w:abstractNumId="47" w15:restartNumberingAfterBreak="0">
     <w:nsid w:val="75050389"/>
     <w:multiLevelType w:val="hybridMultilevel"/>
     <w:tmpl w:val="5D4490F8"/>
@@ -12218,31 +12730,31 @@
     <w:abstractNumId w:val="10"/>
   </w:num>
   <w:num w:numId="3" w16cid:durableId="627468108">
-    <w:abstractNumId w:val="36"/>
+    <w:abstractNumId w:val="37"/>
   </w:num>
   <w:num w:numId="4" w16cid:durableId="2147312317">
-    <w:abstractNumId w:val="27"/>
+    <w:abstractNumId w:val="28"/>
   </w:num>
   <w:num w:numId="5" w16cid:durableId="1468888951">
-    <w:abstractNumId w:val="42"/>
+    <w:abstractNumId w:val="43"/>
   </w:num>
   <w:num w:numId="6" w16cid:durableId="1505826805">
-    <w:abstractNumId w:val="33"/>
+    <w:abstractNumId w:val="34"/>
   </w:num>
   <w:num w:numId="7" w16cid:durableId="410201841">
     <w:abstractNumId w:val="12"/>
   </w:num>
   <w:num w:numId="8" w16cid:durableId="177933021">
-    <w:abstractNumId w:val="39"/>
+    <w:abstractNumId w:val="40"/>
   </w:num>
   <w:num w:numId="9" w16cid:durableId="453066233">
-    <w:abstractNumId w:val="24"/>
+    <w:abstractNumId w:val="25"/>
   </w:num>
   <w:num w:numId="10" w16cid:durableId="308437867">
-    <w:abstractNumId w:val="26"/>
+    <w:abstractNumId w:val="27"/>
   </w:num>
   <w:num w:numId="11" w16cid:durableId="2044015130">
-    <w:abstractNumId w:val="38"/>
+    <w:abstractNumId w:val="39"/>
   </w:num>
   <w:num w:numId="12" w16cid:durableId="1894543432">
     <w:abstractNumId w:val="3"/>
@@ -12251,25 +12763,25 @@
     <w:abstractNumId w:val="11"/>
   </w:num>
   <w:num w:numId="14" w16cid:durableId="1105805891">
-    <w:abstractNumId w:val="25"/>
+    <w:abstractNumId w:val="26"/>
   </w:num>
   <w:num w:numId="15" w16cid:durableId="1910379217">
     <w:abstractNumId w:val="18"/>
   </w:num>
   <w:num w:numId="16" w16cid:durableId="532619251">
-    <w:abstractNumId w:val="34"/>
+    <w:abstractNumId w:val="35"/>
   </w:num>
   <w:num w:numId="17" w16cid:durableId="483934593">
     <w:abstractNumId w:val="14"/>
   </w:num>
   <w:num w:numId="18" w16cid:durableId="114177715">
-    <w:abstractNumId w:val="29"/>
+    <w:abstractNumId w:val="30"/>
   </w:num>
   <w:num w:numId="19" w16cid:durableId="1754081084">
-    <w:abstractNumId w:val="35"/>
+    <w:abstractNumId w:val="36"/>
   </w:num>
   <w:num w:numId="20" w16cid:durableId="1659842329">
-    <w:abstractNumId w:val="45"/>
+    <w:abstractNumId w:val="46"/>
   </w:num>
   <w:num w:numId="21" w16cid:durableId="163865201">
     <w:abstractNumId w:val="8"/>
@@ -12287,22 +12799,22 @@
     <w:abstractNumId w:val="16"/>
   </w:num>
   <w:num w:numId="26" w16cid:durableId="307058015">
-    <w:abstractNumId w:val="40"/>
+    <w:abstractNumId w:val="41"/>
   </w:num>
   <w:num w:numId="27" w16cid:durableId="82074765">
-    <w:abstractNumId w:val="30"/>
+    <w:abstractNumId w:val="31"/>
   </w:num>
   <w:num w:numId="28" w16cid:durableId="231620995">
-    <w:abstractNumId w:val="43"/>
+    <w:abstractNumId w:val="44"/>
   </w:num>
   <w:num w:numId="29" w16cid:durableId="941106550">
-    <w:abstractNumId w:val="32"/>
+    <w:abstractNumId w:val="33"/>
   </w:num>
   <w:num w:numId="30" w16cid:durableId="1248537759">
     <w:abstractNumId w:val="4"/>
   </w:num>
   <w:num w:numId="31" w16cid:durableId="113404857">
-    <w:abstractNumId w:val="31"/>
+    <w:abstractNumId w:val="32"/>
   </w:num>
   <w:num w:numId="32" w16cid:durableId="405617677">
     <w:abstractNumId w:val="9"/>
@@ -12311,16 +12823,16 @@
     <w:abstractNumId w:val="21"/>
   </w:num>
   <w:num w:numId="34" w16cid:durableId="763064616">
-    <w:abstractNumId w:val="37"/>
+    <w:abstractNumId w:val="38"/>
   </w:num>
   <w:num w:numId="35" w16cid:durableId="481195516">
     <w:abstractNumId w:val="13"/>
   </w:num>
   <w:num w:numId="36" w16cid:durableId="1067534202">
-    <w:abstractNumId w:val="44"/>
+    <w:abstractNumId w:val="45"/>
   </w:num>
   <w:num w:numId="37" w16cid:durableId="1271402247">
-    <w:abstractNumId w:val="46"/>
+    <w:abstractNumId w:val="47"/>
   </w:num>
   <w:num w:numId="38" w16cid:durableId="1723824251">
     <w:abstractNumId w:val="22"/>
@@ -12329,7 +12841,7 @@
     <w:abstractNumId w:val="2"/>
   </w:num>
   <w:num w:numId="40" w16cid:durableId="1538007799">
-    <w:abstractNumId w:val="41"/>
+    <w:abstractNumId w:val="42"/>
   </w:num>
   <w:num w:numId="41" w16cid:durableId="151679100">
     <w:abstractNumId w:val="6"/>
@@ -12338,7 +12850,7 @@
     <w:abstractNumId w:val="7"/>
   </w:num>
   <w:num w:numId="43" w16cid:durableId="785393384">
-    <w:abstractNumId w:val="28"/>
+    <w:abstractNumId w:val="29"/>
   </w:num>
   <w:num w:numId="44" w16cid:durableId="993264226">
     <w:abstractNumId w:val="1"/>
@@ -12355,6 +12867,9 @@
   <w:num w:numId="48" w16cid:durableId="1541211727">
     <w:abstractNumId w:val="15"/>
   </w:num>
+  <w:num w:numId="49" w16cid:durableId="1563635500">
+    <w:abstractNumId w:val="24"/>
+  </w:num>
 </w:numbering>
 </file>
 
@@ -12362,6 +12877,9 @@
 <w15:people xmlns:wpc="http://schemas.microsoft.com/office/word/2010/wordprocessingCanvas" xmlns:cx="http://schemas.microsoft.com/office/drawing/2014/chartex" xmlns:cx1="http://schemas.microsoft.com/office/drawing/2015/9/8/chartex" xmlns:cx2="http://schemas.microsoft.com/office/drawing/2015/10/21/chartex" xmlns:cx3="http://schemas.microsoft.com/office/drawing/2016/5/9/chartex" xmlns:cx4="http://schemas.microsoft.com/office/drawing/2016/5/10/chartex" xmlns:cx5="http://schemas.microsoft.com/office/drawing/2016/5/11/chartex" xmlns:cx6="http://schemas.microsoft.com/office/drawing/2016/5/12/chartex" xmlns:cx7="http://schemas.microsoft.com/office/drawing/2016/5/13/chartex" xmlns:cx8="http://schemas.microsoft.com/office/drawing/2016/5/14/chartex" xmlns:mc="http://schemas.openxmlformats.org/markup-compatibility/2006" xmlns:aink="http://schemas.microsoft.com/office/drawing/2016/ink" xmlns:am3d="http://schemas.microsoft.com/office/drawing/2017/model3d" xmlns:o="urn:schemas-microsoft-com:office:office" xmlns:oel="http://schemas.microsoft.com/office/2019/extlst" xmlns:r="http://schemas.openxmlformats.org/officeDocument/2006/relationships" xmlns:m="http://schemas.openxmlformats.org/officeDocument/2006/math" xmlns:v="urn:schemas-microsoft-com:vml" xmlns:wp14="http://schemas.microsoft.com/office/word/2010/wordprocessingDrawing" xmlns:wp="http://schemas.openxmlformats.org/drawingml/2006/wordprocessingDrawing" xmlns:w10="urn:schemas-microsoft-com:office:word" xmlns:w="http://schemas.openxmlformats.org/wordprocessingml/2006/main" xmlns:w14="http://schemas.microsoft.com/office/word/2010/wordml" xmlns:w15="http://schemas.microsoft.com/office/word/2012/wordml" xmlns:w16cex="http://schemas.microsoft.com/office/word/2018/wordml/cex" xmlns:w16cid="http://schemas.microsoft.com/office/word/2016/wordml/cid" xmlns:w16="http://schemas.microsoft.com/office/word/2018/wordml" xmlns:w16du="http://schemas.microsoft.com/office/word/2023/wordml/word16du" xmlns:w16sdtdh="http://schemas.microsoft.com/office/word/2020/wordml/sdtdatahash" xmlns:w16sdtfl="http://schemas.microsoft.com/office/word/2024/wordml/sdtformatlock" xmlns:w16se="http://schemas.microsoft.com/office/word/2015/wordml/symex" xmlns:wpg="http://schemas.microsoft.com/office/word/2010/wordprocessingGroup" xmlns:wpi="http://schemas.microsoft.com/office/word/2010/wordprocessingInk" xmlns:wne="http://schemas.microsoft.com/office/word/2006/wordml" xmlns:wps="http://schemas.microsoft.com/office/word/2010/wordprocessingShape" mc:Ignorable="w14 w15 w16se w16cid w16 w16cex w16sdtdh w16sdtfl w16du wp14">
   <w15:person w15:author="Indrajaya, Muhammad Rafi Afif">
     <w15:presenceInfo w15:providerId="AD" w15:userId="S::indrajaya@fev.com::768ae212-a61d-4b3e-83f3-a2670e0d747d"/>
+  </w15:person>
+  <w15:person w15:author="rafi indrajaya">
+    <w15:presenceInfo w15:providerId="Windows Live" w15:userId="d01951cba909feee"/>
   </w15:person>
 </w15:people>
 </file>
@@ -14376,6 +14894,7 @@
     <w:rsid w:val="00B258E3"/>
     <w:rsid w:val="00B279BC"/>
     <w:rsid w:val="00B53DF7"/>
+    <w:rsid w:val="00C10776"/>
     <w:rsid w:val="00C9538A"/>
     <w:rsid w:val="00CD72E4"/>
     <w:rsid w:val="00D74283"/>
@@ -15178,6 +15697,18 @@
 </file>
 
 <file path=customXml/item1.xml><?xml version="1.0" encoding="utf-8"?>
+<p:properties xmlns:p="http://schemas.microsoft.com/office/2006/metadata/properties" xmlns:xsi="http://www.w3.org/2001/XMLSchema-instance" xmlns:pc="http://schemas.microsoft.com/office/infopath/2007/PartnerControls">
+  <documentManagement>
+    <TaxCatchAll xmlns="4de74af2-d2a7-4bc3-a319-420167317553" xsi:nil="true"/>
+    <ArchiverLinkFileType xmlns="c0991f74-233a-4c46-9c55-a176f0e8ba44" xsi:nil="true"/>
+    <lcf76f155ced4ddcb4097134ff3c332f xmlns="c0991f74-233a-4c46-9c55-a176f0e8ba44">
+      <Terms xmlns="http://schemas.microsoft.com/office/infopath/2007/PartnerControls"/>
+    </lcf76f155ced4ddcb4097134ff3c332f>
+  </documentManagement>
+</p:properties>
+</file>
+
+<file path=customXml/item2.xml><?xml version="1.0" encoding="utf-8"?>
 <b:Sources xmlns:b="http://schemas.openxmlformats.org/officeDocument/2006/bibliography" xmlns="http://schemas.openxmlformats.org/officeDocument/2006/bibliography" SelectedStyle="/IEEE2006OfficeOnline.xsl" StyleName="IEEE" Version="2006">
   <b:Source>
     <b:Tag>Placeholder1</b:Tag>
@@ -15194,19 +15725,16 @@
 </b:Sources>
 </file>
 
-<file path=customXml/item2.xml><?xml version="1.0" encoding="utf-8"?>
-<p:properties xmlns:p="http://schemas.microsoft.com/office/2006/metadata/properties" xmlns:xsi="http://www.w3.org/2001/XMLSchema-instance" xmlns:pc="http://schemas.microsoft.com/office/infopath/2007/PartnerControls">
-  <documentManagement>
-    <TaxCatchAll xmlns="4de74af2-d2a7-4bc3-a319-420167317553" xsi:nil="true"/>
-    <ArchiverLinkFileType xmlns="c0991f74-233a-4c46-9c55-a176f0e8ba44" xsi:nil="true"/>
-    <lcf76f155ced4ddcb4097134ff3c332f xmlns="c0991f74-233a-4c46-9c55-a176f0e8ba44">
-      <Terms xmlns="http://schemas.microsoft.com/office/infopath/2007/PartnerControls"/>
-    </lcf76f155ced4ddcb4097134ff3c332f>
-  </documentManagement>
-</p:properties>
+<file path=customXml/item3.xml><?xml version="1.0" encoding="utf-8"?>
+<?mso-contentType ?>
+<FormTemplates xmlns="http://schemas.microsoft.com/sharepoint/v3/contenttype/forms">
+  <Display>DocumentLibraryForm</Display>
+  <Edit>DocumentLibraryForm</Edit>
+  <New>DocumentLibraryForm</New>
+</FormTemplates>
 </file>
 
-<file path=customXml/item3.xml><?xml version="1.0" encoding="utf-8"?>
+<file path=customXml/item4.xml><?xml version="1.0" encoding="utf-8"?>
 <ct:contentTypeSchema xmlns:ct="http://schemas.microsoft.com/office/2006/metadata/contentType" xmlns:ma="http://schemas.microsoft.com/office/2006/metadata/properties/metaAttributes" ct:_="" ma:_="" ma:contentTypeName="Dokument" ma:contentTypeID="0x0101003A15E957932D6F4AB4FD28F85AF4FFD8" ma:contentTypeVersion="14" ma:contentTypeDescription="Ein neues Dokument erstellen." ma:contentTypeScope="" ma:versionID="e040dc8dbf4a4132031beaaf90e02bdd">
   <xsd:schema xmlns:xsd="http://www.w3.org/2001/XMLSchema" xmlns:xs="http://www.w3.org/2001/XMLSchema" xmlns:p="http://schemas.microsoft.com/office/2006/metadata/properties" xmlns:ns2="c0991f74-233a-4c46-9c55-a176f0e8ba44" xmlns:ns3="4de74af2-d2a7-4bc3-a319-420167317553" targetNamespace="http://schemas.microsoft.com/office/2006/metadata/properties" ma:root="true" ma:fieldsID="63fe477e893c7cf9e00d7d25e31408c1" ns2:_="" ns3:_="">
     <xsd:import namespace="c0991f74-233a-4c46-9c55-a176f0e8ba44"/>
@@ -15435,24 +15963,7 @@
 </ct:contentTypeSchema>
 </file>
 
-<file path=customXml/item4.xml><?xml version="1.0" encoding="utf-8"?>
-<?mso-contentType ?>
-<FormTemplates xmlns="http://schemas.microsoft.com/sharepoint/v3/contenttype/forms">
-  <Display>DocumentLibraryForm</Display>
-  <Edit>DocumentLibraryForm</Edit>
-  <New>DocumentLibraryForm</New>
-</FormTemplates>
-</file>
-
 <file path=customXml/itemProps1.xml><?xml version="1.0" encoding="utf-8"?>
-<ds:datastoreItem xmlns:ds="http://schemas.openxmlformats.org/officeDocument/2006/customXml" ds:itemID="{8ED87741-333E-524C-B42D-A34782CE569A}">
-  <ds:schemaRefs>
-    <ds:schemaRef ds:uri="http://schemas.openxmlformats.org/officeDocument/2006/bibliography"/>
-  </ds:schemaRefs>
-</ds:datastoreItem>
-</file>
-
-<file path=customXml/itemProps2.xml><?xml version="1.0" encoding="utf-8"?>
 <ds:datastoreItem xmlns:ds="http://schemas.openxmlformats.org/officeDocument/2006/customXml" ds:itemID="{5DB99EA3-5A91-4DE8-9C2E-5E2756FB8116}">
   <ds:schemaRefs>
     <ds:schemaRef ds:uri="http://schemas.microsoft.com/office/2006/metadata/properties"/>
@@ -15463,7 +15974,23 @@
 </ds:datastoreItem>
 </file>
 
+<file path=customXml/itemProps2.xml><?xml version="1.0" encoding="utf-8"?>
+<ds:datastoreItem xmlns:ds="http://schemas.openxmlformats.org/officeDocument/2006/customXml" ds:itemID="{8ED87741-333E-524C-B42D-A34782CE569A}">
+  <ds:schemaRefs>
+    <ds:schemaRef ds:uri="http://schemas.openxmlformats.org/officeDocument/2006/bibliography"/>
+  </ds:schemaRefs>
+</ds:datastoreItem>
+</file>
+
 <file path=customXml/itemProps3.xml><?xml version="1.0" encoding="utf-8"?>
+<ds:datastoreItem xmlns:ds="http://schemas.openxmlformats.org/officeDocument/2006/customXml" ds:itemID="{123745DA-69E4-464B-8AAF-512AB146EAEF}">
+  <ds:schemaRefs>
+    <ds:schemaRef ds:uri="http://schemas.microsoft.com/sharepoint/v3/contenttype/forms"/>
+  </ds:schemaRefs>
+</ds:datastoreItem>
+</file>
+
+<file path=customXml/itemProps4.xml><?xml version="1.0" encoding="utf-8"?>
 <ds:datastoreItem xmlns:ds="http://schemas.openxmlformats.org/officeDocument/2006/customXml" ds:itemID="{DB59158D-15C5-4DFF-AEB5-CA02C610712D}">
   <ds:schemaRefs>
     <ds:schemaRef ds:uri="http://schemas.microsoft.com/office/2006/metadata/contentType"/>
@@ -15480,12 +16007,4 @@
     <ds:schemaRef ds:uri="http://schemas.microsoft.com/internal/obd"/>
   </ds:schemaRefs>
 </ds:datastoreItem>
-</file>
-
-<file path=customXml/itemProps4.xml><?xml version="1.0" encoding="utf-8"?>
-<ds:datastoreItem xmlns:ds="http://schemas.openxmlformats.org/officeDocument/2006/customXml" ds:itemID="{123745DA-69E4-464B-8AAF-512AB146EAEF}">
-  <ds:schemaRefs>
-    <ds:schemaRef ds:uri="http://schemas.microsoft.com/sharepoint/v3/contenttype/forms"/>
-  </ds:schemaRefs>
-</ds:datastoreItem>
 </file>
</xml_diff>

<commit_message>
cleaned up chaper 1 with reference
</commit_message>
<xml_diff>
--- a/Thesis Report Rafi.docx
+++ b/Thesis Report Rafi.docx
@@ -408,7 +408,7 @@
               <w:sz w:val="24"/>
               <w:szCs w:val="24"/>
               <w:u w:val="none"/>
-              <w:lang w:val="en-JP"/>
+              <w:lang/>
               <w14:ligatures w14:val="standardContextual"/>
             </w:rPr>
           </w:pPr>
@@ -447,7 +447,7 @@
                 <w:sz w:val="24"/>
                 <w:szCs w:val="24"/>
                 <w:u w:val="none"/>
-                <w:lang w:val="en-JP"/>
+                <w:lang/>
                 <w14:ligatures w14:val="standardContextual"/>
               </w:rPr>
               <w:tab/>
@@ -524,7 +524,7 @@
               <w:noProof/>
               <w:sz w:val="24"/>
               <w:szCs w:val="24"/>
-              <w:lang w:val="en-JP"/>
+              <w:lang/>
               <w14:ligatures w14:val="standardContextual"/>
             </w:rPr>
           </w:pPr>
@@ -545,7 +545,7 @@
                 <w:noProof/>
                 <w:sz w:val="24"/>
                 <w:szCs w:val="24"/>
-                <w:lang w:val="en-JP"/>
+                <w:lang/>
                 <w14:ligatures w14:val="standardContextual"/>
               </w:rPr>
               <w:tab/>
@@ -622,7 +622,7 @@
               <w:noProof/>
               <w:sz w:val="24"/>
               <w:szCs w:val="24"/>
-              <w:lang w:val="en-JP"/>
+              <w:lang/>
               <w14:ligatures w14:val="standardContextual"/>
             </w:rPr>
           </w:pPr>
@@ -643,7 +643,7 @@
                 <w:noProof/>
                 <w:sz w:val="24"/>
                 <w:szCs w:val="24"/>
-                <w:lang w:val="en-JP"/>
+                <w:lang/>
                 <w14:ligatures w14:val="standardContextual"/>
               </w:rPr>
               <w:tab/>
@@ -720,7 +720,7 @@
               <w:noProof/>
               <w:sz w:val="24"/>
               <w:szCs w:val="24"/>
-              <w:lang w:val="en-JP"/>
+              <w:lang/>
               <w14:ligatures w14:val="standardContextual"/>
             </w:rPr>
           </w:pPr>
@@ -741,7 +741,7 @@
                 <w:noProof/>
                 <w:sz w:val="24"/>
                 <w:szCs w:val="24"/>
-                <w:lang w:val="en-JP"/>
+                <w:lang/>
                 <w14:ligatures w14:val="standardContextual"/>
               </w:rPr>
               <w:tab/>
@@ -818,7 +818,7 @@
               <w:noProof/>
               <w:sz w:val="24"/>
               <w:szCs w:val="24"/>
-              <w:lang w:val="en-JP"/>
+              <w:lang/>
               <w14:ligatures w14:val="standardContextual"/>
             </w:rPr>
           </w:pPr>
@@ -839,7 +839,7 @@
                 <w:noProof/>
                 <w:sz w:val="24"/>
                 <w:szCs w:val="24"/>
-                <w:lang w:val="en-JP"/>
+                <w:lang/>
                 <w14:ligatures w14:val="standardContextual"/>
               </w:rPr>
               <w:tab/>
@@ -917,7 +917,7 @@
               <w:sz w:val="24"/>
               <w:szCs w:val="24"/>
               <w:u w:val="none"/>
-              <w:lang w:val="en-JP"/>
+              <w:lang/>
               <w14:ligatures w14:val="standardContextual"/>
             </w:rPr>
           </w:pPr>
@@ -939,7 +939,7 @@
                 <w:sz w:val="24"/>
                 <w:szCs w:val="24"/>
                 <w:u w:val="none"/>
-                <w:lang w:val="en-JP"/>
+                <w:lang/>
                 <w14:ligatures w14:val="standardContextual"/>
               </w:rPr>
               <w:tab/>
@@ -1016,7 +1016,7 @@
               <w:noProof/>
               <w:sz w:val="24"/>
               <w:szCs w:val="24"/>
-              <w:lang w:val="en-JP"/>
+              <w:lang/>
               <w14:ligatures w14:val="standardContextual"/>
             </w:rPr>
           </w:pPr>
@@ -1037,7 +1037,7 @@
                 <w:noProof/>
                 <w:sz w:val="24"/>
                 <w:szCs w:val="24"/>
-                <w:lang w:val="en-JP"/>
+                <w:lang/>
                 <w14:ligatures w14:val="standardContextual"/>
               </w:rPr>
               <w:tab/>
@@ -1114,7 +1114,7 @@
               <w:noProof/>
               <w:sz w:val="24"/>
               <w:szCs w:val="24"/>
-              <w:lang w:val="en-JP"/>
+              <w:lang/>
               <w14:ligatures w14:val="standardContextual"/>
             </w:rPr>
           </w:pPr>
@@ -1135,7 +1135,7 @@
                 <w:noProof/>
                 <w:sz w:val="24"/>
                 <w:szCs w:val="24"/>
-                <w:lang w:val="en-JP"/>
+                <w:lang/>
                 <w14:ligatures w14:val="standardContextual"/>
               </w:rPr>
               <w:tab/>
@@ -1212,7 +1212,7 @@
               <w:noProof/>
               <w:sz w:val="24"/>
               <w:szCs w:val="24"/>
-              <w:lang w:val="en-JP"/>
+              <w:lang/>
               <w14:ligatures w14:val="standardContextual"/>
             </w:rPr>
           </w:pPr>
@@ -1233,7 +1233,7 @@
                 <w:noProof/>
                 <w:sz w:val="24"/>
                 <w:szCs w:val="24"/>
-                <w:lang w:val="en-JP"/>
+                <w:lang/>
                 <w14:ligatures w14:val="standardContextual"/>
               </w:rPr>
               <w:tab/>
@@ -1310,7 +1310,7 @@
               <w:noProof/>
               <w:sz w:val="24"/>
               <w:szCs w:val="24"/>
-              <w:lang w:val="en-JP"/>
+              <w:lang/>
               <w14:ligatures w14:val="standardContextual"/>
             </w:rPr>
           </w:pPr>
@@ -1331,7 +1331,7 @@
                 <w:noProof/>
                 <w:sz w:val="24"/>
                 <w:szCs w:val="24"/>
-                <w:lang w:val="en-JP"/>
+                <w:lang/>
                 <w14:ligatures w14:val="standardContextual"/>
               </w:rPr>
               <w:tab/>
@@ -1409,7 +1409,7 @@
               <w:sz w:val="24"/>
               <w:szCs w:val="24"/>
               <w:u w:val="none"/>
-              <w:lang w:val="en-JP"/>
+              <w:lang/>
               <w14:ligatures w14:val="standardContextual"/>
             </w:rPr>
           </w:pPr>
@@ -1431,7 +1431,7 @@
                 <w:sz w:val="24"/>
                 <w:szCs w:val="24"/>
                 <w:u w:val="none"/>
-                <w:lang w:val="en-JP"/>
+                <w:lang/>
                 <w14:ligatures w14:val="standardContextual"/>
               </w:rPr>
               <w:tab/>
@@ -1508,7 +1508,7 @@
               <w:noProof/>
               <w:sz w:val="24"/>
               <w:szCs w:val="24"/>
-              <w:lang w:val="en-JP"/>
+              <w:lang/>
               <w14:ligatures w14:val="standardContextual"/>
             </w:rPr>
           </w:pPr>
@@ -1529,7 +1529,7 @@
                 <w:noProof/>
                 <w:sz w:val="24"/>
                 <w:szCs w:val="24"/>
-                <w:lang w:val="en-JP"/>
+                <w:lang/>
                 <w14:ligatures w14:val="standardContextual"/>
               </w:rPr>
               <w:tab/>
@@ -1606,7 +1606,7 @@
               <w:noProof/>
               <w:sz w:val="24"/>
               <w:szCs w:val="24"/>
-              <w:lang w:val="en-JP"/>
+              <w:lang/>
               <w14:ligatures w14:val="standardContextual"/>
             </w:rPr>
           </w:pPr>
@@ -1627,7 +1627,7 @@
                 <w:noProof/>
                 <w:sz w:val="24"/>
                 <w:szCs w:val="24"/>
-                <w:lang w:val="en-JP"/>
+                <w:lang/>
                 <w14:ligatures w14:val="standardContextual"/>
               </w:rPr>
               <w:tab/>
@@ -1704,7 +1704,7 @@
               <w:noProof/>
               <w:sz w:val="24"/>
               <w:szCs w:val="24"/>
-              <w:lang w:val="en-JP"/>
+              <w:lang/>
               <w14:ligatures w14:val="standardContextual"/>
             </w:rPr>
           </w:pPr>
@@ -1725,7 +1725,7 @@
                 <w:noProof/>
                 <w:sz w:val="24"/>
                 <w:szCs w:val="24"/>
-                <w:lang w:val="en-JP"/>
+                <w:lang/>
                 <w14:ligatures w14:val="standardContextual"/>
               </w:rPr>
               <w:tab/>
@@ -1802,7 +1802,7 @@
               <w:noProof/>
               <w:sz w:val="24"/>
               <w:szCs w:val="24"/>
-              <w:lang w:val="en-JP"/>
+              <w:lang/>
               <w14:ligatures w14:val="standardContextual"/>
             </w:rPr>
           </w:pPr>
@@ -1823,7 +1823,7 @@
                 <w:noProof/>
                 <w:sz w:val="24"/>
                 <w:szCs w:val="24"/>
-                <w:lang w:val="en-JP"/>
+                <w:lang/>
                 <w14:ligatures w14:val="standardContextual"/>
               </w:rPr>
               <w:tab/>
@@ -1900,7 +1900,7 @@
               <w:noProof/>
               <w:sz w:val="24"/>
               <w:szCs w:val="24"/>
-              <w:lang w:val="en-JP"/>
+              <w:lang/>
               <w14:ligatures w14:val="standardContextual"/>
             </w:rPr>
           </w:pPr>
@@ -1921,7 +1921,7 @@
                 <w:noProof/>
                 <w:sz w:val="24"/>
                 <w:szCs w:val="24"/>
-                <w:lang w:val="en-JP"/>
+                <w:lang/>
                 <w14:ligatures w14:val="standardContextual"/>
               </w:rPr>
               <w:tab/>
@@ -1998,7 +1998,7 @@
               <w:noProof/>
               <w:sz w:val="24"/>
               <w:szCs w:val="24"/>
-              <w:lang w:val="en-JP"/>
+              <w:lang/>
               <w14:ligatures w14:val="standardContextual"/>
             </w:rPr>
           </w:pPr>
@@ -2019,7 +2019,7 @@
                 <w:noProof/>
                 <w:sz w:val="24"/>
                 <w:szCs w:val="24"/>
-                <w:lang w:val="en-JP"/>
+                <w:lang/>
                 <w14:ligatures w14:val="standardContextual"/>
               </w:rPr>
               <w:tab/>
@@ -2097,7 +2097,7 @@
               <w:sz w:val="24"/>
               <w:szCs w:val="24"/>
               <w:u w:val="none"/>
-              <w:lang w:val="en-JP"/>
+              <w:lang/>
               <w14:ligatures w14:val="standardContextual"/>
             </w:rPr>
           </w:pPr>
@@ -2119,7 +2119,7 @@
                 <w:sz w:val="24"/>
                 <w:szCs w:val="24"/>
                 <w:u w:val="none"/>
-                <w:lang w:val="en-JP"/>
+                <w:lang/>
                 <w14:ligatures w14:val="standardContextual"/>
               </w:rPr>
               <w:tab/>
@@ -2195,7 +2195,7 @@
               <w:noProof/>
               <w:sz w:val="24"/>
               <w:szCs w:val="24"/>
-              <w:lang w:val="en-JP"/>
+              <w:lang/>
               <w14:ligatures w14:val="standardContextual"/>
             </w:rPr>
           </w:pPr>
@@ -2273,7 +2273,7 @@
               <w:sz w:val="24"/>
               <w:szCs w:val="24"/>
               <w:u w:val="none"/>
-              <w:lang w:val="en-JP"/>
+              <w:lang/>
               <w14:ligatures w14:val="standardContextual"/>
             </w:rPr>
           </w:pPr>
@@ -2295,7 +2295,7 @@
                 <w:sz w:val="24"/>
                 <w:szCs w:val="24"/>
                 <w:u w:val="none"/>
-                <w:lang w:val="en-JP"/>
+                <w:lang/>
                 <w14:ligatures w14:val="standardContextual"/>
               </w:rPr>
               <w:tab/>
@@ -2373,7 +2373,7 @@
               <w:sz w:val="24"/>
               <w:szCs w:val="24"/>
               <w:u w:val="none"/>
-              <w:lang w:val="en-JP"/>
+              <w:lang/>
               <w14:ligatures w14:val="standardContextual"/>
             </w:rPr>
           </w:pPr>
@@ -2395,7 +2395,7 @@
                 <w:sz w:val="24"/>
                 <w:szCs w:val="24"/>
                 <w:u w:val="none"/>
-                <w:lang w:val="en-JP"/>
+                <w:lang/>
                 <w14:ligatures w14:val="standardContextual"/>
               </w:rPr>
               <w:tab/>
@@ -2599,7 +2599,7 @@
     <w:p/>
     <w:p>
       <w:r>
-        <w:t>FEV Europe GmbH is widely recognized as an established expert within the automotive industry, particularly for its benchmarking and consulting services [NEED REFERENCE: evidence of FEV’s expertise and services in the automotive sector]. Building on this foundation, the company is increasingly directing its efforts toward supporting innovation within the energy sector, reflecting broader industry trends and internal strategic priorities [NEED REFERENCE: documentation on FEV’s activities or strategy in energy sector innovation].</w:t>
+        <w:t>FEV Europe GmbH is widely recognized as an established expert within the automotive industry, particularly for its benchmarking and consulting services. Building on this foundation, the company is increasingly directing its efforts toward supporting innovation within the energy sector, reflecting broader industry trends and internal strategic priorities [NEED REFERENCE: documentation on FEV’s activities or strategy in energy sector innovation].</w:t>
       </w:r>
     </w:p>
     <w:p/>
@@ -2638,11 +2638,11 @@
     <w:p/>
     <w:p>
       <w:r>
-        <w:t xml:space="preserve">Based on the simulation results, the thesis further aims to identify and explain the underlying reasons for any observed discrepancies—or the lack thereof—between the two frameworks. This comparative analysis supports a final assessment of whether one framework demonstrates superior </w:t>
+        <w:t xml:space="preserve">Based on the simulation results, the thesis further aims to identify and explain the underlying reasons for any observed discrepancies—or the lack thereof—between the two frameworks. This comparative analysis supports a final assessment of whether one framework demonstrates superior performance or whether its suitability is dependent on specific system configurations and operating </w:t>
       </w:r>
       <w:r>
         <w:lastRenderedPageBreak/>
-        <w:t>performance or whether its suitability is dependent on specific system configurations and operating conditions.</w:t>
+        <w:t>conditions.</w:t>
       </w:r>
     </w:p>
     <w:p/>
@@ -2983,19 +2983,7 @@
         <w:rPr>
           <w:kern w:val="0"/>
         </w:rPr>
-        <w:t>the MILP will generate a global equation that accounts for the constraints and the objective function, and, using the MILP solver, it will perform relaxation</w:t>
-      </w:r>
-      <w:r>
-        <w:rPr>
-          <w:kern w:val="0"/>
-        </w:rPr>
-        <w:t xml:space="preserve"> and</w:t>
-      </w:r>
-      <w:r>
-        <w:rPr>
-          <w:kern w:val="0"/>
-        </w:rPr>
-        <w:t xml:space="preserve"> branch-and-bound</w:t>
+        <w:t>the MILP will generate a global equation that accounts for the constraints and the objective function, and, using the MILP solver, it will perform relaxation and branch-and-bound</w:t>
       </w:r>
       <w:r>
         <w:rPr>
@@ -14750,15 +14738,15 @@
   </w:font>
   <w:font w:name="Wingdings">
     <w:panose1 w:val="05000000000000000000"/>
-    <w:charset w:val="4D"/>
-    <w:family w:val="decorative"/>
+    <w:charset w:val="02"/>
+    <w:family w:val="auto"/>
     <w:pitch w:val="variable"/>
-    <w:sig w:usb0="00000003" w:usb1="00000000" w:usb2="00000000" w:usb3="00000000" w:csb0="80000001" w:csb1="00000000"/>
+    <w:sig w:usb0="00000000" w:usb1="10000000" w:usb2="00000000" w:usb3="00000000" w:csb0="80000000" w:csb1="00000000"/>
   </w:font>
   <w:font w:name="Symbol">
     <w:panose1 w:val="05050102010706020507"/>
     <w:charset w:val="02"/>
-    <w:family w:val="decorative"/>
+    <w:family w:val="roman"/>
     <w:pitch w:val="variable"/>
     <w:sig w:usb0="00000000" w:usb1="10000000" w:usb2="00000000" w:usb3="00000000" w:csb0="80000000" w:csb1="00000000"/>
   </w:font>
@@ -14785,8 +14773,6 @@
     <w:sig w:usb0="E4002EFF" w:usb1="C200247B" w:usb2="00000009" w:usb3="00000000" w:csb0="000001FF" w:csb1="00000000"/>
   </w:font>
   <w:font w:name="Yu Mincho">
-    <w:altName w:val="游明朝"/>
-    <w:panose1 w:val="02020400000000000000"/>
     <w:charset w:val="80"/>
     <w:family w:val="roman"/>
     <w:pitch w:val="variable"/>
@@ -14800,14 +14786,12 @@
     <w:sig w:usb0="E00006FF" w:usb1="420024FF" w:usb2="02000000" w:usb3="00000000" w:csb0="0000019F" w:csb1="00000000"/>
   </w:font>
   <w:font w:name="Aptos">
-    <w:panose1 w:val="020B0604020202020204"/>
     <w:charset w:val="00"/>
     <w:family w:val="swiss"/>
     <w:pitch w:val="variable"/>
     <w:sig w:usb0="20000287" w:usb1="00000003" w:usb2="00000000" w:usb3="00000000" w:csb0="0000019F" w:csb1="00000000"/>
   </w:font>
   <w:font w:name="Aptos Display">
-    <w:panose1 w:val="020B0004020202020204"/>
     <w:charset w:val="00"/>
     <w:family w:val="swiss"/>
     <w:pitch w:val="variable"/>
@@ -14845,12 +14829,14 @@
     <w:rsid w:val="00243D59"/>
     <w:rsid w:val="00276DE2"/>
     <w:rsid w:val="002A1E29"/>
+    <w:rsid w:val="003029CF"/>
     <w:rsid w:val="00310846"/>
     <w:rsid w:val="00313DDE"/>
     <w:rsid w:val="00324602"/>
     <w:rsid w:val="00364EE5"/>
     <w:rsid w:val="003834D4"/>
     <w:rsid w:val="00387AFB"/>
+    <w:rsid w:val="00393659"/>
     <w:rsid w:val="003A3213"/>
     <w:rsid w:val="003A41B9"/>
     <w:rsid w:val="004A039B"/>
@@ -14928,8 +14914,8 @@
   </m:mathPr>
   <w:themeFontLang w:val="en-US" w:eastAsia="ja-JP"/>
   <w:clrSchemeMapping w:bg1="light1" w:t1="dark1" w:bg2="light2" w:t2="dark2" w:accent1="accent1" w:accent2="accent2" w:accent3="accent3" w:accent4="accent4" w:accent5="accent5" w:accent6="accent6" w:hyperlink="hyperlink" w:followedHyperlink="followedHyperlink"/>
-  <w:decimalSymbol w:val="."/>
-  <w:listSeparator w:val=","/>
+  <w:decimalSymbol w:val=","/>
+  <w:listSeparator w:val=";"/>
   <w15:chartTrackingRefBased/>
 </w:settings>
 </file>
@@ -15697,44 +15683,6 @@
 </file>
 
 <file path=customXml/item1.xml><?xml version="1.0" encoding="utf-8"?>
-<p:properties xmlns:p="http://schemas.microsoft.com/office/2006/metadata/properties" xmlns:xsi="http://www.w3.org/2001/XMLSchema-instance" xmlns:pc="http://schemas.microsoft.com/office/infopath/2007/PartnerControls">
-  <documentManagement>
-    <TaxCatchAll xmlns="4de74af2-d2a7-4bc3-a319-420167317553" xsi:nil="true"/>
-    <ArchiverLinkFileType xmlns="c0991f74-233a-4c46-9c55-a176f0e8ba44" xsi:nil="true"/>
-    <lcf76f155ced4ddcb4097134ff3c332f xmlns="c0991f74-233a-4c46-9c55-a176f0e8ba44">
-      <Terms xmlns="http://schemas.microsoft.com/office/infopath/2007/PartnerControls"/>
-    </lcf76f155ced4ddcb4097134ff3c332f>
-  </documentManagement>
-</p:properties>
-</file>
-
-<file path=customXml/item2.xml><?xml version="1.0" encoding="utf-8"?>
-<b:Sources xmlns:b="http://schemas.openxmlformats.org/officeDocument/2006/bibliography" xmlns="http://schemas.openxmlformats.org/officeDocument/2006/bibliography" SelectedStyle="/IEEE2006OfficeOnline.xsl" StyleName="IEEE" Version="2006">
-  <b:Source>
-    <b:Tag>Placeholder1</b:Tag>
-    <b:SourceType>Book</b:SourceType>
-    <b:Guid>{61C2BEB0-04B1-424E-AEC0-322EDBD1A18A}</b:Guid>
-    <b:RefOrder>2</b:RefOrder>
-  </b:Source>
-  <b:Source>
-    <b:Tag>Placeholder2</b:Tag>
-    <b:SourceType>Book</b:SourceType>
-    <b:Guid>{26E93F14-F601-D04A-A10D-E3BC3760B577}</b:Guid>
-    <b:RefOrder>1</b:RefOrder>
-  </b:Source>
-</b:Sources>
-</file>
-
-<file path=customXml/item3.xml><?xml version="1.0" encoding="utf-8"?>
-<?mso-contentType ?>
-<FormTemplates xmlns="http://schemas.microsoft.com/sharepoint/v3/contenttype/forms">
-  <Display>DocumentLibraryForm</Display>
-  <Edit>DocumentLibraryForm</Edit>
-  <New>DocumentLibraryForm</New>
-</FormTemplates>
-</file>
-
-<file path=customXml/item4.xml><?xml version="1.0" encoding="utf-8"?>
 <ct:contentTypeSchema xmlns:ct="http://schemas.microsoft.com/office/2006/metadata/contentType" xmlns:ma="http://schemas.microsoft.com/office/2006/metadata/properties/metaAttributes" ct:_="" ma:_="" ma:contentTypeName="Dokument" ma:contentTypeID="0x0101003A15E957932D6F4AB4FD28F85AF4FFD8" ma:contentTypeVersion="14" ma:contentTypeDescription="Ein neues Dokument erstellen." ma:contentTypeScope="" ma:versionID="e040dc8dbf4a4132031beaaf90e02bdd">
   <xsd:schema xmlns:xsd="http://www.w3.org/2001/XMLSchema" xmlns:xs="http://www.w3.org/2001/XMLSchema" xmlns:p="http://schemas.microsoft.com/office/2006/metadata/properties" xmlns:ns2="c0991f74-233a-4c46-9c55-a176f0e8ba44" xmlns:ns3="4de74af2-d2a7-4bc3-a319-420167317553" targetNamespace="http://schemas.microsoft.com/office/2006/metadata/properties" ma:root="true" ma:fieldsID="63fe477e893c7cf9e00d7d25e31408c1" ns2:_="" ns3:_="">
     <xsd:import namespace="c0991f74-233a-4c46-9c55-a176f0e8ba44"/>
@@ -15963,34 +15911,45 @@
 </ct:contentTypeSchema>
 </file>
 
-<file path=customXml/itemProps1.xml><?xml version="1.0" encoding="utf-8"?>
-<ds:datastoreItem xmlns:ds="http://schemas.openxmlformats.org/officeDocument/2006/customXml" ds:itemID="{5DB99EA3-5A91-4DE8-9C2E-5E2756FB8116}">
-  <ds:schemaRefs>
-    <ds:schemaRef ds:uri="http://schemas.microsoft.com/office/2006/metadata/properties"/>
-    <ds:schemaRef ds:uri="http://schemas.microsoft.com/office/infopath/2007/PartnerControls"/>
-    <ds:schemaRef ds:uri="4de74af2-d2a7-4bc3-a319-420167317553"/>
-    <ds:schemaRef ds:uri="c0991f74-233a-4c46-9c55-a176f0e8ba44"/>
-  </ds:schemaRefs>
-</ds:datastoreItem>
+<file path=customXml/item2.xml><?xml version="1.0" encoding="utf-8"?>
+<?mso-contentType ?>
+<FormTemplates xmlns="http://schemas.microsoft.com/sharepoint/v3/contenttype/forms">
+  <Display>DocumentLibraryForm</Display>
+  <Edit>DocumentLibraryForm</Edit>
+  <New>DocumentLibraryForm</New>
+</FormTemplates>
 </file>
 
-<file path=customXml/itemProps2.xml><?xml version="1.0" encoding="utf-8"?>
-<ds:datastoreItem xmlns:ds="http://schemas.openxmlformats.org/officeDocument/2006/customXml" ds:itemID="{8ED87741-333E-524C-B42D-A34782CE569A}">
-  <ds:schemaRefs>
-    <ds:schemaRef ds:uri="http://schemas.openxmlformats.org/officeDocument/2006/bibliography"/>
-  </ds:schemaRefs>
-</ds:datastoreItem>
+<file path=customXml/item3.xml><?xml version="1.0" encoding="utf-8"?>
+<b:Sources xmlns:b="http://schemas.openxmlformats.org/officeDocument/2006/bibliography" xmlns="http://schemas.openxmlformats.org/officeDocument/2006/bibliography" SelectedStyle="/IEEE2006OfficeOnline.xsl" StyleName="IEEE" Version="2006">
+  <b:Source>
+    <b:Tag>Placeholder1</b:Tag>
+    <b:SourceType>Book</b:SourceType>
+    <b:Guid>{61C2BEB0-04B1-424E-AEC0-322EDBD1A18A}</b:Guid>
+    <b:RefOrder>2</b:RefOrder>
+  </b:Source>
+  <b:Source>
+    <b:Tag>Placeholder2</b:Tag>
+    <b:SourceType>Book</b:SourceType>
+    <b:Guid>{26E93F14-F601-D04A-A10D-E3BC3760B577}</b:Guid>
+    <b:RefOrder>1</b:RefOrder>
+  </b:Source>
+</b:Sources>
 </file>
 
-<file path=customXml/itemProps3.xml><?xml version="1.0" encoding="utf-8"?>
-<ds:datastoreItem xmlns:ds="http://schemas.openxmlformats.org/officeDocument/2006/customXml" ds:itemID="{123745DA-69E4-464B-8AAF-512AB146EAEF}">
-  <ds:schemaRefs>
-    <ds:schemaRef ds:uri="http://schemas.microsoft.com/sharepoint/v3/contenttype/forms"/>
-  </ds:schemaRefs>
-</ds:datastoreItem>
+<file path=customXml/item4.xml><?xml version="1.0" encoding="utf-8"?>
+<p:properties xmlns:p="http://schemas.microsoft.com/office/2006/metadata/properties" xmlns:xsi="http://www.w3.org/2001/XMLSchema-instance" xmlns:pc="http://schemas.microsoft.com/office/infopath/2007/PartnerControls">
+  <documentManagement>
+    <TaxCatchAll xmlns="4de74af2-d2a7-4bc3-a319-420167317553" xsi:nil="true"/>
+    <ArchiverLinkFileType xmlns="c0991f74-233a-4c46-9c55-a176f0e8ba44" xsi:nil="true"/>
+    <lcf76f155ced4ddcb4097134ff3c332f xmlns="c0991f74-233a-4c46-9c55-a176f0e8ba44">
+      <Terms xmlns="http://schemas.microsoft.com/office/infopath/2007/PartnerControls"/>
+    </lcf76f155ced4ddcb4097134ff3c332f>
+  </documentManagement>
+</p:properties>
 </file>
 
-<file path=customXml/itemProps4.xml><?xml version="1.0" encoding="utf-8"?>
+<file path=customXml/itemProps1.xml><?xml version="1.0" encoding="utf-8"?>
 <ds:datastoreItem xmlns:ds="http://schemas.openxmlformats.org/officeDocument/2006/customXml" ds:itemID="{DB59158D-15C5-4DFF-AEB5-CA02C610712D}">
   <ds:schemaRefs>
     <ds:schemaRef ds:uri="http://schemas.microsoft.com/office/2006/metadata/contentType"/>
@@ -16007,4 +15966,31 @@
     <ds:schemaRef ds:uri="http://schemas.microsoft.com/internal/obd"/>
   </ds:schemaRefs>
 </ds:datastoreItem>
+</file>
+
+<file path=customXml/itemProps2.xml><?xml version="1.0" encoding="utf-8"?>
+<ds:datastoreItem xmlns:ds="http://schemas.openxmlformats.org/officeDocument/2006/customXml" ds:itemID="{123745DA-69E4-464B-8AAF-512AB146EAEF}">
+  <ds:schemaRefs>
+    <ds:schemaRef ds:uri="http://schemas.microsoft.com/sharepoint/v3/contenttype/forms"/>
+  </ds:schemaRefs>
+</ds:datastoreItem>
+</file>
+
+<file path=customXml/itemProps3.xml><?xml version="1.0" encoding="utf-8"?>
+<ds:datastoreItem xmlns:ds="http://schemas.openxmlformats.org/officeDocument/2006/customXml" ds:itemID="{8ED87741-333E-524C-B42D-A34782CE569A}">
+  <ds:schemaRefs>
+    <ds:schemaRef ds:uri="http://schemas.openxmlformats.org/officeDocument/2006/bibliography"/>
+  </ds:schemaRefs>
+</ds:datastoreItem>
+</file>
+
+<file path=customXml/itemProps4.xml><?xml version="1.0" encoding="utf-8"?>
+<ds:datastoreItem xmlns:ds="http://schemas.openxmlformats.org/officeDocument/2006/customXml" ds:itemID="{5DB99EA3-5A91-4DE8-9C2E-5E2756FB8116}">
+  <ds:schemaRefs>
+    <ds:schemaRef ds:uri="http://schemas.microsoft.com/office/2006/metadata/properties"/>
+    <ds:schemaRef ds:uri="http://schemas.microsoft.com/office/infopath/2007/PartnerControls"/>
+    <ds:schemaRef ds:uri="4de74af2-d2a7-4bc3-a319-420167317553"/>
+    <ds:schemaRef ds:uri="c0991f74-233a-4c46-9c55-a176f0e8ba44"/>
+  </ds:schemaRefs>
+</ds:datastoreItem>
 </file>
</xml_diff>